<commit_message>
Diario de prompt 16:20 10/10
</commit_message>
<xml_diff>
--- a/Diario de prompt/DiarioPrompt.docx
+++ b/Diario de prompt/DiarioPrompt.docx
@@ -2283,6 +2283,624 @@
     <w:p>
       <w:r>
         <w:t>As decisões sobre o conteúdo, a proposta do projeto e suas funcionalidades são construídas durante o processo de desenvolvimento. A IA atua como ferramenta de apoio, enquanto a validação das informações, a compreensão dos conceitos e a implementação permanecem como parte do trabalho acadêmico do autor.</w:t>
+      </w:r>
+    </w:p>
+    <w:p>
+      <w:r>
+        <w:br/>
+      </w:r>
+      <w:r>
+        <w:br/>
+      </w:r>
+      <w:r>
+        <w:rPr>
+          <w:rFonts w:ascii="MS Gothic" w:eastAsia="MS Gothic" w:hAnsi="MS Gothic" w:cs="MS Gothic" w:hint="eastAsia"/>
+        </w:rPr>
+        <w:t>━━━━━━━━━━━━━━━━━━━━━━━━━━━━</w:t>
+      </w:r>
+    </w:p>
+    <w:p>
+      <w:pPr>
+        <w:numPr>
+          <w:ilvl w:val="0"/>
+          <w:numId w:val="30"/>
+        </w:numPr>
+      </w:pPr>
+      <w:r>
+        <w:t xml:space="preserve">Início da prototipação visual no </w:t>
+      </w:r>
+      <w:proofErr w:type="spellStart"/>
+      <w:r>
+        <w:t>Figma</w:t>
+      </w:r>
+      <w:proofErr w:type="spellEnd"/>
+    </w:p>
+    <w:p>
+      <w:r>
+        <w:rPr>
+          <w:b/>
+          <w:bCs/>
+        </w:rPr>
+        <w:t>Prompt enviado</w:t>
+      </w:r>
+    </w:p>
+    <w:p>
+      <w:r>
+        <w:t xml:space="preserve">Expliquei que iniciei a prototipação do Alma da Fiel no </w:t>
+      </w:r>
+      <w:proofErr w:type="spellStart"/>
+      <w:r>
+        <w:t>Figma</w:t>
+      </w:r>
+      <w:proofErr w:type="spellEnd"/>
+      <w:r>
+        <w:t>, seguindo a metodologia de desenvolvimento definida anteriormente. Informei que já havia criado o cabeçalho, a Home Page e duas seções da página Sobre, utilizando como referência a identidade visual cinematográfica do projeto, com predominância de preto, branco e cinza, além de detalhes em vermelho.</w:t>
+      </w:r>
+    </w:p>
+    <w:p>
+      <w:r>
+        <w:t>Pedi orientação sobre como continuar a prototipação, mantendo a consistência visual entre as páginas e respeitando o escopo definido para o projeto.</w:t>
+      </w:r>
+    </w:p>
+    <w:p>
+      <w:r>
+        <w:rPr>
+          <w:b/>
+          <w:bCs/>
+        </w:rPr>
+        <w:t>Resposta da IA</w:t>
+      </w:r>
+    </w:p>
+    <w:p>
+      <w:r>
+        <w:t>A IA recomendou continuar o desenvolvimento visual de forma organizada, finalizando primeiro a página Sobre e, em seguida, criando os protótipos das demais páginas previstas no escopo.</w:t>
+      </w:r>
+    </w:p>
+    <w:p>
+      <w:r>
+        <w:lastRenderedPageBreak/>
+        <w:t>Foi sugerida a seguinte sequência:</w:t>
+      </w:r>
+    </w:p>
+    <w:p>
+      <w:pPr>
+        <w:numPr>
+          <w:ilvl w:val="0"/>
+          <w:numId w:val="31"/>
+        </w:numPr>
+      </w:pPr>
+      <w:r>
+        <w:rPr>
+          <w:b/>
+          <w:bCs/>
+        </w:rPr>
+        <w:t>Finalização da página Sobre:</w:t>
+      </w:r>
+      <w:r>
+        <w:t xml:space="preserve"> revisar as duas seções já criadas, desenvolver o encerramento da página e apresentar o propósito do Alma da Fiel, destacando sua proposta de valorizar a história e a cultura corinthiana.</w:t>
+      </w:r>
+    </w:p>
+    <w:p>
+      <w:pPr>
+        <w:numPr>
+          <w:ilvl w:val="0"/>
+          <w:numId w:val="31"/>
+        </w:numPr>
+      </w:pPr>
+      <w:r>
+        <w:rPr>
+          <w:b/>
+          <w:bCs/>
+        </w:rPr>
+        <w:t>Página História:</w:t>
+      </w:r>
+      <w:r>
+        <w:t xml:space="preserve"> criar uma introdução visual e uma linha do tempo com acontecimentos importantes da trajetória do Corinthians. Cada marco poderá apresentar o ano, um título, uma descrição breve e uma imagem relacionada ao acontecimento.</w:t>
+      </w:r>
+    </w:p>
+    <w:p>
+      <w:pPr>
+        <w:numPr>
+          <w:ilvl w:val="0"/>
+          <w:numId w:val="31"/>
+        </w:numPr>
+      </w:pPr>
+      <w:r>
+        <w:rPr>
+          <w:b/>
+          <w:bCs/>
+        </w:rPr>
+        <w:t>Página Ídolos:</w:t>
+      </w:r>
+      <w:r>
+        <w:t xml:space="preserve"> desenvolver uma área dedicada a Sócrates e Cássio, com fotografias, informações sobre suas trajetórias, principais feitos e importância para o clube.</w:t>
+      </w:r>
+    </w:p>
+    <w:p>
+      <w:pPr>
+        <w:numPr>
+          <w:ilvl w:val="0"/>
+          <w:numId w:val="31"/>
+        </w:numPr>
+      </w:pPr>
+      <w:r>
+        <w:rPr>
+          <w:b/>
+          <w:bCs/>
+        </w:rPr>
+        <w:t>Página Gaviões da Fiel:</w:t>
+      </w:r>
+      <w:r>
+        <w:t xml:space="preserve"> apresentar a história e a relevância cultural da torcida organizada, utilizando fotografias e textos organizados em blocos visuais.</w:t>
+      </w:r>
+    </w:p>
+    <w:p>
+      <w:pPr>
+        <w:numPr>
+          <w:ilvl w:val="0"/>
+          <w:numId w:val="31"/>
+        </w:numPr>
+      </w:pPr>
+      <w:r>
+        <w:rPr>
+          <w:b/>
+          <w:bCs/>
+        </w:rPr>
+        <w:t>Página Quiz:</w:t>
+      </w:r>
+      <w:r>
+        <w:t xml:space="preserve"> projetar a tela inicial, as perguntas com alternativas, o feedback das respostas e a tela final com a pontuação e a quantidade de acertos.</w:t>
+      </w:r>
+    </w:p>
+    <w:p>
+      <w:pPr>
+        <w:numPr>
+          <w:ilvl w:val="0"/>
+          <w:numId w:val="31"/>
+        </w:numPr>
+      </w:pPr>
+      <w:r>
+        <w:rPr>
+          <w:b/>
+          <w:bCs/>
+        </w:rPr>
+        <w:t>Páginas de Cadastro, Login e Dashboard:</w:t>
+      </w:r>
+      <w:r>
+        <w:t xml:space="preserve"> elaborar protótipos que mantenham a identidade visual do site, considerando que a implementação dessas funcionalidades dependerá da viabilidade técnica e dos recursos disponíveis na API </w:t>
+      </w:r>
+      <w:proofErr w:type="spellStart"/>
+      <w:r>
+        <w:t>WebDataVis</w:t>
+      </w:r>
+      <w:proofErr w:type="spellEnd"/>
+      <w:r>
+        <w:t>.</w:t>
+      </w:r>
+    </w:p>
+    <w:p>
+      <w:r>
+        <w:t>A IA também recomendou manter uma linguagem visual consistente entre as páginas, utilizando tipografia marcante nos títulos, fotografias de impacto, fundos escuros e detalhes em vermelho para destacar elementos importantes.</w:t>
+      </w:r>
+    </w:p>
+    <w:p>
+      <w:r>
+        <w:t xml:space="preserve">Foi ressaltado que o </w:t>
+      </w:r>
+      <w:proofErr w:type="spellStart"/>
+      <w:r>
+        <w:t>Figma</w:t>
+      </w:r>
+      <w:proofErr w:type="spellEnd"/>
+      <w:r>
+        <w:t xml:space="preserve"> deve ser utilizado para planejar a estrutura, a navegação e a aparência das páginas antes de iniciar a implementação em HTML, CSS e </w:t>
+      </w:r>
+      <w:proofErr w:type="spellStart"/>
+      <w:r>
+        <w:t>JavaScript</w:t>
+      </w:r>
+      <w:proofErr w:type="spellEnd"/>
+      <w:r>
+        <w:t>.</w:t>
+      </w:r>
+    </w:p>
+    <w:p>
+      <w:r>
+        <w:rPr>
+          <w:b/>
+          <w:bCs/>
+        </w:rPr>
+        <w:t>Decisão tomada</w:t>
+      </w:r>
+    </w:p>
+    <w:p>
+      <w:r>
+        <w:t xml:space="preserve">Decidi continuar a prototipação pelo </w:t>
+      </w:r>
+      <w:proofErr w:type="spellStart"/>
+      <w:r>
+        <w:t>Figma</w:t>
+      </w:r>
+      <w:proofErr w:type="spellEnd"/>
+      <w:r>
+        <w:t>, finalizando inicialmente a página Sobre e avançando depois para a página História.</w:t>
+      </w:r>
+    </w:p>
+    <w:p>
+      <w:r>
+        <w:t>A intenção é desenvolver as páginas gradualmente, mantendo a identidade visual cinematográfica definida para o Alma da Fiel e garantindo que cada seção tenha uma finalidade clara dentro da experiência do usuário.</w:t>
+      </w:r>
+    </w:p>
+    <w:p>
+      <w:r>
+        <w:lastRenderedPageBreak/>
+        <w:t>Também decidi utilizar os protótipos como referência para a futura implementação do site, facilitando a organização do código e a identificação dos elementos que precisarão de interatividade.</w:t>
+      </w:r>
+    </w:p>
+    <w:p>
+      <w:r>
+        <w:rPr>
+          <w:rFonts w:ascii="MS Gothic" w:eastAsia="MS Gothic" w:hAnsi="MS Gothic" w:cs="MS Gothic" w:hint="eastAsia"/>
+        </w:rPr>
+        <w:t>━━━━━━━━━━━━━━━━━━━━━━━━━━━━</w:t>
+      </w:r>
+    </w:p>
+    <w:p>
+      <w:r>
+        <w:t>SITUAÇÃO ATUAL DO PROJETO — ATUALIZAÇÃO</w:t>
+      </w:r>
+    </w:p>
+    <w:p>
+      <w:r>
+        <w:t>Até o momento, o Alma da Fiel possui:</w:t>
+      </w:r>
+    </w:p>
+    <w:p>
+      <w:r>
+        <w:t>• Nome e slogan definidos: Alma da Fiel — “Uma história que vive em cada torcedor”.</w:t>
+      </w:r>
+    </w:p>
+    <w:p>
+      <w:r>
+        <w:t>• Tema, proposta geral e identidade visual estabelecidos.</w:t>
+      </w:r>
+    </w:p>
+    <w:p>
+      <w:r>
+        <w:t>• Seleção inicial de dez momentos históricos, ainda sujeita à verificação em fontes confiáveis.</w:t>
+      </w:r>
+    </w:p>
+    <w:p>
+      <w:r>
+        <w:t>• Estrutura preliminar das páginas e funcionalidades definida.</w:t>
+      </w:r>
+    </w:p>
+    <w:p>
+      <w:r>
+        <w:t xml:space="preserve">• Tecnologias previstas: HTML, CSS, </w:t>
+      </w:r>
+      <w:proofErr w:type="spellStart"/>
+      <w:r>
+        <w:t>JavaScript</w:t>
+      </w:r>
+      <w:proofErr w:type="spellEnd"/>
+      <w:r>
+        <w:t xml:space="preserve"> e API </w:t>
+      </w:r>
+      <w:proofErr w:type="spellStart"/>
+      <w:r>
+        <w:t>WebDataVis</w:t>
+      </w:r>
+      <w:proofErr w:type="spellEnd"/>
+      <w:r>
+        <w:t>.</w:t>
+      </w:r>
+    </w:p>
+    <w:p>
+      <w:r>
+        <w:t>• README e descrição do repositório planejados.</w:t>
+      </w:r>
+    </w:p>
+    <w:p>
+      <w:r>
+        <w:t>• Primeiras versões do Contexto, Objetivo e Justificativa elaboradas.</w:t>
+      </w:r>
+    </w:p>
+    <w:p>
+      <w:r>
+        <w:t>• Escopo, Premissas e Restrições organizados.</w:t>
+      </w:r>
+    </w:p>
+    <w:p>
+      <w:r>
+        <w:t xml:space="preserve">• Metodologia de desenvolvimento definida, começando pela prototipação no </w:t>
+      </w:r>
+      <w:proofErr w:type="spellStart"/>
+      <w:r>
+        <w:t>Figma</w:t>
+      </w:r>
+      <w:proofErr w:type="spellEnd"/>
+      <w:r>
+        <w:t>.</w:t>
+      </w:r>
+    </w:p>
+    <w:p>
+      <w:r>
+        <w:t xml:space="preserve">• Cabeçalho do site </w:t>
+      </w:r>
+      <w:proofErr w:type="spellStart"/>
+      <w:r>
+        <w:t>prototipado</w:t>
+      </w:r>
+      <w:proofErr w:type="spellEnd"/>
+      <w:r>
+        <w:t xml:space="preserve"> no </w:t>
+      </w:r>
+      <w:proofErr w:type="spellStart"/>
+      <w:r>
+        <w:t>Figma</w:t>
+      </w:r>
+      <w:proofErr w:type="spellEnd"/>
+      <w:r>
+        <w:t>.</w:t>
+      </w:r>
+    </w:p>
+    <w:p>
+      <w:r>
+        <w:t xml:space="preserve">• Home Page </w:t>
+      </w:r>
+      <w:proofErr w:type="spellStart"/>
+      <w:r>
+        <w:t>prototipada</w:t>
+      </w:r>
+      <w:proofErr w:type="spellEnd"/>
+      <w:r>
+        <w:t xml:space="preserve"> no </w:t>
+      </w:r>
+      <w:proofErr w:type="spellStart"/>
+      <w:r>
+        <w:t>Figma</w:t>
+      </w:r>
+      <w:proofErr w:type="spellEnd"/>
+      <w:r>
+        <w:t>.</w:t>
+      </w:r>
+    </w:p>
+    <w:p>
+      <w:r>
+        <w:t xml:space="preserve">• Duas seções da página Sobre </w:t>
+      </w:r>
+      <w:proofErr w:type="spellStart"/>
+      <w:r>
+        <w:t>prototipadas</w:t>
+      </w:r>
+      <w:proofErr w:type="spellEnd"/>
+      <w:r>
+        <w:t xml:space="preserve"> no </w:t>
+      </w:r>
+      <w:proofErr w:type="spellStart"/>
+      <w:r>
+        <w:t>Figma</w:t>
+      </w:r>
+      <w:proofErr w:type="spellEnd"/>
+      <w:r>
+        <w:t>.</w:t>
+      </w:r>
+    </w:p>
+    <w:p>
+      <w:r>
+        <w:t>A prototipação visual está em andamento. As demais páginas ainda deverão ser planejadas e desenvolvidas antes do início da implementação completa.</w:t>
+      </w:r>
+    </w:p>
+    <w:p>
+      <w:r>
+        <w:rPr>
+          <w:rFonts w:ascii="MS Gothic" w:eastAsia="MS Gothic" w:hAnsi="MS Gothic" w:cs="MS Gothic" w:hint="eastAsia"/>
+        </w:rPr>
+        <w:t>━━━━━━━━━━━━━━━━━━━━━━━━━━━━</w:t>
+      </w:r>
+    </w:p>
+    <w:p>
+      <w:r>
+        <w:t>PRÓXIMAS ETAPAS — ATUALIZAÇÃO</w:t>
+      </w:r>
+    </w:p>
+    <w:p>
+      <w:pPr>
+        <w:numPr>
+          <w:ilvl w:val="0"/>
+          <w:numId w:val="32"/>
+        </w:numPr>
+      </w:pPr>
+      <w:r>
+        <w:t xml:space="preserve">Finalizar a página Sobre no </w:t>
+      </w:r>
+      <w:proofErr w:type="spellStart"/>
+      <w:r>
+        <w:t>Figma</w:t>
+      </w:r>
+      <w:proofErr w:type="spellEnd"/>
+      <w:r>
+        <w:t>, revisando as duas seções já criadas e definindo o encerramento da página.</w:t>
+      </w:r>
+    </w:p>
+    <w:p>
+      <w:pPr>
+        <w:numPr>
+          <w:ilvl w:val="0"/>
+          <w:numId w:val="32"/>
+        </w:numPr>
+      </w:pPr>
+      <w:r>
+        <w:t>Criar a página História, priorizando uma linha do tempo visual dos principais acontecimentos do Corinthians.</w:t>
+      </w:r>
+    </w:p>
+    <w:p>
+      <w:pPr>
+        <w:numPr>
+          <w:ilvl w:val="0"/>
+          <w:numId w:val="32"/>
+        </w:numPr>
+      </w:pPr>
+      <w:r>
+        <w:t>Desenvolver a página Ídolos, com destaque para Sócrates e Cássio.</w:t>
+      </w:r>
+    </w:p>
+    <w:p>
+      <w:pPr>
+        <w:numPr>
+          <w:ilvl w:val="0"/>
+          <w:numId w:val="32"/>
+        </w:numPr>
+      </w:pPr>
+      <w:r>
+        <w:lastRenderedPageBreak/>
+        <w:t>Desenvolver a página Gaviões da Fiel, apresentando a história e a importância cultural da torcida organizada.</w:t>
+      </w:r>
+    </w:p>
+    <w:p>
+      <w:pPr>
+        <w:numPr>
+          <w:ilvl w:val="0"/>
+          <w:numId w:val="32"/>
+        </w:numPr>
+      </w:pPr>
+      <w:proofErr w:type="spellStart"/>
+      <w:r>
+        <w:t>Prototipar</w:t>
+      </w:r>
+      <w:proofErr w:type="spellEnd"/>
+      <w:r>
+        <w:t xml:space="preserve"> o Quiz, incluindo a tela inicial, as perguntas, as alternativas, o feedback e a exibição do resultado final.</w:t>
+      </w:r>
+    </w:p>
+    <w:p>
+      <w:pPr>
+        <w:numPr>
+          <w:ilvl w:val="0"/>
+          <w:numId w:val="32"/>
+        </w:numPr>
+      </w:pPr>
+      <w:r>
+        <w:t>Criar os protótipos de Cadastro, Login e Dashboard, considerando os limites técnicos e o escopo da primeira versão.</w:t>
+      </w:r>
+    </w:p>
+    <w:p>
+      <w:pPr>
+        <w:numPr>
+          <w:ilvl w:val="0"/>
+          <w:numId w:val="32"/>
+        </w:numPr>
+      </w:pPr>
+      <w:r>
+        <w:t>Revisar a navegação entre as páginas e verificar se os elementos visuais mantêm uma identidade consistente.</w:t>
+      </w:r>
+    </w:p>
+    <w:p>
+      <w:pPr>
+        <w:numPr>
+          <w:ilvl w:val="0"/>
+          <w:numId w:val="32"/>
+        </w:numPr>
+      </w:pPr>
+      <w:r>
+        <w:t xml:space="preserve">Conferir a documentação da API </w:t>
+      </w:r>
+      <w:proofErr w:type="spellStart"/>
+      <w:r>
+        <w:t>WebDataVis</w:t>
+      </w:r>
+      <w:proofErr w:type="spellEnd"/>
+      <w:r>
+        <w:t xml:space="preserve"> para identificar os recursos que poderão ser implementados.</w:t>
+      </w:r>
+    </w:p>
+    <w:p>
+      <w:pPr>
+        <w:numPr>
+          <w:ilvl w:val="0"/>
+          <w:numId w:val="32"/>
+        </w:numPr>
+      </w:pPr>
+      <w:r>
+        <w:t>Validar os conteúdos históricos em fontes confiáveis e concluir a documentação acadêmica conforme as orientações dos professores.</w:t>
+      </w:r>
+    </w:p>
+    <w:p>
+      <w:pPr>
+        <w:numPr>
+          <w:ilvl w:val="0"/>
+          <w:numId w:val="32"/>
+        </w:numPr>
+      </w:pPr>
+      <w:r>
+        <w:t xml:space="preserve">Após concluir os protótipos necessários, iniciar a implementação em HTML, CSS e </w:t>
+      </w:r>
+      <w:proofErr w:type="spellStart"/>
+      <w:r>
+        <w:t>JavaScript</w:t>
+      </w:r>
+      <w:proofErr w:type="spellEnd"/>
+      <w:r>
+        <w:t>, desenvolvendo e testando as funcionalidades por etapas.</w:t>
+      </w:r>
+    </w:p>
+    <w:p>
+      <w:pPr>
+        <w:numPr>
+          <w:ilvl w:val="0"/>
+          <w:numId w:val="32"/>
+        </w:numPr>
+      </w:pPr>
+      <w:r>
+        <w:t>Planejar o cronograma semanal até o prazo de 30/11/2026, mantendo o GitHub atualizado e acompanhando as orientações dos professores.</w:t>
+      </w:r>
+    </w:p>
+    <w:p>
+      <w:r>
+        <w:rPr>
+          <w:rFonts w:ascii="MS Gothic" w:eastAsia="MS Gothic" w:hAnsi="MS Gothic" w:cs="MS Gothic" w:hint="eastAsia"/>
+        </w:rPr>
+        <w:t>━━━━━━━━━━━━━━━━━━━━━━━━━━━━</w:t>
+      </w:r>
+    </w:p>
+    <w:p>
+      <w:r>
+        <w:t>CONSIDERAÇÕES FINAIS — ATUALIZAÇÃO</w:t>
+      </w:r>
+    </w:p>
+    <w:p>
+      <w:r>
+        <w:t xml:space="preserve">O desenvolvimento do Alma da Fiel avançou da etapa de planejamento e documentação para o início da prototipação visual no </w:t>
+      </w:r>
+      <w:proofErr w:type="spellStart"/>
+      <w:r>
+        <w:t>Figma</w:t>
+      </w:r>
+      <w:proofErr w:type="spellEnd"/>
+      <w:r>
+        <w:t>.</w:t>
+      </w:r>
+    </w:p>
+    <w:p>
+      <w:r>
+        <w:t>A criação do cabeçalho, da Home Page e das primeiras seções da página Sobre representa o início da transformação das ideias documentadas em uma proposta visual concreta.</w:t>
+      </w:r>
+    </w:p>
+    <w:p>
+      <w:r>
+        <w:t>A próxima etapa consiste em concluir essa página e desenvolver os protótipos das demais áreas do site, mantendo a identidade visual definida e respeitando o escopo do projeto.</w:t>
+      </w:r>
+    </w:p>
+    <w:p>
+      <w:r>
+        <w:t>A utilização da inteligência artificial continuará sendo voltada ao apoio no planejamento, na organização das ideias, na revisão da documentação e na compreensão dos conceitos técnicos. As decisões de design, a validação das informações e a implementação deverão ser conduzidas pelo responsável pelo projeto, garantindo a compreensão do trabalho desenvolvido e sua adequação aos objetivos acadêmicos.</w:t>
+      </w:r>
+    </w:p>
+    <w:p>
+      <w:r>
+        <w:lastRenderedPageBreak/>
+        <w:t>O objetivo é concluir primeiro uma estrutura visual coerente e, posteriormente, transformá-la em um site funcional, com conteúdo histórico e recursos interativos que valorizem a história e a identidade corinthiana.</w:t>
       </w:r>
     </w:p>
     <w:p/>
@@ -3681,6 +4299,119 @@
     </w:lvl>
   </w:abstractNum>
   <w:abstractNum w:abstractNumId="10" w15:restartNumberingAfterBreak="0">
+    <w:nsid w:val="2C864B48"/>
+    <w:multiLevelType w:val="multilevel"/>
+    <w:tmpl w:val="A6FCB448"/>
+    <w:lvl w:ilvl="0">
+      <w:start w:val="21"/>
+      <w:numFmt w:val="decimal"/>
+      <w:lvlText w:val="%1."/>
+      <w:lvlJc w:val="left"/>
+      <w:pPr>
+        <w:tabs>
+          <w:tab w:val="num" w:pos="720"/>
+        </w:tabs>
+        <w:ind w:left="720" w:hanging="360"/>
+      </w:pPr>
+    </w:lvl>
+    <w:lvl w:ilvl="1" w:tentative="1">
+      <w:start w:val="1"/>
+      <w:numFmt w:val="decimal"/>
+      <w:lvlText w:val="%2."/>
+      <w:lvlJc w:val="left"/>
+      <w:pPr>
+        <w:tabs>
+          <w:tab w:val="num" w:pos="1440"/>
+        </w:tabs>
+        <w:ind w:left="1440" w:hanging="360"/>
+      </w:pPr>
+    </w:lvl>
+    <w:lvl w:ilvl="2" w:tentative="1">
+      <w:start w:val="1"/>
+      <w:numFmt w:val="decimal"/>
+      <w:lvlText w:val="%3."/>
+      <w:lvlJc w:val="left"/>
+      <w:pPr>
+        <w:tabs>
+          <w:tab w:val="num" w:pos="2160"/>
+        </w:tabs>
+        <w:ind w:left="2160" w:hanging="360"/>
+      </w:pPr>
+    </w:lvl>
+    <w:lvl w:ilvl="3" w:tentative="1">
+      <w:start w:val="1"/>
+      <w:numFmt w:val="decimal"/>
+      <w:lvlText w:val="%4."/>
+      <w:lvlJc w:val="left"/>
+      <w:pPr>
+        <w:tabs>
+          <w:tab w:val="num" w:pos="2880"/>
+        </w:tabs>
+        <w:ind w:left="2880" w:hanging="360"/>
+      </w:pPr>
+    </w:lvl>
+    <w:lvl w:ilvl="4" w:tentative="1">
+      <w:start w:val="1"/>
+      <w:numFmt w:val="decimal"/>
+      <w:lvlText w:val="%5."/>
+      <w:lvlJc w:val="left"/>
+      <w:pPr>
+        <w:tabs>
+          <w:tab w:val="num" w:pos="3600"/>
+        </w:tabs>
+        <w:ind w:left="3600" w:hanging="360"/>
+      </w:pPr>
+    </w:lvl>
+    <w:lvl w:ilvl="5" w:tentative="1">
+      <w:start w:val="1"/>
+      <w:numFmt w:val="decimal"/>
+      <w:lvlText w:val="%6."/>
+      <w:lvlJc w:val="left"/>
+      <w:pPr>
+        <w:tabs>
+          <w:tab w:val="num" w:pos="4320"/>
+        </w:tabs>
+        <w:ind w:left="4320" w:hanging="360"/>
+      </w:pPr>
+    </w:lvl>
+    <w:lvl w:ilvl="6" w:tentative="1">
+      <w:start w:val="1"/>
+      <w:numFmt w:val="decimal"/>
+      <w:lvlText w:val="%7."/>
+      <w:lvlJc w:val="left"/>
+      <w:pPr>
+        <w:tabs>
+          <w:tab w:val="num" w:pos="5040"/>
+        </w:tabs>
+        <w:ind w:left="5040" w:hanging="360"/>
+      </w:pPr>
+    </w:lvl>
+    <w:lvl w:ilvl="7" w:tentative="1">
+      <w:start w:val="1"/>
+      <w:numFmt w:val="decimal"/>
+      <w:lvlText w:val="%8."/>
+      <w:lvlJc w:val="left"/>
+      <w:pPr>
+        <w:tabs>
+          <w:tab w:val="num" w:pos="5760"/>
+        </w:tabs>
+        <w:ind w:left="5760" w:hanging="360"/>
+      </w:pPr>
+    </w:lvl>
+    <w:lvl w:ilvl="8" w:tentative="1">
+      <w:start w:val="1"/>
+      <w:numFmt w:val="decimal"/>
+      <w:lvlText w:val="%9."/>
+      <w:lvlJc w:val="left"/>
+      <w:pPr>
+        <w:tabs>
+          <w:tab w:val="num" w:pos="6480"/>
+        </w:tabs>
+        <w:ind w:left="6480" w:hanging="360"/>
+      </w:pPr>
+    </w:lvl>
+  </w:abstractNum>
+  <w:abstractNum w:abstractNumId="11" w15:restartNumberingAfterBreak="0">
     <w:nsid w:val="2D4032D0"/>
     <w:multiLevelType w:val="multilevel"/>
     <w:tmpl w:val="3B1895EE"/>
@@ -3829,7 +4560,7 @@
       </w:rPr>
     </w:lvl>
   </w:abstractNum>
-  <w:abstractNum w:abstractNumId="11" w15:restartNumberingAfterBreak="0">
+  <w:abstractNum w:abstractNumId="12" w15:restartNumberingAfterBreak="0">
     <w:nsid w:val="312C209B"/>
     <w:multiLevelType w:val="multilevel"/>
     <w:tmpl w:val="1D38539C"/>
@@ -3978,7 +4709,7 @@
       </w:rPr>
     </w:lvl>
   </w:abstractNum>
-  <w:abstractNum w:abstractNumId="12" w15:restartNumberingAfterBreak="0">
+  <w:abstractNum w:abstractNumId="13" w15:restartNumberingAfterBreak="0">
     <w:nsid w:val="362C0042"/>
     <w:multiLevelType w:val="multilevel"/>
     <w:tmpl w:val="FE3A876E"/>
@@ -4127,7 +4858,7 @@
       </w:rPr>
     </w:lvl>
   </w:abstractNum>
-  <w:abstractNum w:abstractNumId="13" w15:restartNumberingAfterBreak="0">
+  <w:abstractNum w:abstractNumId="14" w15:restartNumberingAfterBreak="0">
     <w:nsid w:val="397C1635"/>
     <w:multiLevelType w:val="multilevel"/>
     <w:tmpl w:val="6CF80884"/>
@@ -4240,7 +4971,7 @@
       </w:pPr>
     </w:lvl>
   </w:abstractNum>
-  <w:abstractNum w:abstractNumId="14" w15:restartNumberingAfterBreak="0">
+  <w:abstractNum w:abstractNumId="15" w15:restartNumberingAfterBreak="0">
     <w:nsid w:val="399E1168"/>
     <w:multiLevelType w:val="multilevel"/>
     <w:tmpl w:val="F24E1EF6"/>
@@ -4389,7 +5120,7 @@
       </w:rPr>
     </w:lvl>
   </w:abstractNum>
-  <w:abstractNum w:abstractNumId="15" w15:restartNumberingAfterBreak="0">
+  <w:abstractNum w:abstractNumId="16" w15:restartNumberingAfterBreak="0">
     <w:nsid w:val="39CE44AF"/>
     <w:multiLevelType w:val="multilevel"/>
     <w:tmpl w:val="799E18A6"/>
@@ -4538,7 +5269,7 @@
       </w:rPr>
     </w:lvl>
   </w:abstractNum>
-  <w:abstractNum w:abstractNumId="16" w15:restartNumberingAfterBreak="0">
+  <w:abstractNum w:abstractNumId="17" w15:restartNumberingAfterBreak="0">
     <w:nsid w:val="39DE2D77"/>
     <w:multiLevelType w:val="multilevel"/>
     <w:tmpl w:val="D28AB396"/>
@@ -4651,7 +5382,7 @@
       </w:pPr>
     </w:lvl>
   </w:abstractNum>
-  <w:abstractNum w:abstractNumId="17" w15:restartNumberingAfterBreak="0">
+  <w:abstractNum w:abstractNumId="18" w15:restartNumberingAfterBreak="0">
     <w:nsid w:val="3C6B199B"/>
     <w:multiLevelType w:val="multilevel"/>
     <w:tmpl w:val="E9669198"/>
@@ -4764,7 +5495,120 @@
       </w:pPr>
     </w:lvl>
   </w:abstractNum>
-  <w:abstractNum w:abstractNumId="18" w15:restartNumberingAfterBreak="0">
+  <w:abstractNum w:abstractNumId="19" w15:restartNumberingAfterBreak="0">
+    <w:nsid w:val="45B45FAF"/>
+    <w:multiLevelType w:val="multilevel"/>
+    <w:tmpl w:val="F70639B6"/>
+    <w:lvl w:ilvl="0">
+      <w:start w:val="1"/>
+      <w:numFmt w:val="decimal"/>
+      <w:lvlText w:val="%1."/>
+      <w:lvlJc w:val="left"/>
+      <w:pPr>
+        <w:tabs>
+          <w:tab w:val="num" w:pos="720"/>
+        </w:tabs>
+        <w:ind w:left="720" w:hanging="360"/>
+      </w:pPr>
+    </w:lvl>
+    <w:lvl w:ilvl="1" w:tentative="1">
+      <w:start w:val="1"/>
+      <w:numFmt w:val="decimal"/>
+      <w:lvlText w:val="%2."/>
+      <w:lvlJc w:val="left"/>
+      <w:pPr>
+        <w:tabs>
+          <w:tab w:val="num" w:pos="1440"/>
+        </w:tabs>
+        <w:ind w:left="1440" w:hanging="360"/>
+      </w:pPr>
+    </w:lvl>
+    <w:lvl w:ilvl="2" w:tentative="1">
+      <w:start w:val="1"/>
+      <w:numFmt w:val="decimal"/>
+      <w:lvlText w:val="%3."/>
+      <w:lvlJc w:val="left"/>
+      <w:pPr>
+        <w:tabs>
+          <w:tab w:val="num" w:pos="2160"/>
+        </w:tabs>
+        <w:ind w:left="2160" w:hanging="360"/>
+      </w:pPr>
+    </w:lvl>
+    <w:lvl w:ilvl="3" w:tentative="1">
+      <w:start w:val="1"/>
+      <w:numFmt w:val="decimal"/>
+      <w:lvlText w:val="%4."/>
+      <w:lvlJc w:val="left"/>
+      <w:pPr>
+        <w:tabs>
+          <w:tab w:val="num" w:pos="2880"/>
+        </w:tabs>
+        <w:ind w:left="2880" w:hanging="360"/>
+      </w:pPr>
+    </w:lvl>
+    <w:lvl w:ilvl="4" w:tentative="1">
+      <w:start w:val="1"/>
+      <w:numFmt w:val="decimal"/>
+      <w:lvlText w:val="%5."/>
+      <w:lvlJc w:val="left"/>
+      <w:pPr>
+        <w:tabs>
+          <w:tab w:val="num" w:pos="3600"/>
+        </w:tabs>
+        <w:ind w:left="3600" w:hanging="360"/>
+      </w:pPr>
+    </w:lvl>
+    <w:lvl w:ilvl="5" w:tentative="1">
+      <w:start w:val="1"/>
+      <w:numFmt w:val="decimal"/>
+      <w:lvlText w:val="%6."/>
+      <w:lvlJc w:val="left"/>
+      <w:pPr>
+        <w:tabs>
+          <w:tab w:val="num" w:pos="4320"/>
+        </w:tabs>
+        <w:ind w:left="4320" w:hanging="360"/>
+      </w:pPr>
+    </w:lvl>
+    <w:lvl w:ilvl="6" w:tentative="1">
+      <w:start w:val="1"/>
+      <w:numFmt w:val="decimal"/>
+      <w:lvlText w:val="%7."/>
+      <w:lvlJc w:val="left"/>
+      <w:pPr>
+        <w:tabs>
+          <w:tab w:val="num" w:pos="5040"/>
+        </w:tabs>
+        <w:ind w:left="5040" w:hanging="360"/>
+      </w:pPr>
+    </w:lvl>
+    <w:lvl w:ilvl="7" w:tentative="1">
+      <w:start w:val="1"/>
+      <w:numFmt w:val="decimal"/>
+      <w:lvlText w:val="%8."/>
+      <w:lvlJc w:val="left"/>
+      <w:pPr>
+        <w:tabs>
+          <w:tab w:val="num" w:pos="5760"/>
+        </w:tabs>
+        <w:ind w:left="5760" w:hanging="360"/>
+      </w:pPr>
+    </w:lvl>
+    <w:lvl w:ilvl="8" w:tentative="1">
+      <w:start w:val="1"/>
+      <w:numFmt w:val="decimal"/>
+      <w:lvlText w:val="%9."/>
+      <w:lvlJc w:val="left"/>
+      <w:pPr>
+        <w:tabs>
+          <w:tab w:val="num" w:pos="6480"/>
+        </w:tabs>
+        <w:ind w:left="6480" w:hanging="360"/>
+      </w:pPr>
+    </w:lvl>
+  </w:abstractNum>
+  <w:abstractNum w:abstractNumId="20" w15:restartNumberingAfterBreak="0">
     <w:nsid w:val="49EA667F"/>
     <w:multiLevelType w:val="multilevel"/>
     <w:tmpl w:val="A8868618"/>
@@ -4877,7 +5721,7 @@
       </w:pPr>
     </w:lvl>
   </w:abstractNum>
-  <w:abstractNum w:abstractNumId="19" w15:restartNumberingAfterBreak="0">
+  <w:abstractNum w:abstractNumId="21" w15:restartNumberingAfterBreak="0">
     <w:nsid w:val="4ABC56D4"/>
     <w:multiLevelType w:val="multilevel"/>
     <w:tmpl w:val="8BE4141C"/>
@@ -5026,7 +5870,120 @@
       </w:rPr>
     </w:lvl>
   </w:abstractNum>
-  <w:abstractNum w:abstractNumId="20" w15:restartNumberingAfterBreak="0">
+  <w:abstractNum w:abstractNumId="22" w15:restartNumberingAfterBreak="0">
+    <w:nsid w:val="4CDD0DFC"/>
+    <w:multiLevelType w:val="multilevel"/>
+    <w:tmpl w:val="78BEA320"/>
+    <w:lvl w:ilvl="0">
+      <w:start w:val="1"/>
+      <w:numFmt w:val="decimal"/>
+      <w:lvlText w:val="%1."/>
+      <w:lvlJc w:val="left"/>
+      <w:pPr>
+        <w:tabs>
+          <w:tab w:val="num" w:pos="720"/>
+        </w:tabs>
+        <w:ind w:left="720" w:hanging="360"/>
+      </w:pPr>
+    </w:lvl>
+    <w:lvl w:ilvl="1" w:tentative="1">
+      <w:start w:val="1"/>
+      <w:numFmt w:val="decimal"/>
+      <w:lvlText w:val="%2."/>
+      <w:lvlJc w:val="left"/>
+      <w:pPr>
+        <w:tabs>
+          <w:tab w:val="num" w:pos="1440"/>
+        </w:tabs>
+        <w:ind w:left="1440" w:hanging="360"/>
+      </w:pPr>
+    </w:lvl>
+    <w:lvl w:ilvl="2" w:tentative="1">
+      <w:start w:val="1"/>
+      <w:numFmt w:val="decimal"/>
+      <w:lvlText w:val="%3."/>
+      <w:lvlJc w:val="left"/>
+      <w:pPr>
+        <w:tabs>
+          <w:tab w:val="num" w:pos="2160"/>
+        </w:tabs>
+        <w:ind w:left="2160" w:hanging="360"/>
+      </w:pPr>
+    </w:lvl>
+    <w:lvl w:ilvl="3" w:tentative="1">
+      <w:start w:val="1"/>
+      <w:numFmt w:val="decimal"/>
+      <w:lvlText w:val="%4."/>
+      <w:lvlJc w:val="left"/>
+      <w:pPr>
+        <w:tabs>
+          <w:tab w:val="num" w:pos="2880"/>
+        </w:tabs>
+        <w:ind w:left="2880" w:hanging="360"/>
+      </w:pPr>
+    </w:lvl>
+    <w:lvl w:ilvl="4" w:tentative="1">
+      <w:start w:val="1"/>
+      <w:numFmt w:val="decimal"/>
+      <w:lvlText w:val="%5."/>
+      <w:lvlJc w:val="left"/>
+      <w:pPr>
+        <w:tabs>
+          <w:tab w:val="num" w:pos="3600"/>
+        </w:tabs>
+        <w:ind w:left="3600" w:hanging="360"/>
+      </w:pPr>
+    </w:lvl>
+    <w:lvl w:ilvl="5" w:tentative="1">
+      <w:start w:val="1"/>
+      <w:numFmt w:val="decimal"/>
+      <w:lvlText w:val="%6."/>
+      <w:lvlJc w:val="left"/>
+      <w:pPr>
+        <w:tabs>
+          <w:tab w:val="num" w:pos="4320"/>
+        </w:tabs>
+        <w:ind w:left="4320" w:hanging="360"/>
+      </w:pPr>
+    </w:lvl>
+    <w:lvl w:ilvl="6" w:tentative="1">
+      <w:start w:val="1"/>
+      <w:numFmt w:val="decimal"/>
+      <w:lvlText w:val="%7."/>
+      <w:lvlJc w:val="left"/>
+      <w:pPr>
+        <w:tabs>
+          <w:tab w:val="num" w:pos="5040"/>
+        </w:tabs>
+        <w:ind w:left="5040" w:hanging="360"/>
+      </w:pPr>
+    </w:lvl>
+    <w:lvl w:ilvl="7" w:tentative="1">
+      <w:start w:val="1"/>
+      <w:numFmt w:val="decimal"/>
+      <w:lvlText w:val="%8."/>
+      <w:lvlJc w:val="left"/>
+      <w:pPr>
+        <w:tabs>
+          <w:tab w:val="num" w:pos="5760"/>
+        </w:tabs>
+        <w:ind w:left="5760" w:hanging="360"/>
+      </w:pPr>
+    </w:lvl>
+    <w:lvl w:ilvl="8" w:tentative="1">
+      <w:start w:val="1"/>
+      <w:numFmt w:val="decimal"/>
+      <w:lvlText w:val="%9."/>
+      <w:lvlJc w:val="left"/>
+      <w:pPr>
+        <w:tabs>
+          <w:tab w:val="num" w:pos="6480"/>
+        </w:tabs>
+        <w:ind w:left="6480" w:hanging="360"/>
+      </w:pPr>
+    </w:lvl>
+  </w:abstractNum>
+  <w:abstractNum w:abstractNumId="23" w15:restartNumberingAfterBreak="0">
     <w:nsid w:val="4F4C5743"/>
     <w:multiLevelType w:val="multilevel"/>
     <w:tmpl w:val="B7446200"/>
@@ -5139,7 +6096,7 @@
       </w:pPr>
     </w:lvl>
   </w:abstractNum>
-  <w:abstractNum w:abstractNumId="21" w15:restartNumberingAfterBreak="0">
+  <w:abstractNum w:abstractNumId="24" w15:restartNumberingAfterBreak="0">
     <w:nsid w:val="579A6C80"/>
     <w:multiLevelType w:val="multilevel"/>
     <w:tmpl w:val="6D189CE4"/>
@@ -5252,7 +6209,7 @@
       </w:pPr>
     </w:lvl>
   </w:abstractNum>
-  <w:abstractNum w:abstractNumId="22" w15:restartNumberingAfterBreak="0">
+  <w:abstractNum w:abstractNumId="25" w15:restartNumberingAfterBreak="0">
     <w:nsid w:val="5FA57BE0"/>
     <w:multiLevelType w:val="multilevel"/>
     <w:tmpl w:val="18C8FD24"/>
@@ -5365,7 +6322,7 @@
       </w:pPr>
     </w:lvl>
   </w:abstractNum>
-  <w:abstractNum w:abstractNumId="23" w15:restartNumberingAfterBreak="0">
+  <w:abstractNum w:abstractNumId="26" w15:restartNumberingAfterBreak="0">
     <w:nsid w:val="60850E81"/>
     <w:multiLevelType w:val="multilevel"/>
     <w:tmpl w:val="46303664"/>
@@ -5514,7 +6471,7 @@
       </w:rPr>
     </w:lvl>
   </w:abstractNum>
-  <w:abstractNum w:abstractNumId="24" w15:restartNumberingAfterBreak="0">
+  <w:abstractNum w:abstractNumId="27" w15:restartNumberingAfterBreak="0">
     <w:nsid w:val="614E4692"/>
     <w:multiLevelType w:val="multilevel"/>
     <w:tmpl w:val="275AFA5C"/>
@@ -5627,7 +6584,7 @@
       </w:pPr>
     </w:lvl>
   </w:abstractNum>
-  <w:abstractNum w:abstractNumId="25" w15:restartNumberingAfterBreak="0">
+  <w:abstractNum w:abstractNumId="28" w15:restartNumberingAfterBreak="0">
     <w:nsid w:val="64D34919"/>
     <w:multiLevelType w:val="multilevel"/>
     <w:tmpl w:val="09A207A8"/>
@@ -5776,7 +6733,7 @@
       </w:rPr>
     </w:lvl>
   </w:abstractNum>
-  <w:abstractNum w:abstractNumId="26" w15:restartNumberingAfterBreak="0">
+  <w:abstractNum w:abstractNumId="29" w15:restartNumberingAfterBreak="0">
     <w:nsid w:val="66307BB7"/>
     <w:multiLevelType w:val="multilevel"/>
     <w:tmpl w:val="E70A17DA"/>
@@ -5925,7 +6882,7 @@
       </w:rPr>
     </w:lvl>
   </w:abstractNum>
-  <w:abstractNum w:abstractNumId="27" w15:restartNumberingAfterBreak="0">
+  <w:abstractNum w:abstractNumId="30" w15:restartNumberingAfterBreak="0">
     <w:nsid w:val="6918154F"/>
     <w:multiLevelType w:val="multilevel"/>
     <w:tmpl w:val="3D94CDBE"/>
@@ -6074,7 +7031,7 @@
       </w:rPr>
     </w:lvl>
   </w:abstractNum>
-  <w:abstractNum w:abstractNumId="28" w15:restartNumberingAfterBreak="0">
+  <w:abstractNum w:abstractNumId="31" w15:restartNumberingAfterBreak="0">
     <w:nsid w:val="7E3C0B5D"/>
     <w:multiLevelType w:val="multilevel"/>
     <w:tmpl w:val="26B0B030"/>
@@ -6224,31 +7181,31 @@
     </w:lvl>
   </w:abstractNum>
   <w:num w:numId="1" w16cid:durableId="163476366">
-    <w:abstractNumId w:val="23"/>
+    <w:abstractNumId w:val="26"/>
   </w:num>
   <w:num w:numId="2" w16cid:durableId="888031651">
-    <w:abstractNumId w:val="26"/>
+    <w:abstractNumId w:val="29"/>
   </w:num>
   <w:num w:numId="3" w16cid:durableId="2143301179">
-    <w:abstractNumId w:val="16"/>
+    <w:abstractNumId w:val="17"/>
   </w:num>
   <w:num w:numId="4" w16cid:durableId="1768693047">
-    <w:abstractNumId w:val="19"/>
+    <w:abstractNumId w:val="21"/>
   </w:num>
   <w:num w:numId="5" w16cid:durableId="2079402130">
     <w:abstractNumId w:val="0"/>
   </w:num>
   <w:num w:numId="6" w16cid:durableId="2139686027">
-    <w:abstractNumId w:val="12"/>
+    <w:abstractNumId w:val="13"/>
   </w:num>
   <w:num w:numId="7" w16cid:durableId="337856317">
-    <w:abstractNumId w:val="14"/>
+    <w:abstractNumId w:val="15"/>
   </w:num>
   <w:num w:numId="8" w16cid:durableId="2034529628">
-    <w:abstractNumId w:val="17"/>
+    <w:abstractNumId w:val="18"/>
   </w:num>
   <w:num w:numId="9" w16cid:durableId="741368021">
-    <w:abstractNumId w:val="10"/>
+    <w:abstractNumId w:val="11"/>
   </w:num>
   <w:num w:numId="10" w16cid:durableId="152840754">
     <w:abstractNumId w:val="7"/>
@@ -6257,58 +7214,67 @@
     <w:abstractNumId w:val="4"/>
   </w:num>
   <w:num w:numId="12" w16cid:durableId="328290283">
-    <w:abstractNumId w:val="25"/>
+    <w:abstractNumId w:val="28"/>
   </w:num>
   <w:num w:numId="13" w16cid:durableId="365716282">
     <w:abstractNumId w:val="9"/>
   </w:num>
   <w:num w:numId="14" w16cid:durableId="1749301687">
-    <w:abstractNumId w:val="28"/>
+    <w:abstractNumId w:val="31"/>
   </w:num>
   <w:num w:numId="15" w16cid:durableId="92895161">
-    <w:abstractNumId w:val="22"/>
+    <w:abstractNumId w:val="25"/>
   </w:num>
   <w:num w:numId="16" w16cid:durableId="2141683418">
     <w:abstractNumId w:val="3"/>
   </w:num>
   <w:num w:numId="17" w16cid:durableId="293340683">
-    <w:abstractNumId w:val="13"/>
+    <w:abstractNumId w:val="14"/>
   </w:num>
   <w:num w:numId="18" w16cid:durableId="1519152503">
     <w:abstractNumId w:val="2"/>
   </w:num>
   <w:num w:numId="19" w16cid:durableId="2119985953">
-    <w:abstractNumId w:val="11"/>
+    <w:abstractNumId w:val="12"/>
   </w:num>
   <w:num w:numId="20" w16cid:durableId="1886062730">
     <w:abstractNumId w:val="5"/>
   </w:num>
   <w:num w:numId="21" w16cid:durableId="1955594982">
-    <w:abstractNumId w:val="15"/>
+    <w:abstractNumId w:val="16"/>
   </w:num>
   <w:num w:numId="22" w16cid:durableId="249894331">
-    <w:abstractNumId w:val="20"/>
+    <w:abstractNumId w:val="23"/>
   </w:num>
   <w:num w:numId="23" w16cid:durableId="678196419">
-    <w:abstractNumId w:val="21"/>
+    <w:abstractNumId w:val="24"/>
   </w:num>
   <w:num w:numId="24" w16cid:durableId="429787488">
     <w:abstractNumId w:val="6"/>
   </w:num>
   <w:num w:numId="25" w16cid:durableId="1308825487">
-    <w:abstractNumId w:val="27"/>
+    <w:abstractNumId w:val="30"/>
   </w:num>
   <w:num w:numId="26" w16cid:durableId="299728592">
     <w:abstractNumId w:val="1"/>
   </w:num>
   <w:num w:numId="27" w16cid:durableId="1447042674">
-    <w:abstractNumId w:val="18"/>
+    <w:abstractNumId w:val="20"/>
   </w:num>
   <w:num w:numId="28" w16cid:durableId="1326931229">
     <w:abstractNumId w:val="8"/>
   </w:num>
   <w:num w:numId="29" w16cid:durableId="510529186">
-    <w:abstractNumId w:val="24"/>
+    <w:abstractNumId w:val="27"/>
+  </w:num>
+  <w:num w:numId="30" w16cid:durableId="1924073036">
+    <w:abstractNumId w:val="10"/>
+  </w:num>
+  <w:num w:numId="31" w16cid:durableId="973489751">
+    <w:abstractNumId w:val="22"/>
+  </w:num>
+  <w:num w:numId="32" w16cid:durableId="850223582">
+    <w:abstractNumId w:val="19"/>
   </w:num>
 </w:numbering>
 </file>
@@ -7229,6 +8195,17 @@
       <w:spacing w:val="5"/>
     </w:rPr>
   </w:style>
+  <w:style w:type="paragraph" w:styleId="NormalWeb">
+    <w:name w:val="Normal (Web)"/>
+    <w:basedOn w:val="Normal"/>
+    <w:uiPriority w:val="99"/>
+    <w:semiHidden/>
+    <w:unhideWhenUsed/>
+    <w:rsid w:val="00CA0101"/>
+    <w:rPr>
+      <w:rFonts w:ascii="Times New Roman" w:hAnsi="Times New Roman" w:cs="Times New Roman"/>
+    </w:rPr>
+  </w:style>
 </w:styles>
 </file>
 

</xml_diff>

<commit_message>
Adicionando documentação e atualizando prompt
</commit_message>
<xml_diff>
--- a/Diario de prompt/DiarioPrompt.docx
+++ b/Diario de prompt/DiarioPrompt.docx
@@ -2901,6 +2901,680 @@
       <w:r>
         <w:lastRenderedPageBreak/>
         <w:t>O objetivo é concluir primeiro uma estrutura visual coerente e, posteriormente, transformá-la em um site funcional, com conteúdo histórico e recursos interativos que valorizem a história e a identidade corinthiana.</w:t>
+      </w:r>
+    </w:p>
+    <w:p>
+      <w:r>
+        <w:br/>
+      </w:r>
+      <w:r>
+        <w:t>22. Conclusão da prototipação da página História</w:t>
+      </w:r>
+    </w:p>
+    <w:p>
+      <w:r>
+        <w:t>Prompt enviado</w:t>
+      </w:r>
+    </w:p>
+    <w:p>
+      <w:r>
+        <w:t xml:space="preserve">Informei que concluí a prototipação da página História do Alma da Fiel no </w:t>
+      </w:r>
+      <w:proofErr w:type="spellStart"/>
+      <w:r>
+        <w:t>Figma</w:t>
+      </w:r>
+      <w:proofErr w:type="spellEnd"/>
+      <w:r>
+        <w:t xml:space="preserve"> e pedi orientação para continuar o desenvolvimento do projeto, considerando que a próxima página prevista no planejamento seria o Quiz.</w:t>
+      </w:r>
+    </w:p>
+    <w:p>
+      <w:r>
+        <w:t>Antes de avançar, também busquei compreender como estruturar visualmente a linha do tempo histórica, considerando a quantidade de acontecimentos selecionados e a identidade visual cinematográfica definida para o projeto.</w:t>
+      </w:r>
+    </w:p>
+    <w:p>
+      <w:r>
+        <w:t>Resposta da IA</w:t>
+      </w:r>
+    </w:p>
+    <w:p>
+      <w:r>
+        <w:t>A IA apresentou diferentes possibilidades para estruturar a linha do tempo, considerando a disposição dos acontecimentos e a forma como o usuário percorrerá o conteúdo.</w:t>
+      </w:r>
+    </w:p>
+    <w:p>
+      <w:r>
+        <w:t>Foram discutidas três alternativas principais:</w:t>
+      </w:r>
+    </w:p>
+    <w:p>
+      <w:r>
+        <w:t>• Linha do tempo vertical alternada: os acontecimentos são distribuídos entre os lados esquerdo e direito de uma linha central, permitindo combinar fotografias, datas, títulos e descrições.</w:t>
+      </w:r>
+    </w:p>
+    <w:p>
+      <w:r>
+        <w:t>• Linha do tempo vertical em sequência: os acontecimentos aparecem um abaixo do outro, em uma organização linear, com imagens e textos lado a lado.</w:t>
+      </w:r>
+    </w:p>
+    <w:p>
+      <w:r>
+        <w:t>• Linha do tempo horizontal: os acontecimentos são distribuídos horizontalmente, permitindo a navegação lateral entre os marcos históricos.</w:t>
+      </w:r>
+    </w:p>
+    <w:p>
+      <w:r>
+        <w:t>A IA recomendou a linha do tempo vertical alternada, por combinar com a proposta cinematográfica do projeto e permitir a utilização de fotografias históricas em destaque. Também explicou que a rolagem vertical convencional facilita a exploração dos acontecimentos pelo visitante.</w:t>
+      </w:r>
+    </w:p>
+    <w:p>
+      <w:r>
+        <w:t>Decisão tomada</w:t>
+      </w:r>
+    </w:p>
+    <w:p>
+      <w:r>
+        <w:t xml:space="preserve">Decidi concluir a página História no </w:t>
+      </w:r>
+      <w:proofErr w:type="spellStart"/>
+      <w:r>
+        <w:t>Figma</w:t>
+      </w:r>
+      <w:proofErr w:type="spellEnd"/>
+      <w:r>
+        <w:t>, mantendo a identidade visual estabelecida para o Alma da Fiel. A linha do tempo foi planejada como uma forma visual de apresentar os principais acontecimentos da trajetória do Corinthians, relacionando datas, imagens e descrições.</w:t>
+      </w:r>
+    </w:p>
+    <w:p>
+      <w:r>
+        <w:lastRenderedPageBreak/>
+        <w:t>A página História será utilizada como referência para a futura implementação em HTML e CSS. Seu conteúdo também servirá de base para a elaboração das perguntas do quiz, conectando a parte informativa do site à experiência interativa.</w:t>
+      </w:r>
+    </w:p>
+    <w:p>
+      <w:r>
+        <w:rPr>
+          <w:rFonts w:ascii="MS Gothic" w:eastAsia="MS Gothic" w:hAnsi="MS Gothic" w:cs="MS Gothic" w:hint="eastAsia"/>
+        </w:rPr>
+        <w:t>━━━━━━━━━━━━━━━━━━━━━━━━━━━━</w:t>
+      </w:r>
+      <w:r>
+        <w:br/>
+        <w:t>23. Defini</w:t>
+      </w:r>
+      <w:r>
+        <w:rPr>
+          <w:rFonts w:ascii="Aptos" w:hAnsi="Aptos" w:cs="Aptos"/>
+        </w:rPr>
+        <w:t>çã</w:t>
+      </w:r>
+      <w:r>
+        <w:t>o da arquitetura do site em HTML</w:t>
+      </w:r>
+    </w:p>
+    <w:p>
+      <w:r>
+        <w:t>Prompt enviado</w:t>
+      </w:r>
+    </w:p>
+    <w:p>
+      <w:r>
+        <w:t>Perguntei se seria mais coerente desenvolver o Alma da Fiel utilizando páginas HTML separadas ou concentrando todo o conteúdo em um único arquivo index.html.</w:t>
+      </w:r>
+    </w:p>
+    <w:p>
+      <w:r>
+        <w:t>A dúvida surgiu durante o planejamento da implementação, considerando a quantidade de páginas previstas no escopo e a necessidade de manter o código organizado e compreensível durante o desenvolvimento.</w:t>
+      </w:r>
+    </w:p>
+    <w:p>
+      <w:r>
+        <w:t>Resposta da IA</w:t>
+      </w:r>
+    </w:p>
+    <w:p>
+      <w:r>
+        <w:t>A IA comparou duas possibilidades de organização:</w:t>
+      </w:r>
+    </w:p>
+    <w:p>
+      <w:r>
+        <w:t>• Arquivo HTML único: todas as seções e funcionalidades seriam reunidas em uma única página, com navegação entre as seções por meio de links internos.</w:t>
+      </w:r>
+    </w:p>
+    <w:p>
+      <w:r>
+        <w:t>• Múltiplos arquivos HTML: cada página teria seu próprio arquivo, permitindo separar o conteúdo e as funcionalidades conforme a finalidade de cada área do site.</w:t>
+      </w:r>
+    </w:p>
+    <w:p>
+      <w:r>
+        <w:t>A IA recomendou a segunda alternativa, considerando que o Alma da Fiel possui diferentes áreas, como Início, História, Ídolos, Gaviões da Fiel, Quiz e Sobre.</w:t>
+      </w:r>
+    </w:p>
+    <w:p>
+      <w:r>
+        <w:t xml:space="preserve">Também foi sugerido compartilhar arquivos CSS entre as páginas e organizar os arquivos </w:t>
+      </w:r>
+      <w:proofErr w:type="spellStart"/>
+      <w:r>
+        <w:t>JavaScript</w:t>
+      </w:r>
+      <w:proofErr w:type="spellEnd"/>
+      <w:r>
+        <w:t xml:space="preserve"> de acordo com as funcionalidades, evitando a repetição desnecessária de código.</w:t>
+      </w:r>
+    </w:p>
+    <w:p>
+      <w:r>
+        <w:t>Decisão tomada</w:t>
+      </w:r>
+    </w:p>
+    <w:p>
+      <w:r>
+        <w:t>Decidi desenvolver o Alma da Fiel utilizando páginas HTML separadas, mantendo uma estrutura organizada e compatível com o escopo definido.</w:t>
+      </w:r>
+    </w:p>
+    <w:p>
+      <w:r>
+        <w:t xml:space="preserve">A proposta inicial será utilizar arquivos HTML específicos para cada página e compartilhar os recursos de estilização por meio de arquivos CSS. Os scripts </w:t>
+      </w:r>
+      <w:proofErr w:type="spellStart"/>
+      <w:r>
+        <w:t>JavaScript</w:t>
+      </w:r>
+      <w:proofErr w:type="spellEnd"/>
+      <w:r>
+        <w:t xml:space="preserve"> serão organizados conforme as necessidades das funcionalidades, especialmente o quiz e os recursos de interação.</w:t>
+      </w:r>
+    </w:p>
+    <w:p>
+      <w:r>
+        <w:t>Essa decisão busca facilitar a manutenção do projeto, permitir o desenvolvimento gradual das páginas e favorecer a compreensão do código durante a implementação.</w:t>
+      </w:r>
+    </w:p>
+    <w:p>
+      <w:r>
+        <w:rPr>
+          <w:rFonts w:ascii="MS Gothic" w:eastAsia="MS Gothic" w:hAnsi="MS Gothic" w:cs="MS Gothic" w:hint="eastAsia"/>
+        </w:rPr>
+        <w:lastRenderedPageBreak/>
+        <w:t>━━━━━━━━━━━━━━━━━━━━━━━━━━━━</w:t>
+      </w:r>
+      <w:r>
+        <w:br/>
+        <w:t>SITUA</w:t>
+      </w:r>
+      <w:r>
+        <w:rPr>
+          <w:rFonts w:ascii="Aptos" w:hAnsi="Aptos" w:cs="Aptos"/>
+        </w:rPr>
+        <w:t>ÇÃ</w:t>
+      </w:r>
+      <w:r>
+        <w:t xml:space="preserve">O ATUAL DO PROJETO </w:t>
+      </w:r>
+      <w:r>
+        <w:rPr>
+          <w:rFonts w:ascii="Aptos" w:hAnsi="Aptos" w:cs="Aptos"/>
+        </w:rPr>
+        <w:t>—</w:t>
+      </w:r>
+      <w:r>
+        <w:t xml:space="preserve"> ATUALIZA</w:t>
+      </w:r>
+      <w:r>
+        <w:rPr>
+          <w:rFonts w:ascii="Aptos" w:hAnsi="Aptos" w:cs="Aptos"/>
+        </w:rPr>
+        <w:t>ÇÃ</w:t>
+      </w:r>
+      <w:r>
+        <w:t>O</w:t>
+      </w:r>
+    </w:p>
+    <w:p>
+      <w:r>
+        <w:t>Até o momento, o Alma da Fiel possui:</w:t>
+      </w:r>
+    </w:p>
+    <w:p>
+      <w:r>
+        <w:t>• Nome e slogan definidos: Alma da Fiel — “Uma história que vive em cada torcedor”.</w:t>
+      </w:r>
+    </w:p>
+    <w:p>
+      <w:r>
+        <w:t>• Tema, proposta geral e identidade visual estabelecidos, com predominância de preto, branco e cinza, além de detalhes em vermelho.</w:t>
+      </w:r>
+    </w:p>
+    <w:p>
+      <w:r>
+        <w:t>• Seleção inicial de dez acontecimentos históricos do Corinthians, sujeita à validação das informações em fontes confiáveis.</w:t>
+      </w:r>
+    </w:p>
+    <w:p>
+      <w:r>
+        <w:t>• Estrutura preliminar das páginas e funcionalidades definida.</w:t>
+      </w:r>
+    </w:p>
+    <w:p>
+      <w:r>
+        <w:t xml:space="preserve">• Tecnologias previstas: HTML, CSS, </w:t>
+      </w:r>
+      <w:proofErr w:type="spellStart"/>
+      <w:r>
+        <w:t>JavaScript</w:t>
+      </w:r>
+      <w:proofErr w:type="spellEnd"/>
+      <w:r>
+        <w:t xml:space="preserve"> e API </w:t>
+      </w:r>
+      <w:proofErr w:type="spellStart"/>
+      <w:r>
+        <w:t>WebDataVis</w:t>
+      </w:r>
+      <w:proofErr w:type="spellEnd"/>
+      <w:r>
+        <w:t>.</w:t>
+      </w:r>
+    </w:p>
+    <w:p>
+      <w:r>
+        <w:t>• README e descrição do repositório planejados.</w:t>
+      </w:r>
+    </w:p>
+    <w:p>
+      <w:r>
+        <w:t>• Primeiras versões do Contexto, Objetivo e Justificativa elaboradas.</w:t>
+      </w:r>
+    </w:p>
+    <w:p>
+      <w:r>
+        <w:t>• Escopo, Premissas e Restrições organizados.</w:t>
+      </w:r>
+    </w:p>
+    <w:p>
+      <w:r>
+        <w:t xml:space="preserve">• Metodologia de desenvolvimento definida, começando pela prototipação no </w:t>
+      </w:r>
+      <w:proofErr w:type="spellStart"/>
+      <w:r>
+        <w:t>Figma</w:t>
+      </w:r>
+      <w:proofErr w:type="spellEnd"/>
+      <w:r>
+        <w:t>.</w:t>
+      </w:r>
+    </w:p>
+    <w:p>
+      <w:r>
+        <w:t xml:space="preserve">• Cabeçalho do site </w:t>
+      </w:r>
+      <w:proofErr w:type="spellStart"/>
+      <w:r>
+        <w:t>prototipado</w:t>
+      </w:r>
+      <w:proofErr w:type="spellEnd"/>
+      <w:r>
+        <w:t xml:space="preserve"> no </w:t>
+      </w:r>
+      <w:proofErr w:type="spellStart"/>
+      <w:r>
+        <w:t>Figma</w:t>
+      </w:r>
+      <w:proofErr w:type="spellEnd"/>
+      <w:r>
+        <w:t>.</w:t>
+      </w:r>
+    </w:p>
+    <w:p>
+      <w:r>
+        <w:t xml:space="preserve">• Home Page </w:t>
+      </w:r>
+      <w:proofErr w:type="spellStart"/>
+      <w:r>
+        <w:t>prototipada</w:t>
+      </w:r>
+      <w:proofErr w:type="spellEnd"/>
+      <w:r>
+        <w:t xml:space="preserve"> no </w:t>
+      </w:r>
+      <w:proofErr w:type="spellStart"/>
+      <w:r>
+        <w:t>Figma</w:t>
+      </w:r>
+      <w:proofErr w:type="spellEnd"/>
+      <w:r>
+        <w:t>.</w:t>
+      </w:r>
+    </w:p>
+    <w:p>
+      <w:r>
+        <w:t xml:space="preserve">• Página Sobre em desenvolvimento no </w:t>
+      </w:r>
+      <w:proofErr w:type="spellStart"/>
+      <w:r>
+        <w:t>Figma</w:t>
+      </w:r>
+      <w:proofErr w:type="spellEnd"/>
+      <w:r>
+        <w:t>, com as seções já criadas anteriormente.</w:t>
+      </w:r>
+    </w:p>
+    <w:p>
+      <w:r>
+        <w:t xml:space="preserve">• Página História concluída no </w:t>
+      </w:r>
+      <w:proofErr w:type="spellStart"/>
+      <w:r>
+        <w:t>Figma</w:t>
+      </w:r>
+      <w:proofErr w:type="spellEnd"/>
+      <w:r>
+        <w:t>, com a proposta visual voltada à apresentação da trajetória do Corinthians.</w:t>
+      </w:r>
+    </w:p>
+    <w:p>
+      <w:r>
+        <w:t xml:space="preserve">• Arquitetura de implementação definida preliminarmente como um site </w:t>
+      </w:r>
+      <w:proofErr w:type="spellStart"/>
+      <w:r>
+        <w:t>multipágina</w:t>
+      </w:r>
+      <w:proofErr w:type="spellEnd"/>
+      <w:r>
+        <w:t>, utilizando arquivos HTML separados.</w:t>
+      </w:r>
+    </w:p>
+    <w:p>
+      <w:r>
+        <w:t xml:space="preserve">A etapa atual corresponde à prototipação visual das páginas do site. A implementação em HTML, CSS e </w:t>
+      </w:r>
+      <w:proofErr w:type="spellStart"/>
+      <w:r>
+        <w:t>JavaScript</w:t>
+      </w:r>
+      <w:proofErr w:type="spellEnd"/>
+      <w:r>
+        <w:t xml:space="preserve"> ainda deverá ser desenvolvida, assim como a integração com a API </w:t>
+      </w:r>
+      <w:proofErr w:type="spellStart"/>
+      <w:r>
+        <w:t>WebDataVis</w:t>
+      </w:r>
+      <w:proofErr w:type="spellEnd"/>
+      <w:r>
+        <w:t>, conforme a viabilidade técnica.</w:t>
+      </w:r>
+    </w:p>
+    <w:p>
+      <w:r>
+        <w:rPr>
+          <w:rFonts w:ascii="MS Gothic" w:eastAsia="MS Gothic" w:hAnsi="MS Gothic" w:cs="MS Gothic" w:hint="eastAsia"/>
+        </w:rPr>
+        <w:t>━━━━━━━━━━━━━━━━━━━━━━━━━━━━</w:t>
+      </w:r>
+      <w:r>
+        <w:br/>
+        <w:t>PR</w:t>
+      </w:r>
+      <w:r>
+        <w:rPr>
+          <w:rFonts w:ascii="Aptos" w:hAnsi="Aptos" w:cs="Aptos"/>
+        </w:rPr>
+        <w:t>Ó</w:t>
+      </w:r>
+      <w:r>
+        <w:t xml:space="preserve">XIMAS ETAPAS </w:t>
+      </w:r>
+      <w:r>
+        <w:rPr>
+          <w:rFonts w:ascii="Aptos" w:hAnsi="Aptos" w:cs="Aptos"/>
+        </w:rPr>
+        <w:t>—</w:t>
+      </w:r>
+      <w:r>
+        <w:t xml:space="preserve"> ATUALIZA</w:t>
+      </w:r>
+      <w:r>
+        <w:rPr>
+          <w:rFonts w:ascii="Aptos" w:hAnsi="Aptos" w:cs="Aptos"/>
+        </w:rPr>
+        <w:t>ÇÃ</w:t>
+      </w:r>
+      <w:r>
+        <w:t>O</w:t>
+      </w:r>
+    </w:p>
+    <w:p>
+      <w:pPr>
+        <w:numPr>
+          <w:ilvl w:val="0"/>
+          <w:numId w:val="33"/>
+        </w:numPr>
+      </w:pPr>
+      <w:r>
+        <w:t xml:space="preserve">Iniciar a prototipação da página Quiz no </w:t>
+      </w:r>
+      <w:proofErr w:type="spellStart"/>
+      <w:r>
+        <w:t>Figma</w:t>
+      </w:r>
+      <w:proofErr w:type="spellEnd"/>
+      <w:r>
+        <w:t>, definindo sua tela inicial, apresentação das perguntas, alternativas e exibição do resultado final.</w:t>
+      </w:r>
+    </w:p>
+    <w:p>
+      <w:pPr>
+        <w:numPr>
+          <w:ilvl w:val="0"/>
+          <w:numId w:val="33"/>
+        </w:numPr>
+      </w:pPr>
+      <w:r>
+        <w:lastRenderedPageBreak/>
+        <w:t>Desenvolver a página Ídolos, com destaque para Sócrates e Cássio, apresentando suas trajetórias e contribuições para o Corinthians.</w:t>
+      </w:r>
+    </w:p>
+    <w:p>
+      <w:pPr>
+        <w:numPr>
+          <w:ilvl w:val="0"/>
+          <w:numId w:val="33"/>
+        </w:numPr>
+      </w:pPr>
+      <w:r>
+        <w:t>Desenvolver a página Gaviões da Fiel, abordando a história e a importância cultural da torcida organizada.</w:t>
+      </w:r>
+    </w:p>
+    <w:p>
+      <w:pPr>
+        <w:numPr>
+          <w:ilvl w:val="0"/>
+          <w:numId w:val="33"/>
+        </w:numPr>
+      </w:pPr>
+      <w:r>
+        <w:t>Revisar e finalizar a página Sobre, verificando a organização das seções e a coerência visual.</w:t>
+      </w:r>
+    </w:p>
+    <w:p>
+      <w:pPr>
+        <w:numPr>
+          <w:ilvl w:val="0"/>
+          <w:numId w:val="33"/>
+        </w:numPr>
+      </w:pPr>
+      <w:r>
+        <w:t>Criar os protótipos de Cadastro, Login e Dashboard, considerando os limites técnicos e o escopo da primeira versão.</w:t>
+      </w:r>
+    </w:p>
+    <w:p>
+      <w:pPr>
+        <w:numPr>
+          <w:ilvl w:val="0"/>
+          <w:numId w:val="33"/>
+        </w:numPr>
+      </w:pPr>
+      <w:r>
+        <w:t>Revisar a navegação entre as páginas e manter a consistência da identidade visual.</w:t>
+      </w:r>
+    </w:p>
+    <w:p>
+      <w:pPr>
+        <w:numPr>
+          <w:ilvl w:val="0"/>
+          <w:numId w:val="33"/>
+        </w:numPr>
+      </w:pPr>
+      <w:r>
+        <w:t>Validar as informações históricas e selecionar fontes confiáveis para os conteúdos que serão publicados.</w:t>
+      </w:r>
+    </w:p>
+    <w:p>
+      <w:pPr>
+        <w:numPr>
+          <w:ilvl w:val="0"/>
+          <w:numId w:val="33"/>
+        </w:numPr>
+      </w:pPr>
+      <w:r>
+        <w:t xml:space="preserve">Consultar a documentação da API </w:t>
+      </w:r>
+      <w:proofErr w:type="spellStart"/>
+      <w:r>
+        <w:t>WebDataVis</w:t>
+      </w:r>
+      <w:proofErr w:type="spellEnd"/>
+      <w:r>
+        <w:t xml:space="preserve"> para identificar os recursos disponíveis para cadastro, autenticação, armazenamento de resultados e outras funcionalidades planejadas.</w:t>
+      </w:r>
+    </w:p>
+    <w:p>
+      <w:pPr>
+        <w:numPr>
+          <w:ilvl w:val="0"/>
+          <w:numId w:val="33"/>
+        </w:numPr>
+      </w:pPr>
+      <w:r>
+        <w:t xml:space="preserve">Após concluir os protótipos necessários, iniciar a implementação em HTML, CSS e </w:t>
+      </w:r>
+      <w:proofErr w:type="spellStart"/>
+      <w:r>
+        <w:t>JavaScript</w:t>
+      </w:r>
+      <w:proofErr w:type="spellEnd"/>
+      <w:r>
+        <w:t>, utilizando arquivos HTML separados e recursos compartilhados quando apropriado.</w:t>
+      </w:r>
+    </w:p>
+    <w:p>
+      <w:pPr>
+        <w:numPr>
+          <w:ilvl w:val="0"/>
+          <w:numId w:val="33"/>
+        </w:numPr>
+      </w:pPr>
+      <w:r>
+        <w:t>Implementar e testar as funcionalidades gradualmente, começando pela estrutura das páginas e avançando para as interações do quiz.</w:t>
+      </w:r>
+    </w:p>
+    <w:p>
+      <w:pPr>
+        <w:numPr>
+          <w:ilvl w:val="0"/>
+          <w:numId w:val="33"/>
+        </w:numPr>
+      </w:pPr>
+      <w:r>
+        <w:t>Planejar e acompanhar o cronograma semanal até o prazo de 30/11/2026, mantendo o GitHub atualizado e considerando as orientações dos professores.</w:t>
+      </w:r>
+    </w:p>
+    <w:p>
+      <w:r>
+        <w:rPr>
+          <w:rFonts w:ascii="MS Gothic" w:eastAsia="MS Gothic" w:hAnsi="MS Gothic" w:cs="MS Gothic" w:hint="eastAsia"/>
+        </w:rPr>
+        <w:t>━━━━━━━━━━━━━━━━━━━━━━━━━━━━</w:t>
+      </w:r>
+      <w:r>
+        <w:br/>
+        <w:t>CONSIDERA</w:t>
+      </w:r>
+      <w:r>
+        <w:rPr>
+          <w:rFonts w:ascii="Aptos" w:hAnsi="Aptos" w:cs="Aptos"/>
+        </w:rPr>
+        <w:t>ÇÕ</w:t>
+      </w:r>
+      <w:r>
+        <w:t xml:space="preserve">ES FINAIS </w:t>
+      </w:r>
+      <w:r>
+        <w:rPr>
+          <w:rFonts w:ascii="Aptos" w:hAnsi="Aptos" w:cs="Aptos"/>
+        </w:rPr>
+        <w:t>—</w:t>
+      </w:r>
+      <w:r>
+        <w:t xml:space="preserve"> ATUALIZA</w:t>
+      </w:r>
+      <w:r>
+        <w:rPr>
+          <w:rFonts w:ascii="Aptos" w:hAnsi="Aptos" w:cs="Aptos"/>
+        </w:rPr>
+        <w:t>ÇÃ</w:t>
+      </w:r>
+      <w:r>
+        <w:t>O</w:t>
+      </w:r>
+    </w:p>
+    <w:p>
+      <w:r>
+        <w:t xml:space="preserve">O desenvolvimento do Alma da Fiel avançou na etapa de prototipação visual, com a conclusão da página História e a definição preliminar da arquitetura </w:t>
+      </w:r>
+      <w:proofErr w:type="spellStart"/>
+      <w:r>
+        <w:t>multipágina</w:t>
+      </w:r>
+      <w:proofErr w:type="spellEnd"/>
+      <w:r>
+        <w:t xml:space="preserve"> para a futura implementação.</w:t>
+      </w:r>
+    </w:p>
+    <w:p>
+      <w:r>
+        <w:t>A página História representa uma parte central da proposta do projeto, pois permitirá apresentar os principais acontecimentos da trajetória do Corinthians e fornecerá conteúdo para a elaboração das perguntas do quiz.</w:t>
+      </w:r>
+    </w:p>
+    <w:p>
+      <w:r>
+        <w:t xml:space="preserve">A decisão de utilizar arquivos HTML separados busca favorecer a organização do código e facilitar o desenvolvimento individual de cada área do site. A identidade visual deverá permanecer consistente entre as páginas, preservando os elementos definidos durante a prototipação no </w:t>
+      </w:r>
+      <w:proofErr w:type="spellStart"/>
+      <w:r>
+        <w:t>Figma</w:t>
+      </w:r>
+      <w:proofErr w:type="spellEnd"/>
+      <w:r>
+        <w:t>.</w:t>
+      </w:r>
+    </w:p>
+    <w:p>
+      <w:r>
+        <w:lastRenderedPageBreak/>
+        <w:t>A próxima etapa será a criação do protótipo do Quiz, com foco na experiência do usuário, na apresentação das perguntas e no resultado final. Posteriormente, serão desenvolvidas as demais páginas previstas no escopo.</w:t>
+      </w:r>
+    </w:p>
+    <w:p>
+      <w:r>
+        <w:t>A inteligência artificial continuará sendo utilizada como ferramenta de apoio ao planejamento, à organização das ideias, à revisão da documentação e à compreensão dos conceitos técnicos. As decisões de design, a validação das informações e a implementação deverão permanecer sob responsabilidade do autor, garantindo a compreensão do trabalho desenvolvido e sua adequação aos objetivos acadêmicos.</w:t>
       </w:r>
     </w:p>
     <w:p/>
@@ -4859,6 +5533,119 @@
     </w:lvl>
   </w:abstractNum>
   <w:abstractNum w:abstractNumId="14" w15:restartNumberingAfterBreak="0">
+    <w:nsid w:val="39193AA5"/>
+    <w:multiLevelType w:val="multilevel"/>
+    <w:tmpl w:val="3A58A34A"/>
+    <w:lvl w:ilvl="0">
+      <w:start w:val="1"/>
+      <w:numFmt w:val="decimal"/>
+      <w:lvlText w:val="%1."/>
+      <w:lvlJc w:val="left"/>
+      <w:pPr>
+        <w:tabs>
+          <w:tab w:val="num" w:pos="720"/>
+        </w:tabs>
+        <w:ind w:left="720" w:hanging="360"/>
+      </w:pPr>
+    </w:lvl>
+    <w:lvl w:ilvl="1" w:tentative="1">
+      <w:start w:val="1"/>
+      <w:numFmt w:val="decimal"/>
+      <w:lvlText w:val="%2."/>
+      <w:lvlJc w:val="left"/>
+      <w:pPr>
+        <w:tabs>
+          <w:tab w:val="num" w:pos="1440"/>
+        </w:tabs>
+        <w:ind w:left="1440" w:hanging="360"/>
+      </w:pPr>
+    </w:lvl>
+    <w:lvl w:ilvl="2" w:tentative="1">
+      <w:start w:val="1"/>
+      <w:numFmt w:val="decimal"/>
+      <w:lvlText w:val="%3."/>
+      <w:lvlJc w:val="left"/>
+      <w:pPr>
+        <w:tabs>
+          <w:tab w:val="num" w:pos="2160"/>
+        </w:tabs>
+        <w:ind w:left="2160" w:hanging="360"/>
+      </w:pPr>
+    </w:lvl>
+    <w:lvl w:ilvl="3" w:tentative="1">
+      <w:start w:val="1"/>
+      <w:numFmt w:val="decimal"/>
+      <w:lvlText w:val="%4."/>
+      <w:lvlJc w:val="left"/>
+      <w:pPr>
+        <w:tabs>
+          <w:tab w:val="num" w:pos="2880"/>
+        </w:tabs>
+        <w:ind w:left="2880" w:hanging="360"/>
+      </w:pPr>
+    </w:lvl>
+    <w:lvl w:ilvl="4" w:tentative="1">
+      <w:start w:val="1"/>
+      <w:numFmt w:val="decimal"/>
+      <w:lvlText w:val="%5."/>
+      <w:lvlJc w:val="left"/>
+      <w:pPr>
+        <w:tabs>
+          <w:tab w:val="num" w:pos="3600"/>
+        </w:tabs>
+        <w:ind w:left="3600" w:hanging="360"/>
+      </w:pPr>
+    </w:lvl>
+    <w:lvl w:ilvl="5" w:tentative="1">
+      <w:start w:val="1"/>
+      <w:numFmt w:val="decimal"/>
+      <w:lvlText w:val="%6."/>
+      <w:lvlJc w:val="left"/>
+      <w:pPr>
+        <w:tabs>
+          <w:tab w:val="num" w:pos="4320"/>
+        </w:tabs>
+        <w:ind w:left="4320" w:hanging="360"/>
+      </w:pPr>
+    </w:lvl>
+    <w:lvl w:ilvl="6" w:tentative="1">
+      <w:start w:val="1"/>
+      <w:numFmt w:val="decimal"/>
+      <w:lvlText w:val="%7."/>
+      <w:lvlJc w:val="left"/>
+      <w:pPr>
+        <w:tabs>
+          <w:tab w:val="num" w:pos="5040"/>
+        </w:tabs>
+        <w:ind w:left="5040" w:hanging="360"/>
+      </w:pPr>
+    </w:lvl>
+    <w:lvl w:ilvl="7" w:tentative="1">
+      <w:start w:val="1"/>
+      <w:numFmt w:val="decimal"/>
+      <w:lvlText w:val="%8."/>
+      <w:lvlJc w:val="left"/>
+      <w:pPr>
+        <w:tabs>
+          <w:tab w:val="num" w:pos="5760"/>
+        </w:tabs>
+        <w:ind w:left="5760" w:hanging="360"/>
+      </w:pPr>
+    </w:lvl>
+    <w:lvl w:ilvl="8" w:tentative="1">
+      <w:start w:val="1"/>
+      <w:numFmt w:val="decimal"/>
+      <w:lvlText w:val="%9."/>
+      <w:lvlJc w:val="left"/>
+      <w:pPr>
+        <w:tabs>
+          <w:tab w:val="num" w:pos="6480"/>
+        </w:tabs>
+        <w:ind w:left="6480" w:hanging="360"/>
+      </w:pPr>
+    </w:lvl>
+  </w:abstractNum>
+  <w:abstractNum w:abstractNumId="15" w15:restartNumberingAfterBreak="0">
     <w:nsid w:val="397C1635"/>
     <w:multiLevelType w:val="multilevel"/>
     <w:tmpl w:val="6CF80884"/>
@@ -4971,7 +5758,7 @@
       </w:pPr>
     </w:lvl>
   </w:abstractNum>
-  <w:abstractNum w:abstractNumId="15" w15:restartNumberingAfterBreak="0">
+  <w:abstractNum w:abstractNumId="16" w15:restartNumberingAfterBreak="0">
     <w:nsid w:val="399E1168"/>
     <w:multiLevelType w:val="multilevel"/>
     <w:tmpl w:val="F24E1EF6"/>
@@ -5120,7 +5907,7 @@
       </w:rPr>
     </w:lvl>
   </w:abstractNum>
-  <w:abstractNum w:abstractNumId="16" w15:restartNumberingAfterBreak="0">
+  <w:abstractNum w:abstractNumId="17" w15:restartNumberingAfterBreak="0">
     <w:nsid w:val="39CE44AF"/>
     <w:multiLevelType w:val="multilevel"/>
     <w:tmpl w:val="799E18A6"/>
@@ -5269,7 +6056,7 @@
       </w:rPr>
     </w:lvl>
   </w:abstractNum>
-  <w:abstractNum w:abstractNumId="17" w15:restartNumberingAfterBreak="0">
+  <w:abstractNum w:abstractNumId="18" w15:restartNumberingAfterBreak="0">
     <w:nsid w:val="39DE2D77"/>
     <w:multiLevelType w:val="multilevel"/>
     <w:tmpl w:val="D28AB396"/>
@@ -5382,7 +6169,7 @@
       </w:pPr>
     </w:lvl>
   </w:abstractNum>
-  <w:abstractNum w:abstractNumId="18" w15:restartNumberingAfterBreak="0">
+  <w:abstractNum w:abstractNumId="19" w15:restartNumberingAfterBreak="0">
     <w:nsid w:val="3C6B199B"/>
     <w:multiLevelType w:val="multilevel"/>
     <w:tmpl w:val="E9669198"/>
@@ -5495,7 +6282,7 @@
       </w:pPr>
     </w:lvl>
   </w:abstractNum>
-  <w:abstractNum w:abstractNumId="19" w15:restartNumberingAfterBreak="0">
+  <w:abstractNum w:abstractNumId="20" w15:restartNumberingAfterBreak="0">
     <w:nsid w:val="45B45FAF"/>
     <w:multiLevelType w:val="multilevel"/>
     <w:tmpl w:val="F70639B6"/>
@@ -5608,7 +6395,7 @@
       </w:pPr>
     </w:lvl>
   </w:abstractNum>
-  <w:abstractNum w:abstractNumId="20" w15:restartNumberingAfterBreak="0">
+  <w:abstractNum w:abstractNumId="21" w15:restartNumberingAfterBreak="0">
     <w:nsid w:val="49EA667F"/>
     <w:multiLevelType w:val="multilevel"/>
     <w:tmpl w:val="A8868618"/>
@@ -5721,7 +6508,7 @@
       </w:pPr>
     </w:lvl>
   </w:abstractNum>
-  <w:abstractNum w:abstractNumId="21" w15:restartNumberingAfterBreak="0">
+  <w:abstractNum w:abstractNumId="22" w15:restartNumberingAfterBreak="0">
     <w:nsid w:val="4ABC56D4"/>
     <w:multiLevelType w:val="multilevel"/>
     <w:tmpl w:val="8BE4141C"/>
@@ -5870,7 +6657,7 @@
       </w:rPr>
     </w:lvl>
   </w:abstractNum>
-  <w:abstractNum w:abstractNumId="22" w15:restartNumberingAfterBreak="0">
+  <w:abstractNum w:abstractNumId="23" w15:restartNumberingAfterBreak="0">
     <w:nsid w:val="4CDD0DFC"/>
     <w:multiLevelType w:val="multilevel"/>
     <w:tmpl w:val="78BEA320"/>
@@ -5983,7 +6770,7 @@
       </w:pPr>
     </w:lvl>
   </w:abstractNum>
-  <w:abstractNum w:abstractNumId="23" w15:restartNumberingAfterBreak="0">
+  <w:abstractNum w:abstractNumId="24" w15:restartNumberingAfterBreak="0">
     <w:nsid w:val="4F4C5743"/>
     <w:multiLevelType w:val="multilevel"/>
     <w:tmpl w:val="B7446200"/>
@@ -6096,7 +6883,7 @@
       </w:pPr>
     </w:lvl>
   </w:abstractNum>
-  <w:abstractNum w:abstractNumId="24" w15:restartNumberingAfterBreak="0">
+  <w:abstractNum w:abstractNumId="25" w15:restartNumberingAfterBreak="0">
     <w:nsid w:val="579A6C80"/>
     <w:multiLevelType w:val="multilevel"/>
     <w:tmpl w:val="6D189CE4"/>
@@ -6209,7 +6996,7 @@
       </w:pPr>
     </w:lvl>
   </w:abstractNum>
-  <w:abstractNum w:abstractNumId="25" w15:restartNumberingAfterBreak="0">
+  <w:abstractNum w:abstractNumId="26" w15:restartNumberingAfterBreak="0">
     <w:nsid w:val="5FA57BE0"/>
     <w:multiLevelType w:val="multilevel"/>
     <w:tmpl w:val="18C8FD24"/>
@@ -6322,7 +7109,7 @@
       </w:pPr>
     </w:lvl>
   </w:abstractNum>
-  <w:abstractNum w:abstractNumId="26" w15:restartNumberingAfterBreak="0">
+  <w:abstractNum w:abstractNumId="27" w15:restartNumberingAfterBreak="0">
     <w:nsid w:val="60850E81"/>
     <w:multiLevelType w:val="multilevel"/>
     <w:tmpl w:val="46303664"/>
@@ -6471,7 +7258,7 @@
       </w:rPr>
     </w:lvl>
   </w:abstractNum>
-  <w:abstractNum w:abstractNumId="27" w15:restartNumberingAfterBreak="0">
+  <w:abstractNum w:abstractNumId="28" w15:restartNumberingAfterBreak="0">
     <w:nsid w:val="614E4692"/>
     <w:multiLevelType w:val="multilevel"/>
     <w:tmpl w:val="275AFA5C"/>
@@ -6584,7 +7371,7 @@
       </w:pPr>
     </w:lvl>
   </w:abstractNum>
-  <w:abstractNum w:abstractNumId="28" w15:restartNumberingAfterBreak="0">
+  <w:abstractNum w:abstractNumId="29" w15:restartNumberingAfterBreak="0">
     <w:nsid w:val="64D34919"/>
     <w:multiLevelType w:val="multilevel"/>
     <w:tmpl w:val="09A207A8"/>
@@ -6733,7 +7520,7 @@
       </w:rPr>
     </w:lvl>
   </w:abstractNum>
-  <w:abstractNum w:abstractNumId="29" w15:restartNumberingAfterBreak="0">
+  <w:abstractNum w:abstractNumId="30" w15:restartNumberingAfterBreak="0">
     <w:nsid w:val="66307BB7"/>
     <w:multiLevelType w:val="multilevel"/>
     <w:tmpl w:val="E70A17DA"/>
@@ -6882,7 +7669,7 @@
       </w:rPr>
     </w:lvl>
   </w:abstractNum>
-  <w:abstractNum w:abstractNumId="30" w15:restartNumberingAfterBreak="0">
+  <w:abstractNum w:abstractNumId="31" w15:restartNumberingAfterBreak="0">
     <w:nsid w:val="6918154F"/>
     <w:multiLevelType w:val="multilevel"/>
     <w:tmpl w:val="3D94CDBE"/>
@@ -7031,7 +7818,7 @@
       </w:rPr>
     </w:lvl>
   </w:abstractNum>
-  <w:abstractNum w:abstractNumId="31" w15:restartNumberingAfterBreak="0">
+  <w:abstractNum w:abstractNumId="32" w15:restartNumberingAfterBreak="0">
     <w:nsid w:val="7E3C0B5D"/>
     <w:multiLevelType w:val="multilevel"/>
     <w:tmpl w:val="26B0B030"/>
@@ -7181,16 +7968,16 @@
     </w:lvl>
   </w:abstractNum>
   <w:num w:numId="1" w16cid:durableId="163476366">
-    <w:abstractNumId w:val="26"/>
+    <w:abstractNumId w:val="27"/>
   </w:num>
   <w:num w:numId="2" w16cid:durableId="888031651">
-    <w:abstractNumId w:val="29"/>
+    <w:abstractNumId w:val="30"/>
   </w:num>
   <w:num w:numId="3" w16cid:durableId="2143301179">
-    <w:abstractNumId w:val="17"/>
+    <w:abstractNumId w:val="18"/>
   </w:num>
   <w:num w:numId="4" w16cid:durableId="1768693047">
-    <w:abstractNumId w:val="21"/>
+    <w:abstractNumId w:val="22"/>
   </w:num>
   <w:num w:numId="5" w16cid:durableId="2079402130">
     <w:abstractNumId w:val="0"/>
@@ -7199,10 +7986,10 @@
     <w:abstractNumId w:val="13"/>
   </w:num>
   <w:num w:numId="7" w16cid:durableId="337856317">
-    <w:abstractNumId w:val="15"/>
+    <w:abstractNumId w:val="16"/>
   </w:num>
   <w:num w:numId="8" w16cid:durableId="2034529628">
-    <w:abstractNumId w:val="18"/>
+    <w:abstractNumId w:val="19"/>
   </w:num>
   <w:num w:numId="9" w16cid:durableId="741368021">
     <w:abstractNumId w:val="11"/>
@@ -7214,22 +8001,22 @@
     <w:abstractNumId w:val="4"/>
   </w:num>
   <w:num w:numId="12" w16cid:durableId="328290283">
-    <w:abstractNumId w:val="28"/>
+    <w:abstractNumId w:val="29"/>
   </w:num>
   <w:num w:numId="13" w16cid:durableId="365716282">
     <w:abstractNumId w:val="9"/>
   </w:num>
   <w:num w:numId="14" w16cid:durableId="1749301687">
-    <w:abstractNumId w:val="31"/>
+    <w:abstractNumId w:val="32"/>
   </w:num>
   <w:num w:numId="15" w16cid:durableId="92895161">
-    <w:abstractNumId w:val="25"/>
+    <w:abstractNumId w:val="26"/>
   </w:num>
   <w:num w:numId="16" w16cid:durableId="2141683418">
     <w:abstractNumId w:val="3"/>
   </w:num>
   <w:num w:numId="17" w16cid:durableId="293340683">
-    <w:abstractNumId w:val="14"/>
+    <w:abstractNumId w:val="15"/>
   </w:num>
   <w:num w:numId="18" w16cid:durableId="1519152503">
     <w:abstractNumId w:val="2"/>
@@ -7241,40 +8028,43 @@
     <w:abstractNumId w:val="5"/>
   </w:num>
   <w:num w:numId="21" w16cid:durableId="1955594982">
-    <w:abstractNumId w:val="16"/>
+    <w:abstractNumId w:val="17"/>
   </w:num>
   <w:num w:numId="22" w16cid:durableId="249894331">
-    <w:abstractNumId w:val="23"/>
+    <w:abstractNumId w:val="24"/>
   </w:num>
   <w:num w:numId="23" w16cid:durableId="678196419">
-    <w:abstractNumId w:val="24"/>
+    <w:abstractNumId w:val="25"/>
   </w:num>
   <w:num w:numId="24" w16cid:durableId="429787488">
     <w:abstractNumId w:val="6"/>
   </w:num>
   <w:num w:numId="25" w16cid:durableId="1308825487">
-    <w:abstractNumId w:val="30"/>
+    <w:abstractNumId w:val="31"/>
   </w:num>
   <w:num w:numId="26" w16cid:durableId="299728592">
     <w:abstractNumId w:val="1"/>
   </w:num>
   <w:num w:numId="27" w16cid:durableId="1447042674">
-    <w:abstractNumId w:val="20"/>
+    <w:abstractNumId w:val="21"/>
   </w:num>
   <w:num w:numId="28" w16cid:durableId="1326931229">
     <w:abstractNumId w:val="8"/>
   </w:num>
   <w:num w:numId="29" w16cid:durableId="510529186">
-    <w:abstractNumId w:val="27"/>
+    <w:abstractNumId w:val="28"/>
   </w:num>
   <w:num w:numId="30" w16cid:durableId="1924073036">
     <w:abstractNumId w:val="10"/>
   </w:num>
   <w:num w:numId="31" w16cid:durableId="973489751">
-    <w:abstractNumId w:val="22"/>
+    <w:abstractNumId w:val="23"/>
   </w:num>
   <w:num w:numId="32" w16cid:durableId="850223582">
-    <w:abstractNumId w:val="19"/>
+    <w:abstractNumId w:val="20"/>
+  </w:num>
+  <w:num w:numId="33" w16cid:durableId="1725257606">
+    <w:abstractNumId w:val="14"/>
   </w:num>
 </w:numbering>
 </file>

</xml_diff>

<commit_message>
Atualização do Diario de Prompt
</commit_message>
<xml_diff>
--- a/Diario de prompt/DiarioPrompt.docx
+++ b/Diario de prompt/DiarioPrompt.docx
@@ -9,36 +9,12 @@
     </w:p>
     <w:p>
       <w:r>
-        <w:t>Projeto individual — Análise e Desenvolvimento de Sistemas (</w:t>
-      </w:r>
-      <w:proofErr w:type="spellStart"/>
-      <w:r>
-        <w:t>SPTech</w:t>
-      </w:r>
-      <w:proofErr w:type="spellEnd"/>
-      <w:r>
-        <w:t>)</w:t>
-      </w:r>
-    </w:p>
-    <w:p>
-      <w:r>
-        <w:t xml:space="preserve">Nome do projeto: Alma da Fiel Slogan: Uma história que vive em cada torcedor. Tema: História, cultura e identidade do Sport Club Corinthians Paulista. Tecnologias previstas: HTML, CSS, </w:t>
-      </w:r>
-      <w:proofErr w:type="spellStart"/>
-      <w:r>
-        <w:t>JavaScript</w:t>
-      </w:r>
-      <w:proofErr w:type="spellEnd"/>
-      <w:r>
-        <w:t xml:space="preserve"> e API </w:t>
-      </w:r>
-      <w:proofErr w:type="spellStart"/>
-      <w:r>
-        <w:t>WebDataVis</w:t>
-      </w:r>
-      <w:proofErr w:type="spellEnd"/>
-      <w:r>
-        <w:t>.</w:t>
+        <w:t>Projeto individual — Análise e Desenvolvimento de Sistemas (SPTech)</w:t>
+      </w:r>
+    </w:p>
+    <w:p>
+      <w:r>
+        <w:t>Nome do projeto: Alma da Fiel Slogan: Uma história que vive em cada torcedor. Tema: História, cultura e identidade do Sport Club Corinthians Paulista. Tecnologias previstas: HTML, CSS, JavaScript e API WebDataVis.</w:t>
       </w:r>
     </w:p>
     <w:p>
@@ -71,28 +47,12 @@
     </w:p>
     <w:p>
       <w:r>
-        <w:t xml:space="preserve">A IA sugeriu explorar temas relacionados aos meus interesses pessoais, como futebol, especialmente o Corinthians, e academia. Também apresentou possibilidades de projetos com recursos interativos, como </w:t>
-      </w:r>
-      <w:proofErr w:type="spellStart"/>
-      <w:r>
-        <w:t>quizzes</w:t>
-      </w:r>
-      <w:proofErr w:type="spellEnd"/>
-      <w:r>
-        <w:t>, pontuação, dashboards e acompanhamento de informações.</w:t>
-      </w:r>
-    </w:p>
-    <w:p>
-      <w:r>
-        <w:t xml:space="preserve">A proposta foi encontrar um tema que despertasse meu interesse e, ao mesmo tempo, permitisse demonstrar conhecimentos de HTML, CSS e </w:t>
-      </w:r>
-      <w:proofErr w:type="spellStart"/>
-      <w:r>
-        <w:t>JavaScript</w:t>
-      </w:r>
-      <w:proofErr w:type="spellEnd"/>
-      <w:r>
-        <w:t>.</w:t>
+        <w:t>A IA sugeriu explorar temas relacionados aos meus interesses pessoais, como futebol, especialmente o Corinthians, e academia. Também apresentou possibilidades de projetos com recursos interativos, como quizzes, pontuação, dashboards e acompanhamento de informações.</w:t>
+      </w:r>
+    </w:p>
+    <w:p>
+      <w:r>
+        <w:t>A proposta foi encontrar um tema que despertasse meu interesse e, ao mesmo tempo, permitisse demonstrar conhecimentos de HTML, CSS e JavaScript.</w:t>
       </w:r>
     </w:p>
     <w:p>
@@ -571,15 +531,7 @@
     </w:p>
     <w:p>
       <w:r>
-        <w:t xml:space="preserve">Também propôs perguntas de múltipla escolha, feedback sobre as respostas, cálculo da pontuação, </w:t>
-      </w:r>
-      <w:proofErr w:type="gramStart"/>
-      <w:r>
-        <w:t>resultado final</w:t>
-      </w:r>
-      <w:proofErr w:type="gramEnd"/>
-      <w:r>
-        <w:t xml:space="preserve"> e opção de jogar novamente.</w:t>
+        <w:t>Também propôs perguntas de múltipla escolha, feedback sobre as respostas, cálculo da pontuação, resultado final e opção de jogar novamente.</w:t>
       </w:r>
     </w:p>
     <w:p>
@@ -594,15 +546,7 @@
     </w:p>
     <w:p>
       <w:r>
-        <w:t xml:space="preserve">Adotei essa organização como estrutura planejada. As funcionalidades de ranking, cadastro, login e dashboard dependerão da implementação e da confirmação dos recursos disponíveis na API </w:t>
-      </w:r>
-      <w:proofErr w:type="spellStart"/>
-      <w:r>
-        <w:t>WebDataVis</w:t>
-      </w:r>
-      <w:proofErr w:type="spellEnd"/>
-      <w:r>
-        <w:t>.</w:t>
+        <w:t>Adotei essa organização como estrutura planejada. As funcionalidades de ranking, cadastro, login e dashboard dependerão da implementação e da confirmação dos recursos disponíveis na API WebDataVis.</w:t>
       </w:r>
     </w:p>
     <w:p>
@@ -641,28 +585,12 @@
     </w:p>
     <w:p>
       <w:r>
-        <w:t xml:space="preserve">Também recomendou HTML5 para estruturar as páginas, CSS3 para estilização e responsividade e </w:t>
-      </w:r>
-      <w:proofErr w:type="spellStart"/>
-      <w:r>
-        <w:t>JavaScript</w:t>
-      </w:r>
-      <w:proofErr w:type="spellEnd"/>
-      <w:r>
-        <w:t xml:space="preserve"> para implementar a interatividade.</w:t>
-      </w:r>
-    </w:p>
-    <w:p>
-      <w:r>
-        <w:t xml:space="preserve">A API </w:t>
-      </w:r>
-      <w:proofErr w:type="spellStart"/>
-      <w:r>
-        <w:t>WebDataVis</w:t>
-      </w:r>
-      <w:proofErr w:type="spellEnd"/>
-      <w:r>
-        <w:t xml:space="preserve"> seria utilizada conforme os recursos efetivamente oferecidos em sua documentação.</w:t>
+        <w:t>Também recomendou HTML5 para estruturar as páginas, CSS3 para estilização e responsividade e JavaScript para implementar a interatividade.</w:t>
+      </w:r>
+    </w:p>
+    <w:p>
+      <w:r>
+        <w:t>A API WebDataVis seria utilizada conforme os recursos efetivamente oferecidos em sua documentação.</w:t>
       </w:r>
     </w:p>
     <w:p>
@@ -672,15 +600,7 @@
     </w:p>
     <w:p>
       <w:r>
-        <w:t xml:space="preserve">Defini uma identidade visual predominantemente preta e branca, com detalhes em vermelho, e escolhi HTML, CSS e </w:t>
-      </w:r>
-      <w:proofErr w:type="spellStart"/>
-      <w:r>
-        <w:t>JavaScript</w:t>
-      </w:r>
-      <w:proofErr w:type="spellEnd"/>
-      <w:r>
-        <w:t xml:space="preserve"> como tecnologias principais do projeto.</w:t>
+        <w:t>Defini uma identidade visual predominantemente preta e branca, com detalhes em vermelho, e escolhi HTML, CSS e JavaScript como tecnologias principais do projeto.</w:t>
       </w:r>
     </w:p>
     <w:p>
@@ -728,20 +648,7 @@
     </w:p>
     <w:p>
       <w:r>
-        <w:t xml:space="preserve">Passei a utilizar o Prompt Mestre como referência para apresentar o projeto a </w:t>
-      </w:r>
-      <w:proofErr w:type="gramStart"/>
-      <w:r>
-        <w:t xml:space="preserve">outras </w:t>
-      </w:r>
-      <w:proofErr w:type="spellStart"/>
-      <w:r>
-        <w:t>IAs</w:t>
-      </w:r>
-      <w:proofErr w:type="spellEnd"/>
-      <w:proofErr w:type="gramEnd"/>
-      <w:r>
-        <w:t xml:space="preserve"> e manter consistência nas orientações recebidas durante o desenvolvimento.</w:t>
+        <w:t>Passei a utilizar o Prompt Mestre como referência para apresentar o projeto a outras IAs e manter consistência nas orientações recebidas durante o desenvolvimento.</w:t>
       </w:r>
     </w:p>
     <w:p>
@@ -780,15 +687,7 @@
     </w:p>
     <w:p>
       <w:r>
-        <w:t xml:space="preserve">Também foi proposta uma estrutura inicial de pastas para separar os arquivos HTML, CSS, </w:t>
-      </w:r>
-      <w:proofErr w:type="spellStart"/>
-      <w:r>
-        <w:t>JavaScript</w:t>
-      </w:r>
-      <w:proofErr w:type="spellEnd"/>
-      <w:r>
-        <w:t xml:space="preserve"> e recursos visuais.</w:t>
+        <w:t>Também foi proposta uma estrutura inicial de pastas para separar os arquivos HTML, CSS, JavaScript e recursos visuais.</w:t>
       </w:r>
     </w:p>
     <w:p>
@@ -831,15 +730,7 @@
     </w:p>
     <w:p>
       <w:r>
-        <w:t xml:space="preserve">A IA apresentou alternativas com diferentes estilos, incluindo Alma Fiel, Voz da Fiel, Arquivo Fiel, Timão </w:t>
-      </w:r>
-      <w:proofErr w:type="spellStart"/>
-      <w:r>
-        <w:t>Challenge</w:t>
-      </w:r>
-      <w:proofErr w:type="spellEnd"/>
-      <w:r>
-        <w:t>, Universo Alvinegro, Legado Alvinegro, Memória Corinthiana, Além dos 90 e Nossa História.</w:t>
+        <w:t>A IA apresentou alternativas com diferentes estilos, incluindo Alma Fiel, Voz da Fiel, Arquivo Fiel, Timão Challenge, Universo Alvinegro, Legado Alvinegro, Memória Corinthiana, Além dos 90 e Nossa História.</w:t>
       </w:r>
     </w:p>
     <w:p>
@@ -1033,15 +924,7 @@
         </w:numPr>
       </w:pPr>
       <w:r>
-        <w:t xml:space="preserve">Justificativa: </w:t>
-      </w:r>
-      <w:proofErr w:type="gramStart"/>
-      <w:r>
-        <w:t>por que</w:t>
-      </w:r>
-      <w:proofErr w:type="gramEnd"/>
-      <w:r>
-        <w:t xml:space="preserve"> o projeto é relevante.</w:t>
+        <w:t>Justificativa: por que o projeto é relevante.</w:t>
       </w:r>
     </w:p>
     <w:p>
@@ -1311,15 +1194,7 @@
     </w:p>
     <w:p>
       <w:r>
-        <w:t xml:space="preserve">Decidi avançar para o Objetivo, </w:t>
-      </w:r>
-      <w:proofErr w:type="gramStart"/>
-      <w:r>
-        <w:t>mantendo o mesmo</w:t>
-      </w:r>
-      <w:proofErr w:type="gramEnd"/>
-      <w:r>
-        <w:t xml:space="preserve"> processo utilizado no Contexto: primeiro registrar minhas ideias e depois organizar o texto com ajuda da IA.</w:t>
+        <w:t>Decidi avançar para o Objetivo, mantendo o mesmo processo utilizado no Contexto: primeiro registrar minhas ideias e depois organizar o texto com ajuda da IA.</w:t>
       </w:r>
     </w:p>
     <w:p>
@@ -1624,15 +1499,7 @@
         </w:numPr>
       </w:pPr>
       <w:r>
-        <w:t xml:space="preserve">Cadastro e Login: páginas planejadas para registro e autenticação, cuja implementação dependerá dos recursos disponíveis na API </w:t>
-      </w:r>
-      <w:proofErr w:type="spellStart"/>
-      <w:r>
-        <w:t>WebDataVis</w:t>
-      </w:r>
-      <w:proofErr w:type="spellEnd"/>
-      <w:r>
-        <w:t>.</w:t>
+        <w:t>Cadastro e Login: páginas planejadas para registro e autenticação, cuja implementação dependerá dos recursos disponíveis na API WebDataVis.</w:t>
       </w:r>
     </w:p>
     <w:p>
@@ -1648,23 +1515,7 @@
     </w:p>
     <w:p>
       <w:r>
-        <w:t xml:space="preserve">O desenvolvimento está previsto para utilizar HTML, CSS e </w:t>
-      </w:r>
-      <w:proofErr w:type="spellStart"/>
-      <w:r>
-        <w:t>JavaScript</w:t>
-      </w:r>
-      <w:proofErr w:type="spellEnd"/>
-      <w:r>
-        <w:t xml:space="preserve">, com integração à API </w:t>
-      </w:r>
-      <w:proofErr w:type="spellStart"/>
-      <w:r>
-        <w:t>WebDataVis</w:t>
-      </w:r>
-      <w:proofErr w:type="spellEnd"/>
-      <w:r>
-        <w:t xml:space="preserve"> conforme sua documentação e suas possibilidades reais.</w:t>
+        <w:t>O desenvolvimento está previsto para utilizar HTML, CSS e JavaScript, com integração à API WebDataVis conforme sua documentação e suas possibilidades reais.</w:t>
       </w:r>
     </w:p>
     <w:p>
@@ -1680,15 +1531,7 @@
     <w:p>
       <w:r>
         <w:lastRenderedPageBreak/>
-        <w:t xml:space="preserve">Decidi manter o foco da primeira versão no conteúdo histórico e cultural do Corinthians e na experiência interativa do quiz. Cadastro, login, dashboard e persistência de resultados continuam condicionados à viabilidade técnica e aos recursos confirmados da API </w:t>
-      </w:r>
-      <w:proofErr w:type="spellStart"/>
-      <w:r>
-        <w:t>WebDataVis</w:t>
-      </w:r>
-      <w:proofErr w:type="spellEnd"/>
-      <w:r>
-        <w:t>. Os recursos listados como fora do escopo poderão ser reconsiderados em versões futuras.</w:t>
+        <w:t>Decidi manter o foco da primeira versão no conteúdo histórico e cultural do Corinthians e na experiência interativa do quiz. Cadastro, login, dashboard e persistência de resultados continuam condicionados à viabilidade técnica e aos recursos confirmados da API WebDataVis. Os recursos listados como fora do escopo poderão ser reconsiderados em versões futuras.</w:t>
       </w:r>
     </w:p>
     <w:p>
@@ -1868,15 +1711,7 @@
     </w:p>
     <w:p>
       <w:r>
-        <w:t xml:space="preserve">Expliquei que pretendo começar o desenvolvimento do Alma da Fiel projetando o site no </w:t>
-      </w:r>
-      <w:proofErr w:type="spellStart"/>
-      <w:r>
-        <w:t>Figma</w:t>
-      </w:r>
-      <w:proofErr w:type="spellEnd"/>
-      <w:r>
-        <w:t>. A partir disso, pedi ajuda para organizar a metodologia de desenvolvimento do projeto.</w:t>
+        <w:t>Expliquei que pretendo começar o desenvolvimento do Alma da Fiel projetando o site no Figma. A partir disso, pedi ajuda para organizar a metodologia de desenvolvimento do projeto.</w:t>
       </w:r>
     </w:p>
     <w:p>
@@ -1897,15 +1732,7 @@
         </w:numPr>
       </w:pPr>
       <w:r>
-        <w:t xml:space="preserve">Prototipação no </w:t>
-      </w:r>
-      <w:proofErr w:type="spellStart"/>
-      <w:r>
-        <w:t>Figma</w:t>
-      </w:r>
-      <w:proofErr w:type="spellEnd"/>
-      <w:r>
-        <w:t>: planejar o visual das páginas, a navegação, as cores, as imagens e a disposição dos elementos antes de programar.</w:t>
+        <w:t>Prototipação no Figma: planejar o visual das páginas, a navegação, as cores, as imagens e a disposição dos elementos antes de programar.</w:t>
       </w:r>
     </w:p>
     <w:p>
@@ -1927,15 +1754,7 @@
         </w:numPr>
       </w:pPr>
       <w:r>
-        <w:t xml:space="preserve">Implementação das funcionalidades: utilizar </w:t>
-      </w:r>
-      <w:proofErr w:type="spellStart"/>
-      <w:r>
-        <w:t>JavaScript</w:t>
-      </w:r>
-      <w:proofErr w:type="spellEnd"/>
-      <w:r>
-        <w:t xml:space="preserve"> para desenvolver interações, incluindo o quiz e a navegação.</w:t>
+        <w:t>Implementação das funcionalidades: utilizar JavaScript para desenvolver interações, incluindo o quiz e a navegação.</w:t>
       </w:r>
     </w:p>
     <w:p>
@@ -1946,15 +1765,7 @@
         </w:numPr>
       </w:pPr>
       <w:r>
-        <w:t xml:space="preserve">Integração com a API </w:t>
-      </w:r>
-      <w:proofErr w:type="spellStart"/>
-      <w:r>
-        <w:t>WebDataVis</w:t>
-      </w:r>
-      <w:proofErr w:type="spellEnd"/>
-      <w:r>
-        <w:t>: consultar a documentação e implementar apenas os recursos compatíveis com a API.</w:t>
+        <w:t>Integração com a API WebDataVis: consultar a documentação e implementar apenas os recursos compatíveis com a API.</w:t>
       </w:r>
     </w:p>
     <w:p>
@@ -1992,31 +1803,7 @@
     </w:p>
     <w:p>
       <w:r>
-        <w:t xml:space="preserve">Decidi começar pela criação dos protótipos no </w:t>
-      </w:r>
-      <w:proofErr w:type="spellStart"/>
-      <w:r>
-        <w:t>Figma</w:t>
-      </w:r>
-      <w:proofErr w:type="spellEnd"/>
-      <w:r>
-        <w:t xml:space="preserve">, para visualizar a estrutura e a navegação do site antes de iniciar a programação. A sequência planejada é desenvolver as interfaces com HTML e CSS, implementar as interações com </w:t>
-      </w:r>
-      <w:proofErr w:type="spellStart"/>
-      <w:r>
-        <w:t>JavaScript</w:t>
-      </w:r>
-      <w:proofErr w:type="spellEnd"/>
-      <w:r>
-        <w:t xml:space="preserve">, avaliar a integração com a API </w:t>
-      </w:r>
-      <w:proofErr w:type="spellStart"/>
-      <w:r>
-        <w:t>WebDataVis</w:t>
-      </w:r>
-      <w:proofErr w:type="spellEnd"/>
-      <w:r>
-        <w:t xml:space="preserve"> e realizar testes e ajustes. O andamento será acompanhado pelo GitHub, pelo cronograma e pelas orientações dos professores.</w:t>
+        <w:t>Decidi começar pela criação dos protótipos no Figma, para visualizar a estrutura e a navegação do site antes de iniciar a programação. A sequência planejada é desenvolver as interfaces com HTML e CSS, implementar as interações com JavaScript, avaliar a integração com a API WebDataVis e realizar testes e ajustes. O andamento será acompanhado pelo GitHub, pelo cronograma e pelas orientações dos professores.</w:t>
       </w:r>
     </w:p>
     <w:p>
@@ -2089,23 +1876,7 @@
         </w:numPr>
       </w:pPr>
       <w:r>
-        <w:t xml:space="preserve">Tecnologias previstas: HTML, CSS, </w:t>
-      </w:r>
-      <w:proofErr w:type="spellStart"/>
-      <w:r>
-        <w:t>JavaScript</w:t>
-      </w:r>
-      <w:proofErr w:type="spellEnd"/>
-      <w:r>
-        <w:t xml:space="preserve"> e API </w:t>
-      </w:r>
-      <w:proofErr w:type="spellStart"/>
-      <w:r>
-        <w:t>WebDataVis</w:t>
-      </w:r>
-      <w:proofErr w:type="spellEnd"/>
-      <w:r>
-        <w:t>.</w:t>
+        <w:t>Tecnologias previstas: HTML, CSS, JavaScript e API WebDataVis.</w:t>
       </w:r>
     </w:p>
     <w:p>
@@ -2160,15 +1931,7 @@
         </w:numPr>
       </w:pPr>
       <w:r>
-        <w:t xml:space="preserve">Metodologia de desenvolvimento planejada, começando pela prototipação no </w:t>
-      </w:r>
-      <w:proofErr w:type="spellStart"/>
-      <w:r>
-        <w:t>Figma</w:t>
-      </w:r>
-      <w:proofErr w:type="spellEnd"/>
-      <w:r>
-        <w:t>.</w:t>
+        <w:t>Metodologia de desenvolvimento planejada, começando pela prototipação no Figma.</w:t>
       </w:r>
     </w:p>
     <w:p>
@@ -2184,15 +1947,7 @@
         </w:numPr>
       </w:pPr>
       <w:r>
-        <w:t xml:space="preserve">Iniciar a prototipação das páginas no </w:t>
-      </w:r>
-      <w:proofErr w:type="spellStart"/>
-      <w:r>
-        <w:t>Figma</w:t>
-      </w:r>
-      <w:proofErr w:type="spellEnd"/>
-      <w:r>
-        <w:t>.</w:t>
+        <w:t>Iniciar a prototipação das páginas no Figma.</w:t>
       </w:r>
     </w:p>
     <w:p>
@@ -2215,15 +1970,7 @@
         </w:numPr>
       </w:pPr>
       <w:r>
-        <w:t xml:space="preserve">Conferir a documentação da API </w:t>
-      </w:r>
-      <w:proofErr w:type="spellStart"/>
-      <w:r>
-        <w:t>WebDataVis</w:t>
-      </w:r>
-      <w:proofErr w:type="spellEnd"/>
-      <w:r>
-        <w:t xml:space="preserve"> para confirmar quais recursos podem ser implementados.</w:t>
+        <w:t>Conferir a documentação da API WebDataVis para confirmar quais recursos podem ser implementados.</w:t>
       </w:r>
     </w:p>
     <w:p>
@@ -2307,13 +2054,8 @@
         </w:numPr>
       </w:pPr>
       <w:r>
-        <w:t xml:space="preserve">Início da prototipação visual no </w:t>
-      </w:r>
-      <w:proofErr w:type="spellStart"/>
-      <w:r>
-        <w:t>Figma</w:t>
-      </w:r>
-      <w:proofErr w:type="spellEnd"/>
+        <w:t>Início da prototipação visual no Figma</w:t>
+      </w:r>
     </w:p>
     <w:p>
       <w:r>
@@ -2326,15 +2068,7 @@
     </w:p>
     <w:p>
       <w:r>
-        <w:t xml:space="preserve">Expliquei que iniciei a prototipação do Alma da Fiel no </w:t>
-      </w:r>
-      <w:proofErr w:type="spellStart"/>
-      <w:r>
-        <w:t>Figma</w:t>
-      </w:r>
-      <w:proofErr w:type="spellEnd"/>
-      <w:r>
-        <w:t>, seguindo a metodologia de desenvolvimento definida anteriormente. Informei que já havia criado o cabeçalho, a Home Page e duas seções da página Sobre, utilizando como referência a identidade visual cinematográfica do projeto, com predominância de preto, branco e cinza, além de detalhes em vermelho.</w:t>
+        <w:t>Expliquei que iniciei a prototipação do Alma da Fiel no Figma, seguindo a metodologia de desenvolvimento definida anteriormente. Informei que já havia criado o cabeçalho, a Home Page e duas seções da página Sobre, utilizando como referência a identidade visual cinematográfica do projeto, com predominância de preto, branco e cinza, além de detalhes em vermelho.</w:t>
       </w:r>
     </w:p>
     <w:p>
@@ -2467,15 +2201,7 @@
         <w:t>Páginas de Cadastro, Login e Dashboard:</w:t>
       </w:r>
       <w:r>
-        <w:t xml:space="preserve"> elaborar protótipos que mantenham a identidade visual do site, considerando que a implementação dessas funcionalidades dependerá da viabilidade técnica e dos recursos disponíveis na API </w:t>
-      </w:r>
-      <w:proofErr w:type="spellStart"/>
-      <w:r>
-        <w:t>WebDataVis</w:t>
-      </w:r>
-      <w:proofErr w:type="spellEnd"/>
-      <w:r>
-        <w:t>.</w:t>
+        <w:t xml:space="preserve"> elaborar protótipos que mantenham a identidade visual do site, considerando que a implementação dessas funcionalidades dependerá da viabilidade técnica e dos recursos disponíveis na API WebDataVis.</w:t>
       </w:r>
     </w:p>
     <w:p>
@@ -2485,23 +2211,7 @@
     </w:p>
     <w:p>
       <w:r>
-        <w:t xml:space="preserve">Foi ressaltado que o </w:t>
-      </w:r>
-      <w:proofErr w:type="spellStart"/>
-      <w:r>
-        <w:t>Figma</w:t>
-      </w:r>
-      <w:proofErr w:type="spellEnd"/>
-      <w:r>
-        <w:t xml:space="preserve"> deve ser utilizado para planejar a estrutura, a navegação e a aparência das páginas antes de iniciar a implementação em HTML, CSS e </w:t>
-      </w:r>
-      <w:proofErr w:type="spellStart"/>
-      <w:r>
-        <w:t>JavaScript</w:t>
-      </w:r>
-      <w:proofErr w:type="spellEnd"/>
-      <w:r>
-        <w:t>.</w:t>
+        <w:t>Foi ressaltado que o Figma deve ser utilizado para planejar a estrutura, a navegação e a aparência das páginas antes de iniciar a implementação em HTML, CSS e JavaScript.</w:t>
       </w:r>
     </w:p>
     <w:p>
@@ -2515,15 +2225,7 @@
     </w:p>
     <w:p>
       <w:r>
-        <w:t xml:space="preserve">Decidi continuar a prototipação pelo </w:t>
-      </w:r>
-      <w:proofErr w:type="spellStart"/>
-      <w:r>
-        <w:t>Figma</w:t>
-      </w:r>
-      <w:proofErr w:type="spellEnd"/>
-      <w:r>
-        <w:t>, finalizando inicialmente a página Sobre e avançando depois para a página História.</w:t>
+        <w:t>Decidi continuar a prototipação pelo Figma, finalizando inicialmente a página Sobre e avançando depois para a página História.</w:t>
       </w:r>
     </w:p>
     <w:p>
@@ -2577,23 +2279,7 @@
     </w:p>
     <w:p>
       <w:r>
-        <w:t xml:space="preserve">• Tecnologias previstas: HTML, CSS, </w:t>
-      </w:r>
-      <w:proofErr w:type="spellStart"/>
-      <w:r>
-        <w:t>JavaScript</w:t>
-      </w:r>
-      <w:proofErr w:type="spellEnd"/>
-      <w:r>
-        <w:t xml:space="preserve"> e API </w:t>
-      </w:r>
-      <w:proofErr w:type="spellStart"/>
-      <w:r>
-        <w:t>WebDataVis</w:t>
-      </w:r>
-      <w:proofErr w:type="spellEnd"/>
-      <w:r>
-        <w:t>.</w:t>
+        <w:t>• Tecnologias previstas: HTML, CSS, JavaScript e API WebDataVis.</w:t>
       </w:r>
     </w:p>
     <w:p>
@@ -2613,78 +2299,22 @@
     </w:p>
     <w:p>
       <w:r>
-        <w:t xml:space="preserve">• Metodologia de desenvolvimento definida, começando pela prototipação no </w:t>
-      </w:r>
-      <w:proofErr w:type="spellStart"/>
-      <w:r>
-        <w:t>Figma</w:t>
-      </w:r>
-      <w:proofErr w:type="spellEnd"/>
-      <w:r>
-        <w:t>.</w:t>
-      </w:r>
-    </w:p>
-    <w:p>
-      <w:r>
-        <w:t xml:space="preserve">• Cabeçalho do site </w:t>
-      </w:r>
-      <w:proofErr w:type="spellStart"/>
-      <w:r>
-        <w:t>prototipado</w:t>
-      </w:r>
-      <w:proofErr w:type="spellEnd"/>
-      <w:r>
-        <w:t xml:space="preserve"> no </w:t>
-      </w:r>
-      <w:proofErr w:type="spellStart"/>
-      <w:r>
-        <w:t>Figma</w:t>
-      </w:r>
-      <w:proofErr w:type="spellEnd"/>
-      <w:r>
-        <w:t>.</w:t>
-      </w:r>
-    </w:p>
-    <w:p>
-      <w:r>
-        <w:t xml:space="preserve">• Home Page </w:t>
-      </w:r>
-      <w:proofErr w:type="spellStart"/>
-      <w:r>
-        <w:t>prototipada</w:t>
-      </w:r>
-      <w:proofErr w:type="spellEnd"/>
-      <w:r>
-        <w:t xml:space="preserve"> no </w:t>
-      </w:r>
-      <w:proofErr w:type="spellStart"/>
-      <w:r>
-        <w:t>Figma</w:t>
-      </w:r>
-      <w:proofErr w:type="spellEnd"/>
-      <w:r>
-        <w:t>.</w:t>
-      </w:r>
-    </w:p>
-    <w:p>
-      <w:r>
-        <w:t xml:space="preserve">• Duas seções da página Sobre </w:t>
-      </w:r>
-      <w:proofErr w:type="spellStart"/>
-      <w:r>
-        <w:t>prototipadas</w:t>
-      </w:r>
-      <w:proofErr w:type="spellEnd"/>
-      <w:r>
-        <w:t xml:space="preserve"> no </w:t>
-      </w:r>
-      <w:proofErr w:type="spellStart"/>
-      <w:r>
-        <w:t>Figma</w:t>
-      </w:r>
-      <w:proofErr w:type="spellEnd"/>
-      <w:r>
-        <w:t>.</w:t>
+        <w:t>• Metodologia de desenvolvimento definida, começando pela prototipação no Figma.</w:t>
+      </w:r>
+    </w:p>
+    <w:p>
+      <w:r>
+        <w:t>• Cabeçalho do site prototipado no Figma.</w:t>
+      </w:r>
+    </w:p>
+    <w:p>
+      <w:r>
+        <w:t>• Home Page prototipada no Figma.</w:t>
+      </w:r>
+    </w:p>
+    <w:p>
+      <w:r>
+        <w:t>• Duas seções da página Sobre prototipadas no Figma.</w:t>
       </w:r>
     </w:p>
     <w:p>
@@ -2713,15 +2343,7 @@
         </w:numPr>
       </w:pPr>
       <w:r>
-        <w:t xml:space="preserve">Finalizar a página Sobre no </w:t>
-      </w:r>
-      <w:proofErr w:type="spellStart"/>
-      <w:r>
-        <w:t>Figma</w:t>
-      </w:r>
-      <w:proofErr w:type="spellEnd"/>
-      <w:r>
-        <w:t>, revisando as duas seções já criadas e definindo o encerramento da página.</w:t>
+        <w:t>Finalizar a página Sobre no Figma, revisando as duas seções já criadas e definindo o encerramento da página.</w:t>
       </w:r>
     </w:p>
     <w:p>
@@ -2765,13 +2387,8 @@
           <w:numId w:val="32"/>
         </w:numPr>
       </w:pPr>
-      <w:proofErr w:type="spellStart"/>
-      <w:r>
-        <w:t>Prototipar</w:t>
-      </w:r>
-      <w:proofErr w:type="spellEnd"/>
-      <w:r>
-        <w:t xml:space="preserve"> o Quiz, incluindo a tela inicial, as perguntas, as alternativas, o feedback e a exibição do resultado final.</w:t>
+      <w:r>
+        <w:t>Prototipar o Quiz, incluindo a tela inicial, as perguntas, as alternativas, o feedback e a exibição do resultado final.</w:t>
       </w:r>
     </w:p>
     <w:p>
@@ -2804,15 +2421,7 @@
         </w:numPr>
       </w:pPr>
       <w:r>
-        <w:t xml:space="preserve">Conferir a documentação da API </w:t>
-      </w:r>
-      <w:proofErr w:type="spellStart"/>
-      <w:r>
-        <w:t>WebDataVis</w:t>
-      </w:r>
-      <w:proofErr w:type="spellEnd"/>
-      <w:r>
-        <w:t xml:space="preserve"> para identificar os recursos que poderão ser implementados.</w:t>
+        <w:t>Conferir a documentação da API WebDataVis para identificar os recursos que poderão ser implementados.</w:t>
       </w:r>
     </w:p>
     <w:p>
@@ -2834,15 +2443,7 @@
         </w:numPr>
       </w:pPr>
       <w:r>
-        <w:t xml:space="preserve">Após concluir os protótipos necessários, iniciar a implementação em HTML, CSS e </w:t>
-      </w:r>
-      <w:proofErr w:type="spellStart"/>
-      <w:r>
-        <w:t>JavaScript</w:t>
-      </w:r>
-      <w:proofErr w:type="spellEnd"/>
-      <w:r>
-        <w:t>, desenvolvendo e testando as funcionalidades por etapas.</w:t>
+        <w:t>Após concluir os protótipos necessários, iniciar a implementação em HTML, CSS e JavaScript, desenvolvendo e testando as funcionalidades por etapas.</w:t>
       </w:r>
     </w:p>
     <w:p>
@@ -2871,15 +2472,7 @@
     </w:p>
     <w:p>
       <w:r>
-        <w:t xml:space="preserve">O desenvolvimento do Alma da Fiel avançou da etapa de planejamento e documentação para o início da prototipação visual no </w:t>
-      </w:r>
-      <w:proofErr w:type="spellStart"/>
-      <w:r>
-        <w:t>Figma</w:t>
-      </w:r>
-      <w:proofErr w:type="spellEnd"/>
-      <w:r>
-        <w:t>.</w:t>
+        <w:t>O desenvolvimento do Alma da Fiel avançou da etapa de planejamento e documentação para o início da prototipação visual no Figma.</w:t>
       </w:r>
     </w:p>
     <w:p>
@@ -2918,15 +2511,7 @@
     </w:p>
     <w:p>
       <w:r>
-        <w:t xml:space="preserve">Informei que concluí a prototipação da página História do Alma da Fiel no </w:t>
-      </w:r>
-      <w:proofErr w:type="spellStart"/>
-      <w:r>
-        <w:t>Figma</w:t>
-      </w:r>
-      <w:proofErr w:type="spellEnd"/>
-      <w:r>
-        <w:t xml:space="preserve"> e pedi orientação para continuar o desenvolvimento do projeto, considerando que a próxima página prevista no planejamento seria o Quiz.</w:t>
+        <w:t>Informei que concluí a prototipação da página História do Alma da Fiel no Figma e pedi orientação para continuar o desenvolvimento do projeto, considerando que a próxima página prevista no planejamento seria o Quiz.</w:t>
       </w:r>
     </w:p>
     <w:p>
@@ -2976,15 +2561,7 @@
     </w:p>
     <w:p>
       <w:r>
-        <w:t xml:space="preserve">Decidi concluir a página História no </w:t>
-      </w:r>
-      <w:proofErr w:type="spellStart"/>
-      <w:r>
-        <w:t>Figma</w:t>
-      </w:r>
-      <w:proofErr w:type="spellEnd"/>
-      <w:r>
-        <w:t>, mantendo a identidade visual estabelecida para o Alma da Fiel. A linha do tempo foi planejada como uma forma visual de apresentar os principais acontecimentos da trajetória do Corinthians, relacionando datas, imagens e descrições.</w:t>
+        <w:t>Decidi concluir a página História no Figma, mantendo a identidade visual estabelecida para o Alma da Fiel. A linha do tempo foi planejada como uma forma visual de apresentar os principais acontecimentos da trajetória do Corinthians, relacionando datas, imagens e descrições.</w:t>
       </w:r>
     </w:p>
     <w:p>
@@ -3056,15 +2633,7 @@
     </w:p>
     <w:p>
       <w:r>
-        <w:t xml:space="preserve">Também foi sugerido compartilhar arquivos CSS entre as páginas e organizar os arquivos </w:t>
-      </w:r>
-      <w:proofErr w:type="spellStart"/>
-      <w:r>
-        <w:t>JavaScript</w:t>
-      </w:r>
-      <w:proofErr w:type="spellEnd"/>
-      <w:r>
-        <w:t xml:space="preserve"> de acordo com as funcionalidades, evitando a repetição desnecessária de código.</w:t>
+        <w:t>Também foi sugerido compartilhar arquivos CSS entre as páginas e organizar os arquivos JavaScript de acordo com as funcionalidades, evitando a repetição desnecessária de código.</w:t>
       </w:r>
     </w:p>
     <w:p>
@@ -3079,15 +2648,7 @@
     </w:p>
     <w:p>
       <w:r>
-        <w:t xml:space="preserve">A proposta inicial será utilizar arquivos HTML específicos para cada página e compartilhar os recursos de estilização por meio de arquivos CSS. Os scripts </w:t>
-      </w:r>
-      <w:proofErr w:type="spellStart"/>
-      <w:r>
-        <w:t>JavaScript</w:t>
-      </w:r>
-      <w:proofErr w:type="spellEnd"/>
-      <w:r>
-        <w:t xml:space="preserve"> serão organizados conforme as necessidades das funcionalidades, especialmente o quiz e os recursos de interação.</w:t>
+        <w:t>A proposta inicial será utilizar arquivos HTML específicos para cada página e compartilhar os recursos de estilização por meio de arquivos CSS. Os scripts JavaScript serão organizados conforme as necessidades das funcionalidades, especialmente o quiz e os recursos de interação.</w:t>
       </w:r>
     </w:p>
     <w:p>
@@ -3162,23 +2723,7 @@
     </w:p>
     <w:p>
       <w:r>
-        <w:t xml:space="preserve">• Tecnologias previstas: HTML, CSS, </w:t>
-      </w:r>
-      <w:proofErr w:type="spellStart"/>
-      <w:r>
-        <w:t>JavaScript</w:t>
-      </w:r>
-      <w:proofErr w:type="spellEnd"/>
-      <w:r>
-        <w:t xml:space="preserve"> e API </w:t>
-      </w:r>
-      <w:proofErr w:type="spellStart"/>
-      <w:r>
-        <w:t>WebDataVis</w:t>
-      </w:r>
-      <w:proofErr w:type="spellEnd"/>
-      <w:r>
-        <w:t>.</w:t>
+        <w:t>• Tecnologias previstas: HTML, CSS, JavaScript e API WebDataVis.</w:t>
       </w:r>
     </w:p>
     <w:p>
@@ -3198,117 +2743,37 @@
     </w:p>
     <w:p>
       <w:r>
-        <w:t xml:space="preserve">• Metodologia de desenvolvimento definida, começando pela prototipação no </w:t>
-      </w:r>
-      <w:proofErr w:type="spellStart"/>
-      <w:r>
-        <w:t>Figma</w:t>
-      </w:r>
-      <w:proofErr w:type="spellEnd"/>
-      <w:r>
-        <w:t>.</w:t>
-      </w:r>
-    </w:p>
-    <w:p>
-      <w:r>
-        <w:t xml:space="preserve">• Cabeçalho do site </w:t>
-      </w:r>
-      <w:proofErr w:type="spellStart"/>
-      <w:r>
-        <w:t>prototipado</w:t>
-      </w:r>
-      <w:proofErr w:type="spellEnd"/>
-      <w:r>
-        <w:t xml:space="preserve"> no </w:t>
-      </w:r>
-      <w:proofErr w:type="spellStart"/>
-      <w:r>
-        <w:t>Figma</w:t>
-      </w:r>
-      <w:proofErr w:type="spellEnd"/>
-      <w:r>
-        <w:t>.</w:t>
-      </w:r>
-    </w:p>
-    <w:p>
-      <w:r>
-        <w:t xml:space="preserve">• Home Page </w:t>
-      </w:r>
-      <w:proofErr w:type="spellStart"/>
-      <w:r>
-        <w:t>prototipada</w:t>
-      </w:r>
-      <w:proofErr w:type="spellEnd"/>
-      <w:r>
-        <w:t xml:space="preserve"> no </w:t>
-      </w:r>
-      <w:proofErr w:type="spellStart"/>
-      <w:r>
-        <w:t>Figma</w:t>
-      </w:r>
-      <w:proofErr w:type="spellEnd"/>
-      <w:r>
-        <w:t>.</w:t>
-      </w:r>
-    </w:p>
-    <w:p>
-      <w:r>
-        <w:t xml:space="preserve">• Página Sobre em desenvolvimento no </w:t>
-      </w:r>
-      <w:proofErr w:type="spellStart"/>
-      <w:r>
-        <w:t>Figma</w:t>
-      </w:r>
-      <w:proofErr w:type="spellEnd"/>
-      <w:r>
-        <w:t>, com as seções já criadas anteriormente.</w:t>
-      </w:r>
-    </w:p>
-    <w:p>
-      <w:r>
-        <w:t xml:space="preserve">• Página História concluída no </w:t>
-      </w:r>
-      <w:proofErr w:type="spellStart"/>
-      <w:r>
-        <w:t>Figma</w:t>
-      </w:r>
-      <w:proofErr w:type="spellEnd"/>
-      <w:r>
-        <w:t>, com a proposta visual voltada à apresentação da trajetória do Corinthians.</w:t>
-      </w:r>
-    </w:p>
-    <w:p>
-      <w:r>
-        <w:t xml:space="preserve">• Arquitetura de implementação definida preliminarmente como um site </w:t>
-      </w:r>
-      <w:proofErr w:type="spellStart"/>
-      <w:r>
-        <w:t>multipágina</w:t>
-      </w:r>
-      <w:proofErr w:type="spellEnd"/>
-      <w:r>
-        <w:t>, utilizando arquivos HTML separados.</w:t>
-      </w:r>
-    </w:p>
-    <w:p>
-      <w:r>
-        <w:t xml:space="preserve">A etapa atual corresponde à prototipação visual das páginas do site. A implementação em HTML, CSS e </w:t>
-      </w:r>
-      <w:proofErr w:type="spellStart"/>
-      <w:r>
-        <w:t>JavaScript</w:t>
-      </w:r>
-      <w:proofErr w:type="spellEnd"/>
-      <w:r>
-        <w:t xml:space="preserve"> ainda deverá ser desenvolvida, assim como a integração com a API </w:t>
-      </w:r>
-      <w:proofErr w:type="spellStart"/>
-      <w:r>
-        <w:t>WebDataVis</w:t>
-      </w:r>
-      <w:proofErr w:type="spellEnd"/>
-      <w:r>
-        <w:t>, conforme a viabilidade técnica.</w:t>
+        <w:t>• Metodologia de desenvolvimento definida, começando pela prototipação no Figma.</w:t>
+      </w:r>
+    </w:p>
+    <w:p>
+      <w:r>
+        <w:t>• Cabeçalho do site prototipado no Figma.</w:t>
+      </w:r>
+    </w:p>
+    <w:p>
+      <w:r>
+        <w:t>• Home Page prototipada no Figma.</w:t>
+      </w:r>
+    </w:p>
+    <w:p>
+      <w:r>
+        <w:t>• Página Sobre em desenvolvimento no Figma, com as seções já criadas anteriormente.</w:t>
+      </w:r>
+    </w:p>
+    <w:p>
+      <w:r>
+        <w:t>• Página História concluída no Figma, com a proposta visual voltada à apresentação da trajetória do Corinthians.</w:t>
+      </w:r>
+    </w:p>
+    <w:p>
+      <w:r>
+        <w:t>• Arquitetura de implementação definida preliminarmente como um site multipágina, utilizando arquivos HTML separados.</w:t>
+      </w:r>
+    </w:p>
+    <w:p>
+      <w:r>
+        <w:t>A etapa atual corresponde à prototipação visual das páginas do site. A implementação em HTML, CSS e JavaScript ainda deverá ser desenvolvida, assim como a integração com a API WebDataVis, conforme a viabilidade técnica.</w:t>
       </w:r>
     </w:p>
     <w:p>
@@ -3358,15 +2823,7 @@
         </w:numPr>
       </w:pPr>
       <w:r>
-        <w:t xml:space="preserve">Iniciar a prototipação da página Quiz no </w:t>
-      </w:r>
-      <w:proofErr w:type="spellStart"/>
-      <w:r>
-        <w:t>Figma</w:t>
-      </w:r>
-      <w:proofErr w:type="spellEnd"/>
-      <w:r>
-        <w:t>, definindo sua tela inicial, apresentação das perguntas, alternativas e exibição do resultado final.</w:t>
+        <w:t>Iniciar a prototipação da página Quiz no Figma, definindo sua tela inicial, apresentação das perguntas, alternativas e exibição do resultado final.</w:t>
       </w:r>
     </w:p>
     <w:p>
@@ -3444,15 +2901,7 @@
         </w:numPr>
       </w:pPr>
       <w:r>
-        <w:t xml:space="preserve">Consultar a documentação da API </w:t>
-      </w:r>
-      <w:proofErr w:type="spellStart"/>
-      <w:r>
-        <w:t>WebDataVis</w:t>
-      </w:r>
-      <w:proofErr w:type="spellEnd"/>
-      <w:r>
-        <w:t xml:space="preserve"> para identificar os recursos disponíveis para cadastro, autenticação, armazenamento de resultados e outras funcionalidades planejadas.</w:t>
+        <w:t>Consultar a documentação da API WebDataVis para identificar os recursos disponíveis para cadastro, autenticação, armazenamento de resultados e outras funcionalidades planejadas.</w:t>
       </w:r>
     </w:p>
     <w:p>
@@ -3463,15 +2912,7 @@
         </w:numPr>
       </w:pPr>
       <w:r>
-        <w:t xml:space="preserve">Após concluir os protótipos necessários, iniciar a implementação em HTML, CSS e </w:t>
-      </w:r>
-      <w:proofErr w:type="spellStart"/>
-      <w:r>
-        <w:t>JavaScript</w:t>
-      </w:r>
-      <w:proofErr w:type="spellEnd"/>
-      <w:r>
-        <w:t>, utilizando arquivos HTML separados e recursos compartilhados quando apropriado.</w:t>
+        <w:t>Após concluir os protótipos necessários, iniciar a implementação em HTML, CSS e JavaScript, utilizando arquivos HTML separados e recursos compartilhados quando apropriado.</w:t>
       </w:r>
     </w:p>
     <w:p>
@@ -3537,15 +2978,7 @@
     </w:p>
     <w:p>
       <w:r>
-        <w:t xml:space="preserve">O desenvolvimento do Alma da Fiel avançou na etapa de prototipação visual, com a conclusão da página História e a definição preliminar da arquitetura </w:t>
-      </w:r>
-      <w:proofErr w:type="spellStart"/>
-      <w:r>
-        <w:t>multipágina</w:t>
-      </w:r>
-      <w:proofErr w:type="spellEnd"/>
-      <w:r>
-        <w:t xml:space="preserve"> para a futura implementação.</w:t>
+        <w:t>O desenvolvimento do Alma da Fiel avançou na etapa de prototipação visual, com a conclusão da página História e a definição preliminar da arquitetura multipágina para a futura implementação.</w:t>
       </w:r>
     </w:p>
     <w:p>
@@ -3555,15 +2988,7 @@
     </w:p>
     <w:p>
       <w:r>
-        <w:t xml:space="preserve">A decisão de utilizar arquivos HTML separados busca favorecer a organização do código e facilitar o desenvolvimento individual de cada área do site. A identidade visual deverá permanecer consistente entre as páginas, preservando os elementos definidos durante a prototipação no </w:t>
-      </w:r>
-      <w:proofErr w:type="spellStart"/>
-      <w:r>
-        <w:t>Figma</w:t>
-      </w:r>
-      <w:proofErr w:type="spellEnd"/>
-      <w:r>
-        <w:t>.</w:t>
+        <w:t>A decisão de utilizar arquivos HTML separados busca favorecer a organização do código e facilitar o desenvolvimento individual de cada área do site. A identidade visual deverá permanecer consistente entre as páginas, preservando os elementos definidos durante a prototipação no Figma.</w:t>
       </w:r>
     </w:p>
     <w:p>
@@ -3575,6 +3000,1440 @@
     <w:p>
       <w:r>
         <w:t>A inteligência artificial continuará sendo utilizada como ferramenta de apoio ao planejamento, à organização das ideias, à revisão da documentação e à compreensão dos conceitos técnicos. As decisões de design, a validação das informações e a implementação deverão permanecer sob responsabilidade do autor, garantindo a compreensão do trabalho desenvolvido e sua adequação aos objetivos acadêmicos.</w:t>
+      </w:r>
+      <w:r>
+        <w:br/>
+      </w:r>
+      <w:r>
+        <w:br/>
+      </w:r>
+      <w:r>
+        <w:br/>
+      </w:r>
+      <w:r>
+        <w:rPr>
+          <w:b/>
+          <w:bCs/>
+        </w:rPr>
+        <w:t>24. Conclusão da prototipação da página Quiz</w:t>
+      </w:r>
+    </w:p>
+    <w:p>
+      <w:r>
+        <w:rPr>
+          <w:b/>
+          <w:bCs/>
+        </w:rPr>
+        <w:t>Prompt enviado</w:t>
+      </w:r>
+    </w:p>
+    <w:p>
+      <w:r>
+        <w:t>Informei que concluí a prototipação da página Quiz do Alma da Fiel no Figma e solicitei a atualização do Diário de Prompts antes de iniciar o planejamento visual da próxima página do projeto.</w:t>
+      </w:r>
+    </w:p>
+    <w:p>
+      <w:r>
+        <w:t>A página Quiz foi planejada para proporcionar uma experiência interativa relacionada à história do Sport Club Corinthians Paulista, complementando o conteúdo apresentado na página História. A proposta definida no escopo prevê sete perguntas de múltipla escolha, com exibição da pontuação e da quantidade de respostas corretas ao final.</w:t>
+      </w:r>
+    </w:p>
+    <w:p>
+      <w:r>
+        <w:t>Também foi considerada a necessidade de planejar visualmente os diferentes estados da interação, incluindo a apresentação inicial do desafio, a exibição das perguntas, a seleção das alternativas, o avanço entre as questões e a apresentação do resultado final.</w:t>
+      </w:r>
+    </w:p>
+    <w:p>
+      <w:r>
+        <w:rPr>
+          <w:b/>
+          <w:bCs/>
+        </w:rPr>
+        <w:t>Resposta da IA</w:t>
+      </w:r>
+    </w:p>
+    <w:p>
+      <w:r>
+        <w:t>A IA orientou a organização da experiência do quiz em três telas principais:</w:t>
+      </w:r>
+    </w:p>
+    <w:p>
+      <w:pPr>
+        <w:numPr>
+          <w:ilvl w:val="0"/>
+          <w:numId w:val="34"/>
+        </w:numPr>
+      </w:pPr>
+      <w:r>
+        <w:rPr>
+          <w:b/>
+          <w:bCs/>
+        </w:rPr>
+        <w:t>Tela inicial:</w:t>
+      </w:r>
+      <w:r>
+        <w:t xml:space="preserve"> apresentação do desafio, introdução breve, indicação da quantidade de perguntas e botão para iniciar.</w:t>
+      </w:r>
+    </w:p>
+    <w:p>
+      <w:pPr>
+        <w:numPr>
+          <w:ilvl w:val="0"/>
+          <w:numId w:val="34"/>
+        </w:numPr>
+      </w:pPr>
+      <w:r>
+        <w:rPr>
+          <w:b/>
+          <w:bCs/>
+        </w:rPr>
+        <w:t>Tela das perguntas:</w:t>
+      </w:r>
+      <w:r>
+        <w:t xml:space="preserve"> exibição da pergunta atual, alternativas de resposta, indicador de progresso, feedback após a seleção e botão para avançar.</w:t>
+      </w:r>
+    </w:p>
+    <w:p>
+      <w:pPr>
+        <w:numPr>
+          <w:ilvl w:val="0"/>
+          <w:numId w:val="34"/>
+        </w:numPr>
+      </w:pPr>
+      <w:r>
+        <w:rPr>
+          <w:b/>
+          <w:bCs/>
+        </w:rPr>
+        <w:t>Tela de resultado:</w:t>
+      </w:r>
+      <w:r>
+        <w:t xml:space="preserve"> apresentação da pontuação final, quantidade de acertos, mensagem relacionada ao desempenho e opções para jogar novamente ou retornar à página História.</w:t>
+      </w:r>
+    </w:p>
+    <w:p>
+      <w:r>
+        <w:t xml:space="preserve">A IA também explicou como a funcionalidade poderá ser implementada futuramente utilizando JavaScript. A proposta consiste em armazenar as </w:t>
+      </w:r>
+      <w:r>
+        <w:lastRenderedPageBreak/>
+        <w:t>perguntas em uma estrutura de dados, controlar a questão atual por meio de uma variável e atualizar dinamicamente o conteúdo do card conforme o usuário avança.</w:t>
+      </w:r>
+    </w:p>
+    <w:p>
+      <w:r>
+        <w:t>Foi esclarecido que não será necessário criar sete páginas HTML ou sete cards independentes para as perguntas. A implementação poderá reutilizar a mesma estrutura visual, alterando os textos, as alternativas e os indicadores de progresso por meio do JavaScript.</w:t>
+      </w:r>
+    </w:p>
+    <w:p>
+      <w:r>
+        <w:rPr>
+          <w:b/>
+          <w:bCs/>
+        </w:rPr>
+        <w:t>Decisão tomada</w:t>
+      </w:r>
+    </w:p>
+    <w:p>
+      <w:r>
+        <w:t>Decidi concluir a prototipação da página Quiz no Figma, mantendo a identidade visual cinematográfica do Alma da Fiel, com predominância de preto, branco e cinza e utilização de vermelho nos elementos de destaque.</w:t>
+      </w:r>
+    </w:p>
+    <w:p>
+      <w:r>
+        <w:t>A proposta definida é apresentar o quiz como uma experiência complementar ao conteúdo histórico do site, permitindo que os visitantes testem seus conhecimentos sobre o Corinthians por meio de sete perguntas de múltipla escolha.</w:t>
+      </w:r>
+    </w:p>
+    <w:p>
+      <w:r>
+        <w:t>Na futura implementação, pretendo utilizar JavaScript para controlar a navegação entre as questões, registrar as respostas durante a partida, calcular a pontuação e apresentar o resultado final. A implementação deverá ser realizada gradualmente, com explicações e testes para garantir a compreensão do funcionamento do código.</w:t>
+      </w:r>
+    </w:p>
+    <w:p>
+      <w:r>
+        <w:t>Com a conclusão dessa etapa, decidi avançar para a prototipação da página Gaviões da Fiel, mantendo a organização multipágina e a consistência visual estabelecidas para o projeto.</w:t>
+      </w:r>
+    </w:p>
+    <w:p>
+      <w:r>
+        <w:rPr>
+          <w:rFonts w:ascii="MS Gothic" w:eastAsia="MS Gothic" w:hAnsi="MS Gothic" w:cs="MS Gothic" w:hint="eastAsia"/>
+        </w:rPr>
+        <w:t>━━━━━━━━━━━━━━━━━━━━━━━━━━━━</w:t>
+      </w:r>
+    </w:p>
+    <w:p>
+      <w:r>
+        <w:rPr>
+          <w:b/>
+          <w:bCs/>
+        </w:rPr>
+        <w:t>SITUAÇÃO ATUAL DO PROJETO — ATUALIZAÇÃO</w:t>
+      </w:r>
+    </w:p>
+    <w:p>
+      <w:r>
+        <w:t>Até o momento, o Alma da Fiel possui:</w:t>
+      </w:r>
+    </w:p>
+    <w:p>
+      <w:r>
+        <w:t>• Nome e slogan definidos: Alma da Fiel — “Uma história que vive em cada torcedor”.</w:t>
+      </w:r>
+    </w:p>
+    <w:p>
+      <w:r>
+        <w:t>• Tema, proposta geral e identidade visual estabelecidos, com predominância de preto, branco e cinza, além de detalhes em vermelho.</w:t>
+      </w:r>
+    </w:p>
+    <w:p>
+      <w:r>
+        <w:t>• Seleção inicial de dez acontecimentos históricos do Corinthians, sujeita à validação em fontes confiáveis.</w:t>
+      </w:r>
+    </w:p>
+    <w:p>
+      <w:r>
+        <w:t>• Estrutura preliminar das páginas e funcionalidades definida.</w:t>
+      </w:r>
+    </w:p>
+    <w:p>
+      <w:r>
+        <w:t>• Tecnologias previstas: HTML, CSS, JavaScript e API WebDataVis.</w:t>
+      </w:r>
+    </w:p>
+    <w:p>
+      <w:r>
+        <w:lastRenderedPageBreak/>
+        <w:t>• README e descrição do repositório planejados.</w:t>
+      </w:r>
+    </w:p>
+    <w:p>
+      <w:r>
+        <w:t>• Primeiras versões do Contexto, Objetivo e Justificativa elaboradas.</w:t>
+      </w:r>
+    </w:p>
+    <w:p>
+      <w:r>
+        <w:t>• Escopo, Premissas e Restrições organizados.</w:t>
+      </w:r>
+    </w:p>
+    <w:p>
+      <w:r>
+        <w:t>• Metodologia de desenvolvimento definida, começando pela prototipação no Figma.</w:t>
+      </w:r>
+    </w:p>
+    <w:p>
+      <w:r>
+        <w:t>• Cabeçalho do site prototipado no Figma.</w:t>
+      </w:r>
+    </w:p>
+    <w:p>
+      <w:r>
+        <w:t>• Home Page prototipada no Figma.</w:t>
+      </w:r>
+    </w:p>
+    <w:p>
+      <w:r>
+        <w:t>• Página História concluída no Figma.</w:t>
+      </w:r>
+    </w:p>
+    <w:p>
+      <w:r>
+        <w:t>• Página Quiz concluída no Figma, contemplando o planejamento visual da experiência de perguntas e respostas e do resultado final.</w:t>
+      </w:r>
+    </w:p>
+    <w:p>
+      <w:r>
+        <w:t>• Arquitetura de implementação definida preliminarmente como um site multipágina, com arquivos HTML separados e recursos compartilhados quando apropriado.</w:t>
+      </w:r>
+    </w:p>
+    <w:p>
+      <w:r>
+        <w:t>A prototipação visual continua em andamento. A implementação em HTML, CSS e JavaScript ainda deverá ser desenvolvida, assim como a integração com a API WebDataVis, conforme a viabilidade técnica e os recursos disponíveis.</w:t>
+      </w:r>
+    </w:p>
+    <w:p>
+      <w:r>
+        <w:rPr>
+          <w:rFonts w:ascii="MS Gothic" w:eastAsia="MS Gothic" w:hAnsi="MS Gothic" w:cs="MS Gothic" w:hint="eastAsia"/>
+        </w:rPr>
+        <w:t>━━━━━━━━━━━━━━━━━━━━━━━━━━━━</w:t>
+      </w:r>
+    </w:p>
+    <w:p>
+      <w:r>
+        <w:rPr>
+          <w:b/>
+          <w:bCs/>
+        </w:rPr>
+        <w:t>PRÓXIMAS ETAPAS — ATUALIZAÇÃO</w:t>
+      </w:r>
+    </w:p>
+    <w:p>
+      <w:pPr>
+        <w:numPr>
+          <w:ilvl w:val="0"/>
+          <w:numId w:val="35"/>
+        </w:numPr>
+      </w:pPr>
+      <w:r>
+        <w:t>Iniciar a prototipação da página Gaviões da Fiel, apresentando a história, a trajetória e a importância cultural da torcida organizada para o Corinthians.</w:t>
+      </w:r>
+    </w:p>
+    <w:p>
+      <w:pPr>
+        <w:numPr>
+          <w:ilvl w:val="0"/>
+          <w:numId w:val="35"/>
+        </w:numPr>
+      </w:pPr>
+      <w:r>
+        <w:t>Desenvolver a página Ídolos, com destaque para Sócrates e Cássio, apresentando suas trajetórias e contribuições para o clube.</w:t>
+      </w:r>
+    </w:p>
+    <w:p>
+      <w:pPr>
+        <w:numPr>
+          <w:ilvl w:val="0"/>
+          <w:numId w:val="35"/>
+        </w:numPr>
+      </w:pPr>
+      <w:r>
+        <w:t>Revisar e finalizar a página Sobre, verificando a organização das seções e a coerência visual.</w:t>
+      </w:r>
+    </w:p>
+    <w:p>
+      <w:pPr>
+        <w:numPr>
+          <w:ilvl w:val="0"/>
+          <w:numId w:val="35"/>
+        </w:numPr>
+      </w:pPr>
+      <w:r>
+        <w:t>Criar os protótipos de Cadastro, Login e Dashboard, considerando os limites técnicos e o escopo da primeira versão.</w:t>
+      </w:r>
+    </w:p>
+    <w:p>
+      <w:pPr>
+        <w:numPr>
+          <w:ilvl w:val="0"/>
+          <w:numId w:val="35"/>
+        </w:numPr>
+      </w:pPr>
+      <w:r>
+        <w:t>Revisar a navegação entre as páginas e manter a consistência da identidade visual.</w:t>
+      </w:r>
+    </w:p>
+    <w:p>
+      <w:pPr>
+        <w:numPr>
+          <w:ilvl w:val="0"/>
+          <w:numId w:val="35"/>
+        </w:numPr>
+      </w:pPr>
+      <w:r>
+        <w:t>Validar as informações históricas e selecionar fontes confiáveis para os conteúdos que serão publicados.</w:t>
+      </w:r>
+    </w:p>
+    <w:p>
+      <w:pPr>
+        <w:numPr>
+          <w:ilvl w:val="0"/>
+          <w:numId w:val="35"/>
+        </w:numPr>
+      </w:pPr>
+      <w:r>
+        <w:t>Consultar a documentação da API WebDataVis para identificar os recursos disponíveis para cadastro, autenticação e armazenamento de resultados.</w:t>
+      </w:r>
+    </w:p>
+    <w:p>
+      <w:pPr>
+        <w:numPr>
+          <w:ilvl w:val="0"/>
+          <w:numId w:val="35"/>
+        </w:numPr>
+      </w:pPr>
+      <w:r>
+        <w:lastRenderedPageBreak/>
+        <w:t>Após concluir os protótipos necessários, iniciar a implementação em HTML, CSS e JavaScript, utilizando arquivos HTML separados e recursos compartilhados quando apropriado.</w:t>
+      </w:r>
+    </w:p>
+    <w:p>
+      <w:pPr>
+        <w:numPr>
+          <w:ilvl w:val="0"/>
+          <w:numId w:val="35"/>
+        </w:numPr>
+      </w:pPr>
+      <w:r>
+        <w:t>Implementar e testar as funcionalidades gradualmente, incluindo a navegação do quiz, o registro das respostas durante a partida, o cálculo da pontuação e a exibição do resultado.</w:t>
+      </w:r>
+    </w:p>
+    <w:p>
+      <w:pPr>
+        <w:numPr>
+          <w:ilvl w:val="0"/>
+          <w:numId w:val="35"/>
+        </w:numPr>
+      </w:pPr>
+      <w:r>
+        <w:t>Planejar e acompanhar o cronograma semanal até o prazo de 30/11/2026, mantendo o GitHub atualizado e considerando as orientações dos professores.</w:t>
+      </w:r>
+    </w:p>
+    <w:p>
+      <w:r>
+        <w:rPr>
+          <w:rFonts w:ascii="MS Gothic" w:eastAsia="MS Gothic" w:hAnsi="MS Gothic" w:cs="MS Gothic" w:hint="eastAsia"/>
+        </w:rPr>
+        <w:t>━━━━━━━━━━━━━━━━━━━━━━━━━━━━</w:t>
+      </w:r>
+    </w:p>
+    <w:p>
+      <w:r>
+        <w:rPr>
+          <w:b/>
+          <w:bCs/>
+        </w:rPr>
+        <w:t>CONSIDERAÇÕES FINAIS — ATUALIZAÇÃO</w:t>
+      </w:r>
+    </w:p>
+    <w:p>
+      <w:r>
+        <w:t>O desenvolvimento do Alma da Fiel avançou com a conclusão da prototipação da página Quiz no Figma. Essa etapa representa um avanço importante na transformação da proposta do projeto em uma experiência visual organizada e interativa.</w:t>
+      </w:r>
+    </w:p>
+    <w:p>
+      <w:r>
+        <w:t>O quiz complementará a página História, permitindo que os visitantes testem seus conhecimentos sobre acontecimentos, conquistas e curiosidades do Corinthians. Sua proposta contempla sete perguntas de múltipla escolha, com apresentação da pontuação e da quantidade de respostas corretas ao final.</w:t>
+      </w:r>
+    </w:p>
+    <w:p>
+      <w:r>
+        <w:t>O planejamento também considerou a futura implementação da funcionalidade por meio de JavaScript, com reutilização da estrutura visual das perguntas e atualização dinâmica de seu conteúdo. Essa abordagem busca evitar a repetição desnecessária de elementos e favorecer a organização do código.</w:t>
+      </w:r>
+    </w:p>
+    <w:p>
+      <w:r>
+        <w:t>A próxima etapa será a prototipação da página Gaviões da Fiel, destinada a apresentar a história e a importância cultural da torcida organizada, ampliando o conteúdo histórico e cultural do Alma da Fiel.</w:t>
+      </w:r>
+    </w:p>
+    <w:p>
+      <w:r>
+        <w:t>A inteligência artificial continuará sendo utilizada como ferramenta de apoio ao planejamento, à organização das ideias, à revisão da documentação e à compreensão dos conceitos técnicos. As decisões de design, a validação das informações e a implementação permanecerão sob responsabilidade do autor, garantindo a compreensão do trabalho desenvolvido e sua adequação aos objetivos acadêmicos.</w:t>
+      </w:r>
+    </w:p>
+    <w:p/>
+    <w:p>
+      <w:r>
+        <w:rPr>
+          <w:rFonts w:ascii="MS Gothic" w:eastAsia="MS Gothic" w:hAnsi="MS Gothic" w:cs="MS Gothic" w:hint="eastAsia"/>
+        </w:rPr>
+        <w:t>━━━━━━━━━━━━━━━━━━━━━━━━━━━━</w:t>
+      </w:r>
+      <w:r>
+        <w:br/>
+      </w:r>
+      <w:r>
+        <w:rPr>
+          <w:b/>
+          <w:bCs/>
+        </w:rPr>
+        <w:t>25. Conclusão da prototipação da página Gaviões da Fiel</w:t>
+      </w:r>
+    </w:p>
+    <w:p>
+      <w:r>
+        <w:rPr>
+          <w:b/>
+          <w:bCs/>
+        </w:rPr>
+        <w:lastRenderedPageBreak/>
+        <w:t>Prompt enviado</w:t>
+      </w:r>
+    </w:p>
+    <w:p>
+      <w:r>
+        <w:t>Informei que concluí a prototipação da página Gaviões da Fiel no Figma e solicitei orientação para registrar essa etapa no Diário de Prompts antes de avançar para as próximas páginas do Alma da Fiel.</w:t>
+      </w:r>
+    </w:p>
+    <w:p>
+      <w:r>
+        <w:t>A página foi planejada para apresentar a história, a trajetória e a importância cultural da torcida organizada Gaviões da Fiel, destacando sua relação com o Sport Club Corinthians Paulista e sua contribuição para a identidade corinthiana.</w:t>
+      </w:r>
+    </w:p>
+    <w:p>
+      <w:r>
+        <w:t>Também considerei a necessidade de manter a identidade visual cinematográfica do projeto, utilizando predominantemente preto, branco e cinza, com detalhes em vermelho, fotografias de impacto e uma organização visual que favoreça a compreensão do conteúdo histórico.</w:t>
+      </w:r>
+    </w:p>
+    <w:p>
+      <w:r>
+        <w:rPr>
+          <w:b/>
+          <w:bCs/>
+        </w:rPr>
+        <w:t>Resposta da IA</w:t>
+      </w:r>
+    </w:p>
+    <w:p>
+      <w:r>
+        <w:t>A IA recomendou estruturar a página como uma narrativa visual, permitindo que o visitante conheça diferentes aspectos da história e da atuação dos Gaviões da Fiel.</w:t>
+      </w:r>
+    </w:p>
+    <w:p>
+      <w:r>
+        <w:t>A organização proposta contemplou cinco seções principais:</w:t>
+      </w:r>
+    </w:p>
+    <w:p>
+      <w:pPr>
+        <w:numPr>
+          <w:ilvl w:val="0"/>
+          <w:numId w:val="36"/>
+        </w:numPr>
+      </w:pPr>
+      <w:r>
+        <w:rPr>
+          <w:b/>
+          <w:bCs/>
+        </w:rPr>
+        <w:t>Hero — A força da Fiel:</w:t>
+      </w:r>
+      <w:r>
+        <w:t xml:space="preserve"> abertura visual com uma fotografia de destaque, título marcante e breve introdução à importância da torcida.</w:t>
+      </w:r>
+    </w:p>
+    <w:p>
+      <w:pPr>
+        <w:numPr>
+          <w:ilvl w:val="0"/>
+          <w:numId w:val="36"/>
+        </w:numPr>
+      </w:pPr>
+      <w:r>
+        <w:rPr>
+          <w:b/>
+          <w:bCs/>
+        </w:rPr>
+        <w:t>Origem e história:</w:t>
+      </w:r>
+      <w:r>
+        <w:t xml:space="preserve"> apresentação da fundação da Gaviões da Fiel, em 1969, e do contexto histórico de seu surgimento.</w:t>
+      </w:r>
+    </w:p>
+    <w:p>
+      <w:pPr>
+        <w:numPr>
+          <w:ilvl w:val="0"/>
+          <w:numId w:val="36"/>
+        </w:numPr>
+      </w:pPr>
+      <w:r>
+        <w:rPr>
+          <w:b/>
+          <w:bCs/>
+        </w:rPr>
+        <w:t>Identidade e arquibancada:</w:t>
+      </w:r>
+      <w:r>
+        <w:t xml:space="preserve"> valorização dos símbolos, das bandeiras, dos cantos e de outros elementos que representam a cultura da torcida.</w:t>
+      </w:r>
+    </w:p>
+    <w:p>
+      <w:pPr>
+        <w:numPr>
+          <w:ilvl w:val="0"/>
+          <w:numId w:val="36"/>
+        </w:numPr>
+      </w:pPr>
+      <w:r>
+        <w:rPr>
+          <w:b/>
+          <w:bCs/>
+        </w:rPr>
+        <w:t>Além do futebol:</w:t>
+      </w:r>
+      <w:r>
+        <w:t xml:space="preserve"> apresentação da atuação da organização em outros contextos culturais e sociais, incluindo sua relação com o Carnaval paulistano.</w:t>
+      </w:r>
+    </w:p>
+    <w:p>
+      <w:pPr>
+        <w:numPr>
+          <w:ilvl w:val="0"/>
+          <w:numId w:val="36"/>
+        </w:numPr>
+      </w:pPr>
+      <w:r>
+        <w:rPr>
+          <w:b/>
+          <w:bCs/>
+        </w:rPr>
+        <w:t>Encerramento — O significado de ser Fiel:</w:t>
+      </w:r>
+      <w:r>
+        <w:t xml:space="preserve"> conclusão com uma mensagem relacionada à identidade corinthiana e links para outras páginas do site.</w:t>
+      </w:r>
+    </w:p>
+    <w:p>
+      <w:r>
+        <w:t>A IA também recomendou utilizar fotografias com tratamento documental, títulos de destaque, textos objetivos e alternância entre imagens e blocos de conteúdo. Essas escolhas foram propostas para preservar a identidade visual do Alma da Fiel sem transformar a página em uma sequência de imagens sem contexto.</w:t>
+      </w:r>
+    </w:p>
+    <w:p>
+      <w:r>
+        <w:t>Além disso, foi ressaltada a importância de verificar as informações históricas em fontes confiáveis e identificar os créditos das fotografias utilizadas.</w:t>
+      </w:r>
+    </w:p>
+    <w:p>
+      <w:r>
+        <w:rPr>
+          <w:b/>
+          <w:bCs/>
+        </w:rPr>
+        <w:lastRenderedPageBreak/>
+        <w:t>Decisão tomada</w:t>
+      </w:r>
+    </w:p>
+    <w:p>
+      <w:r>
+        <w:t>Decidi concluir a prototipação da página Gaviões da Fiel no Figma, mantendo a identidade visual estabelecida para o Alma da Fiel e ampliando o conteúdo histórico e cultural do projeto.</w:t>
+      </w:r>
+    </w:p>
+    <w:p>
+      <w:r>
+        <w:t>A página foi planejada para apresentar a trajetória da torcida organizada, sua identidade e sua relação com o Corinthians, complementando as informações disponíveis nas páginas História e Ídolos.</w:t>
+      </w:r>
+    </w:p>
+    <w:p>
+      <w:r>
+        <w:t>Com a conclusão dessa etapa, decidi avançar para a prototipação das telas de Cadastro e Login, necessárias para representar visualmente o acesso dos usuários às funcionalidades planejadas para o site.</w:t>
+      </w:r>
+    </w:p>
+    <w:p>
+      <w:r>
+        <w:rPr>
+          <w:rFonts w:ascii="MS Gothic" w:eastAsia="MS Gothic" w:hAnsi="MS Gothic" w:cs="MS Gothic" w:hint="eastAsia"/>
+        </w:rPr>
+        <w:t>━━━━━━━━━━━━━━━━━━━━━━━━━━━━</w:t>
+      </w:r>
+      <w:r>
+        <w:br/>
+      </w:r>
+      <w:r>
+        <w:rPr>
+          <w:b/>
+          <w:bCs/>
+        </w:rPr>
+        <w:t>SITUAÇÃO ATUAL DO PROJETO — ATUALIZAÇÃO</w:t>
+      </w:r>
+    </w:p>
+    <w:p>
+      <w:r>
+        <w:t>Até o momento, o Alma da Fiel possui:</w:t>
+      </w:r>
+    </w:p>
+    <w:p>
+      <w:r>
+        <w:t>• Nome e slogan definidos: Alma da Fiel — “Uma história que vive em cada torcedor”.</w:t>
+      </w:r>
+    </w:p>
+    <w:p>
+      <w:r>
+        <w:t>• Tema, proposta geral e identidade visual estabelecidos, com predominância de preto, branco e cinza, além de detalhes em vermelho.</w:t>
+      </w:r>
+    </w:p>
+    <w:p>
+      <w:r>
+        <w:t>• Seleção inicial de dez acontecimentos históricos do Corinthians, ainda sujeita à validação em fontes confiáveis.</w:t>
+      </w:r>
+    </w:p>
+    <w:p>
+      <w:r>
+        <w:t>• Estrutura preliminar das páginas e funcionalidades definida.</w:t>
+      </w:r>
+    </w:p>
+    <w:p>
+      <w:r>
+        <w:t>• Tecnologias previstas: HTML, CSS, JavaScript e API WebDataVis.</w:t>
+      </w:r>
+    </w:p>
+    <w:p>
+      <w:r>
+        <w:t>• README e descrição do repositório planejados.</w:t>
+      </w:r>
+    </w:p>
+    <w:p>
+      <w:r>
+        <w:t>• Primeiras versões do Contexto, Objetivo e Justificativa elaboradas.</w:t>
+      </w:r>
+    </w:p>
+    <w:p>
+      <w:r>
+        <w:t>• Escopo, Premissas e Restrições organizados.</w:t>
+      </w:r>
+    </w:p>
+    <w:p>
+      <w:r>
+        <w:t>• Metodologia de desenvolvimento definida, começando pela prototipação no Figma.</w:t>
+      </w:r>
+    </w:p>
+    <w:p>
+      <w:r>
+        <w:t>• Cabeçalho do site prototipado no Figma.</w:t>
+      </w:r>
+    </w:p>
+    <w:p>
+      <w:r>
+        <w:t>• Home Page concluída no Figma.</w:t>
+      </w:r>
+    </w:p>
+    <w:p>
+      <w:r>
+        <w:t>• Página História concluída no Figma, com uma proposta visual voltada à apresentação da trajetória do Corinthians.</w:t>
+      </w:r>
+    </w:p>
+    <w:p>
+      <w:r>
+        <w:t>• Página Quiz concluída no Figma, contemplando a experiência de perguntas e respostas, o progresso entre as questões e a apresentação do resultado final.</w:t>
+      </w:r>
+    </w:p>
+    <w:p>
+      <w:r>
+        <w:lastRenderedPageBreak/>
+        <w:t>• Página Gaviões da Fiel concluída no Figma, com foco na história, na identidade e na importância cultural da torcida organizada.</w:t>
+      </w:r>
+    </w:p>
+    <w:p>
+      <w:r>
+        <w:t>• Arquitetura de implementação definida preliminarmente como um site multipágina, com arquivos HTML separados e recursos compartilhados quando apropriado.</w:t>
+      </w:r>
+    </w:p>
+    <w:p>
+      <w:r>
+        <w:t>A prototipação visual continua em andamento. A implementação em HTML, CSS e JavaScript ainda deverá ser desenvolvida, assim como a integração com a API WebDataVis, conforme a viabilidade técnica e os recursos disponíveis.</w:t>
+      </w:r>
+    </w:p>
+    <w:p>
+      <w:r>
+        <w:rPr>
+          <w:rFonts w:ascii="MS Gothic" w:eastAsia="MS Gothic" w:hAnsi="MS Gothic" w:cs="MS Gothic" w:hint="eastAsia"/>
+        </w:rPr>
+        <w:t>━━━━━━━━━━━━━━━━━━━━━━━━━━━━</w:t>
+      </w:r>
+      <w:r>
+        <w:br/>
+      </w:r>
+      <w:r>
+        <w:rPr>
+          <w:b/>
+          <w:bCs/>
+        </w:rPr>
+        <w:t>PRÓXIMAS ETAPAS — ATUALIZAÇÃO</w:t>
+      </w:r>
+    </w:p>
+    <w:p>
+      <w:pPr>
+        <w:numPr>
+          <w:ilvl w:val="0"/>
+          <w:numId w:val="37"/>
+        </w:numPr>
+      </w:pPr>
+      <w:r>
+        <w:t>Iniciar a prototipação da tela de Cadastro no Figma, definindo os campos necessários, a organização do formulário e as orientações apresentadas ao usuário.</w:t>
+      </w:r>
+    </w:p>
+    <w:p>
+      <w:pPr>
+        <w:numPr>
+          <w:ilvl w:val="0"/>
+          <w:numId w:val="37"/>
+        </w:numPr>
+      </w:pPr>
+      <w:r>
+        <w:t>Desenvolver a tela de Login, mantendo a identidade visual do Alma da Fiel e estabelecendo uma navegação coerente entre as telas de acesso e registro.</w:t>
+      </w:r>
+    </w:p>
+    <w:p>
+      <w:pPr>
+        <w:numPr>
+          <w:ilvl w:val="0"/>
+          <w:numId w:val="37"/>
+        </w:numPr>
+      </w:pPr>
+      <w:r>
+        <w:t>Planejar a interação entre Cadastro e Login, incluindo links para alternar entre as duas telas e mensagens visuais para orientar o usuário.</w:t>
+      </w:r>
+    </w:p>
+    <w:p>
+      <w:pPr>
+        <w:numPr>
+          <w:ilvl w:val="0"/>
+          <w:numId w:val="37"/>
+        </w:numPr>
+      </w:pPr>
+      <w:r>
+        <w:t>Desenvolver a página Ídolos, com destaque para Sócrates e Cássio, apresentando suas trajetórias e contribuições para o Corinthians.</w:t>
+      </w:r>
+    </w:p>
+    <w:p>
+      <w:pPr>
+        <w:numPr>
+          <w:ilvl w:val="0"/>
+          <w:numId w:val="37"/>
+        </w:numPr>
+      </w:pPr>
+      <w:r>
+        <w:t>Revisar e finalizar a página Sobre, verificando a organização das seções e a coerência visual.</w:t>
+      </w:r>
+    </w:p>
+    <w:p>
+      <w:pPr>
+        <w:numPr>
+          <w:ilvl w:val="0"/>
+          <w:numId w:val="37"/>
+        </w:numPr>
+      </w:pPr>
+      <w:r>
+        <w:t>Criar o protótipo do Dashboard, considerando os limites técnicos e as funcionalidades previstas no escopo da primeira versão.</w:t>
+      </w:r>
+    </w:p>
+    <w:p>
+      <w:pPr>
+        <w:numPr>
+          <w:ilvl w:val="0"/>
+          <w:numId w:val="37"/>
+        </w:numPr>
+      </w:pPr>
+      <w:r>
+        <w:t>Revisar a navegação entre todas as páginas, mantendo a consistência da identidade visual e dos elementos compartilhados.</w:t>
+      </w:r>
+    </w:p>
+    <w:p>
+      <w:pPr>
+        <w:numPr>
+          <w:ilvl w:val="0"/>
+          <w:numId w:val="37"/>
+        </w:numPr>
+      </w:pPr>
+      <w:r>
+        <w:t>Validar as informações históricas e selecionar fontes confiáveis para os conteúdos publicados, incluindo os materiais sobre a Gaviões da Fiel.</w:t>
+      </w:r>
+    </w:p>
+    <w:p>
+      <w:pPr>
+        <w:numPr>
+          <w:ilvl w:val="0"/>
+          <w:numId w:val="37"/>
+        </w:numPr>
+      </w:pPr>
+      <w:r>
+        <w:t>Consultar a documentação da API WebDataVis para verificar os recursos disponíveis para cadastro, autenticação e armazenamento dos resultados do quiz.</w:t>
+      </w:r>
+    </w:p>
+    <w:p>
+      <w:pPr>
+        <w:numPr>
+          <w:ilvl w:val="0"/>
+          <w:numId w:val="37"/>
+        </w:numPr>
+      </w:pPr>
+      <w:r>
+        <w:t>Após concluir os protótipos necessários, iniciar a implementação em HTML, CSS e JavaScript, utilizando arquivos HTML separados e recursos compartilhados quando apropriado.</w:t>
+      </w:r>
+    </w:p>
+    <w:p>
+      <w:pPr>
+        <w:numPr>
+          <w:ilvl w:val="0"/>
+          <w:numId w:val="37"/>
+        </w:numPr>
+      </w:pPr>
+      <w:r>
+        <w:lastRenderedPageBreak/>
+        <w:t>Implementar e testar as funcionalidades gradualmente, incluindo a navegação entre as perguntas do quiz, o cálculo da pontuação e a apresentação do resultado final.</w:t>
+      </w:r>
+    </w:p>
+    <w:p>
+      <w:pPr>
+        <w:numPr>
+          <w:ilvl w:val="0"/>
+          <w:numId w:val="37"/>
+        </w:numPr>
+      </w:pPr>
+      <w:r>
+        <w:t>Planejar e acompanhar o cronograma semanal até o prazo de 30/11/2026, mantendo o GitHub atualizado e considerando as orientações dos professores.</w:t>
+      </w:r>
+    </w:p>
+    <w:p>
+      <w:r>
+        <w:rPr>
+          <w:rFonts w:ascii="MS Gothic" w:eastAsia="MS Gothic" w:hAnsi="MS Gothic" w:cs="MS Gothic" w:hint="eastAsia"/>
+        </w:rPr>
+        <w:t>━━━━━━━━━━━━━━━━━━━━━━━━━━━━</w:t>
+      </w:r>
+      <w:r>
+        <w:br/>
+      </w:r>
+      <w:r>
+        <w:rPr>
+          <w:b/>
+          <w:bCs/>
+        </w:rPr>
+        <w:t>CONSIDERAÇÕES FINAIS — ATUALIZAÇÃO</w:t>
+      </w:r>
+    </w:p>
+    <w:p>
+      <w:r>
+        <w:t>O desenvolvimento do Alma da Fiel avançou com a conclusão da prototipação da página Gaviões da Fiel no Figma. Essa etapa amplia a proposta histórica e cultural do projeto, apresentando não apenas a trajetória do Corinthians, mas também aspectos importantes da identidade de sua torcida.</w:t>
+      </w:r>
+    </w:p>
+    <w:p>
+      <w:r>
+        <w:t>A organização visual da página foi planejada para combinar fotografias, textos históricos e seções temáticas, mantendo a linguagem cinematográfica definida para o site. Dessa forma, a página Gaviões da Fiel complementará o conteúdo da História e a futura página Ídolos, contribuindo para uma experiência mais completa para os visitantes.</w:t>
+      </w:r>
+    </w:p>
+    <w:p>
+      <w:r>
+        <w:t>Com essa etapa concluída, o desenvolvimento seguirá para as telas de Cadastro e Login. O planejamento dessas interfaces deverá considerar a facilidade de navegação, a clareza dos campos e a consistência visual com as demais páginas.</w:t>
+      </w:r>
+    </w:p>
+    <w:p>
+      <w:r>
+        <w:t>A implementação dessas funcionalidades dependerá da definição dos requisitos e da verificação dos recursos efetivamente disponíveis na API WebDataVis. A criação de protótipos visuais não significa que os mecanismos de autenticação e armazenamento já estejam implementados.</w:t>
+      </w:r>
+    </w:p>
+    <w:p>
+      <w:r>
+        <w:t>A inteligência artificial continuará sendo utilizada como ferramenta de apoio ao planejamento, à organização das ideias, à revisão da documentação e à compreensão dos conceitos técnicos. As decisões de design, a validação das informações e a implementação permanecerão sob responsabilidade do autor, garantindo a compreensão do trabalho desenvolvido e sua adequação aos objetivos acadêmicos.</w:t>
+      </w:r>
+    </w:p>
+    <w:p>
+      <w:r>
+        <w:t>O próximo objetivo é concluir gradualmente os protótipos restantes e, posteriormente, transformar as interfaces planejadas em um site funcional, organizado e coerente com a proposta do Alma da Fiel.</w:t>
+      </w:r>
+    </w:p>
+    <w:p/>
+    <w:p>
+      <w:r>
+        <w:rPr>
+          <w:rFonts w:ascii="MS Gothic" w:eastAsia="MS Gothic" w:hAnsi="MS Gothic" w:cs="MS Gothic" w:hint="eastAsia"/>
+        </w:rPr>
+        <w:t>━━━━━━━━━━━━━━━━━━━━━━━━━━━━</w:t>
+      </w:r>
+      <w:r>
+        <w:br/>
+        <w:t>26. Conclus</w:t>
+      </w:r>
+      <w:r>
+        <w:rPr>
+          <w:rFonts w:ascii="Aptos" w:hAnsi="Aptos" w:cs="Aptos"/>
+        </w:rPr>
+        <w:t>ã</w:t>
+      </w:r>
+      <w:r>
+        <w:t>o da prototipa</w:t>
+      </w:r>
+      <w:r>
+        <w:rPr>
+          <w:rFonts w:ascii="Aptos" w:hAnsi="Aptos" w:cs="Aptos"/>
+        </w:rPr>
+        <w:t>çã</w:t>
+      </w:r>
+      <w:r>
+        <w:t>o da p</w:t>
+      </w:r>
+      <w:r>
+        <w:rPr>
+          <w:rFonts w:ascii="Aptos" w:hAnsi="Aptos" w:cs="Aptos"/>
+        </w:rPr>
+        <w:t>á</w:t>
+      </w:r>
+      <w:r>
+        <w:t xml:space="preserve">gina </w:t>
+      </w:r>
+      <w:r>
+        <w:rPr>
+          <w:rFonts w:ascii="Aptos" w:hAnsi="Aptos" w:cs="Aptos"/>
+        </w:rPr>
+        <w:t>Í</w:t>
+      </w:r>
+      <w:r>
+        <w:t>dolos</w:t>
+      </w:r>
+    </w:p>
+    <w:p>
+      <w:r>
+        <w:lastRenderedPageBreak/>
+        <w:t>Prompt enviado</w:t>
+      </w:r>
+    </w:p>
+    <w:p>
+      <w:r>
+        <w:t>Informei que concluí a prototipação da página Ídolos do Alma da Fiel no Figma e solicitei a atualização do Diário de Prompts antes de avançar para a etapa final da prototipação visual do site.</w:t>
+      </w:r>
+    </w:p>
+    <w:p>
+      <w:r>
+        <w:t>A página foi planejada para valorizar dois grandes nomes da história do Sport Club Corinthians Paulista: Sócrates e Cássio. A proposta consiste em apresentar suas trajetórias, contribuições e importância para o clube, destacando diferentes aspectos de seus legados no futebol e na memória da torcida corinthiana.</w:t>
+      </w:r>
+    </w:p>
+    <w:p>
+      <w:r>
+        <w:t>Também considerei a necessidade de manter a identidade visual cinematográfica do projeto, utilizando predominantemente preto, branco e cinza, com detalhes em vermelho, fotografias de destaque e uma organização visual coerente com as demais páginas já desenvolvidas.</w:t>
+      </w:r>
+    </w:p>
+    <w:p>
+      <w:r>
+        <w:t>Resposta da IA</w:t>
+      </w:r>
+    </w:p>
+    <w:p>
+      <w:r>
+        <w:t>A IA recomendou organizar a página como uma narrativa visual, apresentando os jogadores de maneira individual e conectando suas histórias à identidade do Corinthians.</w:t>
+      </w:r>
+    </w:p>
+    <w:p>
+      <w:r>
+        <w:t>A estrutura sugerida contemplou quatro seções principais:</w:t>
+      </w:r>
+    </w:p>
+    <w:p>
+      <w:pPr>
+        <w:numPr>
+          <w:ilvl w:val="0"/>
+          <w:numId w:val="38"/>
+        </w:numPr>
+      </w:pPr>
+      <w:r>
+        <w:t>Hero — Lendas que nunca serão esquecidas: abertura visual com uma fotografia de destaque e um título relacionado à importância dos ídolos na história do clube.</w:t>
+      </w:r>
+    </w:p>
+    <w:p>
+      <w:pPr>
+        <w:numPr>
+          <w:ilvl w:val="0"/>
+          <w:numId w:val="38"/>
+        </w:numPr>
+      </w:pPr>
+      <w:r>
+        <w:t>Sócrates — Muito além do futebol: apresentação de sua trajetória, liderança, conquistas e participação na Democracia Corinthiana.</w:t>
+      </w:r>
+    </w:p>
+    <w:p>
+      <w:pPr>
+        <w:numPr>
+          <w:ilvl w:val="0"/>
+          <w:numId w:val="38"/>
+        </w:numPr>
+      </w:pPr>
+      <w:r>
+        <w:t>Cássio — O gigante do Timão: apresentação de sua trajetória como goleiro, suas atuações marcantes e sua participação em conquistas importantes, como a Libertadores e o Mundial de Clubes de 2012.</w:t>
+      </w:r>
+    </w:p>
+    <w:p>
+      <w:pPr>
+        <w:numPr>
+          <w:ilvl w:val="0"/>
+          <w:numId w:val="38"/>
+        </w:numPr>
+      </w:pPr>
+      <w:r>
+        <w:t>Encerramento — O que transforma um jogador em ídolo?: reflexão sobre a relação entre jogadores, conquistas, identificação com a torcida e construção da memória corinthiana, com possibilidade de direcionar o visitante para outras páginas do site.</w:t>
+      </w:r>
+    </w:p>
+    <w:p>
+      <w:r>
+        <w:t>A IA também recomendou alternar fotografias e blocos de texto para evitar uma composição repetitiva, utilizar títulos marcantes e manter a consistência visual com as páginas História, Quiz e Gaviões da Fiel.</w:t>
+      </w:r>
+    </w:p>
+    <w:p>
+      <w:r>
+        <w:t>Além disso, foi ressaltada a importância de verificar as informações históricas em fontes confiáveis e utilizar fotografias com origem e créditos adequados.</w:t>
+      </w:r>
+    </w:p>
+    <w:p>
+      <w:r>
+        <w:t>Decisão tomada</w:t>
+      </w:r>
+    </w:p>
+    <w:p>
+      <w:r>
+        <w:lastRenderedPageBreak/>
+        <w:t>Decidi concluir a prototipação da página Ídolos no Figma, mantendo a identidade visual cinematográfica do Alma da Fiel e dando destaque a Sócrates e Cássio.</w:t>
+      </w:r>
+    </w:p>
+    <w:p>
+      <w:r>
+        <w:t>A página foi planejada para complementar o conteúdo histórico do projeto, apresentando jogadores que marcaram a trajetória do Corinthians e contribuíram para a construção de sua identidade esportiva e cultural.</w:t>
+      </w:r>
+    </w:p>
+    <w:p>
+      <w:r>
+        <w:t>Com a conclusão dessa etapa, decidi avançar para a finalização do footer, elemento que ainda falta para completar a prototipação visual do site.</w:t>
+      </w:r>
+    </w:p>
+    <w:p>
+      <w:r>
+        <w:t>A intenção é utilizar o footer para reunir informações complementares sobre o Alma da Fiel, facilitar o acesso às páginas principais e encerrar a navegação de maneira organizada, mantendo a identidade visual estabelecida no Figma.</w:t>
+      </w:r>
+    </w:p>
+    <w:p>
+      <w:r>
+        <w:rPr>
+          <w:rFonts w:ascii="MS Gothic" w:eastAsia="MS Gothic" w:hAnsi="MS Gothic" w:cs="MS Gothic" w:hint="eastAsia"/>
+        </w:rPr>
+        <w:t>━━━━━━━━━━━━━━━━━━━━━━━━━━━━</w:t>
+      </w:r>
+      <w:r>
+        <w:br/>
+        <w:t>SITUA</w:t>
+      </w:r>
+      <w:r>
+        <w:rPr>
+          <w:rFonts w:ascii="Aptos" w:hAnsi="Aptos" w:cs="Aptos"/>
+        </w:rPr>
+        <w:t>ÇÃ</w:t>
+      </w:r>
+      <w:r>
+        <w:t xml:space="preserve">O ATUAL DO PROJETO </w:t>
+      </w:r>
+      <w:r>
+        <w:rPr>
+          <w:rFonts w:ascii="Aptos" w:hAnsi="Aptos" w:cs="Aptos"/>
+        </w:rPr>
+        <w:t>—</w:t>
+      </w:r>
+      <w:r>
+        <w:t xml:space="preserve"> ATUALIZA</w:t>
+      </w:r>
+      <w:r>
+        <w:rPr>
+          <w:rFonts w:ascii="Aptos" w:hAnsi="Aptos" w:cs="Aptos"/>
+        </w:rPr>
+        <w:t>ÇÃ</w:t>
+      </w:r>
+      <w:r>
+        <w:t>O</w:t>
+      </w:r>
+    </w:p>
+    <w:p>
+      <w:r>
+        <w:t>Até o momento, o Alma da Fiel possui:</w:t>
+      </w:r>
+    </w:p>
+    <w:p>
+      <w:r>
+        <w:t>• Nome e slogan definidos: Alma da Fiel — “Uma história que vive em cada torcedor”.</w:t>
+      </w:r>
+      <w:r>
+        <w:br/>
+        <w:t>• Tema, proposta geral e identidade visual estabelecidos, com predominância de preto, branco e cinza, além de detalhes em vermelho.</w:t>
+      </w:r>
+      <w:r>
+        <w:br/>
+        <w:t>• Seleção inicial de dez acontecimentos históricos do Corinthians, ainda sujeita à validação em fontes confiáveis.</w:t>
+      </w:r>
+      <w:r>
+        <w:br/>
+        <w:t>• Estrutura preliminar das páginas e funcionalidades definida.</w:t>
+      </w:r>
+      <w:r>
+        <w:br/>
+        <w:t>• Tecnologias previstas: HTML, CSS, JavaScript e API WebDataVis.</w:t>
+      </w:r>
+      <w:r>
+        <w:br/>
+        <w:t>• README e descrição do repositório planejados.</w:t>
+      </w:r>
+      <w:r>
+        <w:br/>
+        <w:t>• Primeiras versões do Contexto, Objetivo e Justificativa elaboradas.</w:t>
+      </w:r>
+      <w:r>
+        <w:br/>
+        <w:t>• Escopo, Premissas e Restrições organizados.</w:t>
+      </w:r>
+      <w:r>
+        <w:br/>
+        <w:t>• Metodologia de desenvolvimento definida, começando pela prototipação no Figma.</w:t>
+      </w:r>
+      <w:r>
+        <w:br/>
+        <w:t>• Cabeçalho do site prototipado no Figma.</w:t>
+      </w:r>
+      <w:r>
+        <w:br/>
+        <w:t>• Home Page concluída no Figma.</w:t>
+      </w:r>
+      <w:r>
+        <w:br/>
+        <w:t>• Página História concluída no Figma, com uma proposta visual voltada à apresentação da trajetória do Corinthians.</w:t>
+      </w:r>
+      <w:r>
+        <w:br/>
+        <w:t>• Página Quiz concluída no Figma, contemplando a experiência de perguntas e respostas, o progresso entre as questões e a apresentação do resultado final.</w:t>
+      </w:r>
+      <w:r>
+        <w:br/>
+        <w:t>• Página Gaviões da Fiel concluída no Figma, com foco na história, na identidade e na importância cultural da torcida organizada.</w:t>
+      </w:r>
+      <w:r>
+        <w:br/>
+        <w:t>• Telas de Cadastro e Login concluídas no Figma, planejadas para representar visualmente o acesso e o registro dos usuários.</w:t>
+      </w:r>
+      <w:r>
+        <w:br/>
+        <w:t>• Página Ídolos concluída no Figma, com destaque para Sócrates e Cássio e suas contribuições para a história do Corinthians.</w:t>
+      </w:r>
+      <w:r>
+        <w:br/>
+      </w:r>
+      <w:r>
+        <w:lastRenderedPageBreak/>
+        <w:t>• Arquitetura de implementação definida preliminarmente como um site multipágina, com arquivos HTML separados e recursos compartilhados quando apropriado.</w:t>
+      </w:r>
+    </w:p>
+    <w:p>
+      <w:r>
+        <w:t>A prototipação visual encontra-se na etapa final, restando a conclusão do footer. Após essa etapa, será possível revisar a consistência visual e a navegação entre as páginas antes de iniciar a implementação em HTML, CSS e JavaScript.</w:t>
+      </w:r>
+    </w:p>
+    <w:p>
+      <w:r>
+        <w:t>A integração com a API WebDataVis ainda dependerá da análise de sua documentação e da confirmação dos recursos efetivamente disponíveis.</w:t>
+      </w:r>
+    </w:p>
+    <w:p>
+      <w:r>
+        <w:rPr>
+          <w:rFonts w:ascii="MS Gothic" w:eastAsia="MS Gothic" w:hAnsi="MS Gothic" w:cs="MS Gothic" w:hint="eastAsia"/>
+        </w:rPr>
+        <w:t>━━━━━━━━━━━━━━━━━━━━━━━━━━━━</w:t>
+      </w:r>
+      <w:r>
+        <w:br/>
+        <w:t>PR</w:t>
+      </w:r>
+      <w:r>
+        <w:rPr>
+          <w:rFonts w:ascii="Aptos" w:hAnsi="Aptos" w:cs="Aptos"/>
+        </w:rPr>
+        <w:t>Ó</w:t>
+      </w:r>
+      <w:r>
+        <w:t xml:space="preserve">XIMAS ETAPAS </w:t>
+      </w:r>
+      <w:r>
+        <w:rPr>
+          <w:rFonts w:ascii="Aptos" w:hAnsi="Aptos" w:cs="Aptos"/>
+        </w:rPr>
+        <w:t>—</w:t>
+      </w:r>
+      <w:r>
+        <w:t xml:space="preserve"> ATUALIZA</w:t>
+      </w:r>
+      <w:r>
+        <w:rPr>
+          <w:rFonts w:ascii="Aptos" w:hAnsi="Aptos" w:cs="Aptos"/>
+        </w:rPr>
+        <w:t>ÇÃ</w:t>
+      </w:r>
+      <w:r>
+        <w:t>O</w:t>
+      </w:r>
+    </w:p>
+    <w:p>
+      <w:pPr>
+        <w:numPr>
+          <w:ilvl w:val="0"/>
+          <w:numId w:val="39"/>
+        </w:numPr>
+      </w:pPr>
+      <w:r>
+        <w:t>Finalizar o footer no Figma, reunindo os links de navegação e as informações complementares do Alma da Fiel.</w:t>
+      </w:r>
+    </w:p>
+    <w:p>
+      <w:pPr>
+        <w:numPr>
+          <w:ilvl w:val="0"/>
+          <w:numId w:val="39"/>
+        </w:numPr>
+      </w:pPr>
+      <w:r>
+        <w:t>Revisar a prototipação das páginas, verificando a consistência da identidade visual, dos componentes compartilhados e da navegação.</w:t>
+      </w:r>
+    </w:p>
+    <w:p>
+      <w:pPr>
+        <w:numPr>
+          <w:ilvl w:val="0"/>
+          <w:numId w:val="39"/>
+        </w:numPr>
+      </w:pPr>
+      <w:r>
+        <w:t>Conferir se as páginas estão organizadas de maneira coerente e se os principais caminhos de navegação estão representados.</w:t>
+      </w:r>
+    </w:p>
+    <w:p>
+      <w:pPr>
+        <w:numPr>
+          <w:ilvl w:val="0"/>
+          <w:numId w:val="39"/>
+        </w:numPr>
+      </w:pPr>
+      <w:r>
+        <w:t>Revisar e consolidar a documentação acadêmica conforme as orientações dos professores.</w:t>
+      </w:r>
+    </w:p>
+    <w:p>
+      <w:pPr>
+        <w:numPr>
+          <w:ilvl w:val="0"/>
+          <w:numId w:val="39"/>
+        </w:numPr>
+      </w:pPr>
+      <w:r>
+        <w:t>Validar as informações históricas e selecionar fontes confiáveis para os conteúdos publicados.</w:t>
+      </w:r>
+    </w:p>
+    <w:p>
+      <w:pPr>
+        <w:numPr>
+          <w:ilvl w:val="0"/>
+          <w:numId w:val="39"/>
+        </w:numPr>
+      </w:pPr>
+      <w:r>
+        <w:t>Consultar a documentação da API WebDataVis para verificar os recursos disponíveis para cadastro, autenticação e armazenamento dos resultados do quiz.</w:t>
+      </w:r>
+    </w:p>
+    <w:p>
+      <w:pPr>
+        <w:numPr>
+          <w:ilvl w:val="0"/>
+          <w:numId w:val="39"/>
+        </w:numPr>
+      </w:pPr>
+      <w:r>
+        <w:t>Iniciar a implementação do site em HTML, CSS e JavaScript, utilizando arquivos HTML separados e recursos compartilhados quando apropriado.</w:t>
+      </w:r>
+    </w:p>
+    <w:p>
+      <w:pPr>
+        <w:numPr>
+          <w:ilvl w:val="0"/>
+          <w:numId w:val="39"/>
+        </w:numPr>
+      </w:pPr>
+      <w:r>
+        <w:t>Implementar gradualmente as funcionalidades, começando pela estrutura das páginas e avançando para as interações do quiz, as validações dos formulários e os recursos de usuário que forem tecnicamente viáveis.</w:t>
+      </w:r>
+    </w:p>
+    <w:p>
+      <w:pPr>
+        <w:numPr>
+          <w:ilvl w:val="0"/>
+          <w:numId w:val="39"/>
+        </w:numPr>
+      </w:pPr>
+      <w:r>
+        <w:t>Realizar testes e ajustes para verificar a navegação, a apresentação dos conteúdos, a responsividade e o funcionamento das funcionalidades implementadas.</w:t>
+      </w:r>
+    </w:p>
+    <w:p>
+      <w:pPr>
+        <w:numPr>
+          <w:ilvl w:val="0"/>
+          <w:numId w:val="39"/>
+        </w:numPr>
+      </w:pPr>
+      <w:r>
+        <w:t>Manter o GitHub atualizado, acompanhar o cronograma semanal até o prazo de 30/11/2026 e considerar as orientações dos professores.</w:t>
+      </w:r>
+    </w:p>
+    <w:p>
+      <w:r>
+        <w:rPr>
+          <w:rFonts w:ascii="MS Gothic" w:eastAsia="MS Gothic" w:hAnsi="MS Gothic" w:cs="MS Gothic" w:hint="eastAsia"/>
+        </w:rPr>
+        <w:lastRenderedPageBreak/>
+        <w:t>━━━━━━━━━━━━━━━━━━━━━━━━━━━━</w:t>
+      </w:r>
+      <w:r>
+        <w:br/>
+        <w:t>CONSIDERA</w:t>
+      </w:r>
+      <w:r>
+        <w:rPr>
+          <w:rFonts w:ascii="Aptos" w:hAnsi="Aptos" w:cs="Aptos"/>
+        </w:rPr>
+        <w:t>ÇÕ</w:t>
+      </w:r>
+      <w:r>
+        <w:t xml:space="preserve">ES FINAIS </w:t>
+      </w:r>
+      <w:r>
+        <w:rPr>
+          <w:rFonts w:ascii="Aptos" w:hAnsi="Aptos" w:cs="Aptos"/>
+        </w:rPr>
+        <w:t>—</w:t>
+      </w:r>
+      <w:r>
+        <w:t xml:space="preserve"> ATUALIZA</w:t>
+      </w:r>
+      <w:r>
+        <w:rPr>
+          <w:rFonts w:ascii="Aptos" w:hAnsi="Aptos" w:cs="Aptos"/>
+        </w:rPr>
+        <w:t>ÇÃ</w:t>
+      </w:r>
+      <w:r>
+        <w:t>O</w:t>
+      </w:r>
+    </w:p>
+    <w:p>
+      <w:r>
+        <w:t>O desenvolvimento do Alma da Fiel avançou significativamente na etapa de prototipação visual no Figma. Com a conclusão das páginas História, Quiz, Gaviões da Fiel, Cadastro, Login e Ídolos, o projeto já possui uma estrutura visual abrangente para representar sua proposta histórica, cultural e interativa.</w:t>
+      </w:r>
+    </w:p>
+    <w:p>
+      <w:r>
+        <w:t>A página Ídolos complementa o conteúdo do site ao valorizar Sócrates e Cássio, relacionando suas trajetórias à história do Corinthians e à identificação dos torcedores com o clube.</w:t>
+      </w:r>
+    </w:p>
+    <w:p>
+      <w:r>
+        <w:t>Neste momento, falta apenas finalizar o footer para concluir a etapa de prototipação visual planejada. Depois disso, será necessário revisar o conjunto das páginas e verificar se a navegação e a identidade visual permanecem consistentes.</w:t>
+      </w:r>
+    </w:p>
+    <w:p>
+      <w:r>
+        <w:t>Com o encerramento da prototipação, o próximo grande objetivo será iniciar a implementação do site utilizando HTML, CSS e JavaScript. Essa etapa deverá transformar os protótipos em páginas funcionais, começando pela estrutura visual e avançando gradualmente para as interações e funcionalidades previstas no escopo.</w:t>
+      </w:r>
+    </w:p>
+    <w:p>
+      <w:r>
+        <w:t>A integração com a API WebDataVis será avaliada conforme a documentação e os recursos disponíveis. A criação das telas de Cadastro e Login não significa que a autenticação já esteja implementada, assim como o planejamento do quiz não substitui a necessidade de desenvolver e testar sua lógica.</w:t>
+      </w:r>
+    </w:p>
+    <w:p>
+      <w:r>
+        <w:t>A inteligência artificial continuará sendo utilizada como ferramenta de apoio ao planejamento, à organização das ideias, à revisão da documentação e à compreensão dos conceitos técnicos. As decisões de design, a validação das informações e a implementação permanecerão sob responsabilidade do autor, garantindo a compreensão do trabalho desenvolvido e sua adequação aos objetivos acadêmicos.</w:t>
+      </w:r>
+    </w:p>
+    <w:p>
+      <w:r>
+        <w:t>O objetivo é concluir a prototipação visual, iniciar a implementação e transformar o Alma da Fiel em um site funcional que valorize a história, os ídolos e a identidade do Sport Club Corinthians Paulista.</w:t>
+      </w:r>
+      <w:r>
+        <w:br/>
+      </w:r>
+      <w:r>
+        <w:rPr>
+          <w:rFonts w:ascii="MS Gothic" w:eastAsia="MS Gothic" w:hAnsi="MS Gothic" w:cs="MS Gothic" w:hint="eastAsia"/>
+        </w:rPr>
+        <w:t>━━━━━━━━━━━━━━━━━━━━━━━━━━━━</w:t>
       </w:r>
     </w:p>
     <w:p/>
@@ -4413,6 +5272,345 @@
     </w:lvl>
   </w:abstractNum>
   <w:abstractNum w:abstractNumId="6" w15:restartNumberingAfterBreak="0">
+    <w:nsid w:val="1EF42D30"/>
+    <w:multiLevelType w:val="multilevel"/>
+    <w:tmpl w:val="7010A206"/>
+    <w:lvl w:ilvl="0">
+      <w:start w:val="1"/>
+      <w:numFmt w:val="decimal"/>
+      <w:lvlText w:val="%1."/>
+      <w:lvlJc w:val="left"/>
+      <w:pPr>
+        <w:tabs>
+          <w:tab w:val="num" w:pos="720"/>
+        </w:tabs>
+        <w:ind w:left="720" w:hanging="360"/>
+      </w:pPr>
+    </w:lvl>
+    <w:lvl w:ilvl="1" w:tentative="1">
+      <w:start w:val="1"/>
+      <w:numFmt w:val="decimal"/>
+      <w:lvlText w:val="%2."/>
+      <w:lvlJc w:val="left"/>
+      <w:pPr>
+        <w:tabs>
+          <w:tab w:val="num" w:pos="1440"/>
+        </w:tabs>
+        <w:ind w:left="1440" w:hanging="360"/>
+      </w:pPr>
+    </w:lvl>
+    <w:lvl w:ilvl="2" w:tentative="1">
+      <w:start w:val="1"/>
+      <w:numFmt w:val="decimal"/>
+      <w:lvlText w:val="%3."/>
+      <w:lvlJc w:val="left"/>
+      <w:pPr>
+        <w:tabs>
+          <w:tab w:val="num" w:pos="2160"/>
+        </w:tabs>
+        <w:ind w:left="2160" w:hanging="360"/>
+      </w:pPr>
+    </w:lvl>
+    <w:lvl w:ilvl="3" w:tentative="1">
+      <w:start w:val="1"/>
+      <w:numFmt w:val="decimal"/>
+      <w:lvlText w:val="%4."/>
+      <w:lvlJc w:val="left"/>
+      <w:pPr>
+        <w:tabs>
+          <w:tab w:val="num" w:pos="2880"/>
+        </w:tabs>
+        <w:ind w:left="2880" w:hanging="360"/>
+      </w:pPr>
+    </w:lvl>
+    <w:lvl w:ilvl="4" w:tentative="1">
+      <w:start w:val="1"/>
+      <w:numFmt w:val="decimal"/>
+      <w:lvlText w:val="%5."/>
+      <w:lvlJc w:val="left"/>
+      <w:pPr>
+        <w:tabs>
+          <w:tab w:val="num" w:pos="3600"/>
+        </w:tabs>
+        <w:ind w:left="3600" w:hanging="360"/>
+      </w:pPr>
+    </w:lvl>
+    <w:lvl w:ilvl="5" w:tentative="1">
+      <w:start w:val="1"/>
+      <w:numFmt w:val="decimal"/>
+      <w:lvlText w:val="%6."/>
+      <w:lvlJc w:val="left"/>
+      <w:pPr>
+        <w:tabs>
+          <w:tab w:val="num" w:pos="4320"/>
+        </w:tabs>
+        <w:ind w:left="4320" w:hanging="360"/>
+      </w:pPr>
+    </w:lvl>
+    <w:lvl w:ilvl="6" w:tentative="1">
+      <w:start w:val="1"/>
+      <w:numFmt w:val="decimal"/>
+      <w:lvlText w:val="%7."/>
+      <w:lvlJc w:val="left"/>
+      <w:pPr>
+        <w:tabs>
+          <w:tab w:val="num" w:pos="5040"/>
+        </w:tabs>
+        <w:ind w:left="5040" w:hanging="360"/>
+      </w:pPr>
+    </w:lvl>
+    <w:lvl w:ilvl="7" w:tentative="1">
+      <w:start w:val="1"/>
+      <w:numFmt w:val="decimal"/>
+      <w:lvlText w:val="%8."/>
+      <w:lvlJc w:val="left"/>
+      <w:pPr>
+        <w:tabs>
+          <w:tab w:val="num" w:pos="5760"/>
+        </w:tabs>
+        <w:ind w:left="5760" w:hanging="360"/>
+      </w:pPr>
+    </w:lvl>
+    <w:lvl w:ilvl="8" w:tentative="1">
+      <w:start w:val="1"/>
+      <w:numFmt w:val="decimal"/>
+      <w:lvlText w:val="%9."/>
+      <w:lvlJc w:val="left"/>
+      <w:pPr>
+        <w:tabs>
+          <w:tab w:val="num" w:pos="6480"/>
+        </w:tabs>
+        <w:ind w:left="6480" w:hanging="360"/>
+      </w:pPr>
+    </w:lvl>
+  </w:abstractNum>
+  <w:abstractNum w:abstractNumId="7" w15:restartNumberingAfterBreak="0">
+    <w:nsid w:val="1F820149"/>
+    <w:multiLevelType w:val="multilevel"/>
+    <w:tmpl w:val="0986BBEC"/>
+    <w:lvl w:ilvl="0">
+      <w:start w:val="1"/>
+      <w:numFmt w:val="decimal"/>
+      <w:lvlText w:val="%1."/>
+      <w:lvlJc w:val="left"/>
+      <w:pPr>
+        <w:tabs>
+          <w:tab w:val="num" w:pos="720"/>
+        </w:tabs>
+        <w:ind w:left="720" w:hanging="360"/>
+      </w:pPr>
+    </w:lvl>
+    <w:lvl w:ilvl="1" w:tentative="1">
+      <w:start w:val="1"/>
+      <w:numFmt w:val="decimal"/>
+      <w:lvlText w:val="%2."/>
+      <w:lvlJc w:val="left"/>
+      <w:pPr>
+        <w:tabs>
+          <w:tab w:val="num" w:pos="1440"/>
+        </w:tabs>
+        <w:ind w:left="1440" w:hanging="360"/>
+      </w:pPr>
+    </w:lvl>
+    <w:lvl w:ilvl="2" w:tentative="1">
+      <w:start w:val="1"/>
+      <w:numFmt w:val="decimal"/>
+      <w:lvlText w:val="%3."/>
+      <w:lvlJc w:val="left"/>
+      <w:pPr>
+        <w:tabs>
+          <w:tab w:val="num" w:pos="2160"/>
+        </w:tabs>
+        <w:ind w:left="2160" w:hanging="360"/>
+      </w:pPr>
+    </w:lvl>
+    <w:lvl w:ilvl="3" w:tentative="1">
+      <w:start w:val="1"/>
+      <w:numFmt w:val="decimal"/>
+      <w:lvlText w:val="%4."/>
+      <w:lvlJc w:val="left"/>
+      <w:pPr>
+        <w:tabs>
+          <w:tab w:val="num" w:pos="2880"/>
+        </w:tabs>
+        <w:ind w:left="2880" w:hanging="360"/>
+      </w:pPr>
+    </w:lvl>
+    <w:lvl w:ilvl="4" w:tentative="1">
+      <w:start w:val="1"/>
+      <w:numFmt w:val="decimal"/>
+      <w:lvlText w:val="%5."/>
+      <w:lvlJc w:val="left"/>
+      <w:pPr>
+        <w:tabs>
+          <w:tab w:val="num" w:pos="3600"/>
+        </w:tabs>
+        <w:ind w:left="3600" w:hanging="360"/>
+      </w:pPr>
+    </w:lvl>
+    <w:lvl w:ilvl="5" w:tentative="1">
+      <w:start w:val="1"/>
+      <w:numFmt w:val="decimal"/>
+      <w:lvlText w:val="%6."/>
+      <w:lvlJc w:val="left"/>
+      <w:pPr>
+        <w:tabs>
+          <w:tab w:val="num" w:pos="4320"/>
+        </w:tabs>
+        <w:ind w:left="4320" w:hanging="360"/>
+      </w:pPr>
+    </w:lvl>
+    <w:lvl w:ilvl="6" w:tentative="1">
+      <w:start w:val="1"/>
+      <w:numFmt w:val="decimal"/>
+      <w:lvlText w:val="%7."/>
+      <w:lvlJc w:val="left"/>
+      <w:pPr>
+        <w:tabs>
+          <w:tab w:val="num" w:pos="5040"/>
+        </w:tabs>
+        <w:ind w:left="5040" w:hanging="360"/>
+      </w:pPr>
+    </w:lvl>
+    <w:lvl w:ilvl="7" w:tentative="1">
+      <w:start w:val="1"/>
+      <w:numFmt w:val="decimal"/>
+      <w:lvlText w:val="%8."/>
+      <w:lvlJc w:val="left"/>
+      <w:pPr>
+        <w:tabs>
+          <w:tab w:val="num" w:pos="5760"/>
+        </w:tabs>
+        <w:ind w:left="5760" w:hanging="360"/>
+      </w:pPr>
+    </w:lvl>
+    <w:lvl w:ilvl="8" w:tentative="1">
+      <w:start w:val="1"/>
+      <w:numFmt w:val="decimal"/>
+      <w:lvlText w:val="%9."/>
+      <w:lvlJc w:val="left"/>
+      <w:pPr>
+        <w:tabs>
+          <w:tab w:val="num" w:pos="6480"/>
+        </w:tabs>
+        <w:ind w:left="6480" w:hanging="360"/>
+      </w:pPr>
+    </w:lvl>
+  </w:abstractNum>
+  <w:abstractNum w:abstractNumId="8" w15:restartNumberingAfterBreak="0">
+    <w:nsid w:val="21D8248F"/>
+    <w:multiLevelType w:val="multilevel"/>
+    <w:tmpl w:val="5B4CE4C6"/>
+    <w:lvl w:ilvl="0">
+      <w:start w:val="1"/>
+      <w:numFmt w:val="decimal"/>
+      <w:lvlText w:val="%1."/>
+      <w:lvlJc w:val="left"/>
+      <w:pPr>
+        <w:tabs>
+          <w:tab w:val="num" w:pos="720"/>
+        </w:tabs>
+        <w:ind w:left="720" w:hanging="360"/>
+      </w:pPr>
+    </w:lvl>
+    <w:lvl w:ilvl="1" w:tentative="1">
+      <w:start w:val="1"/>
+      <w:numFmt w:val="decimal"/>
+      <w:lvlText w:val="%2."/>
+      <w:lvlJc w:val="left"/>
+      <w:pPr>
+        <w:tabs>
+          <w:tab w:val="num" w:pos="1440"/>
+        </w:tabs>
+        <w:ind w:left="1440" w:hanging="360"/>
+      </w:pPr>
+    </w:lvl>
+    <w:lvl w:ilvl="2" w:tentative="1">
+      <w:start w:val="1"/>
+      <w:numFmt w:val="decimal"/>
+      <w:lvlText w:val="%3."/>
+      <w:lvlJc w:val="left"/>
+      <w:pPr>
+        <w:tabs>
+          <w:tab w:val="num" w:pos="2160"/>
+        </w:tabs>
+        <w:ind w:left="2160" w:hanging="360"/>
+      </w:pPr>
+    </w:lvl>
+    <w:lvl w:ilvl="3" w:tentative="1">
+      <w:start w:val="1"/>
+      <w:numFmt w:val="decimal"/>
+      <w:lvlText w:val="%4."/>
+      <w:lvlJc w:val="left"/>
+      <w:pPr>
+        <w:tabs>
+          <w:tab w:val="num" w:pos="2880"/>
+        </w:tabs>
+        <w:ind w:left="2880" w:hanging="360"/>
+      </w:pPr>
+    </w:lvl>
+    <w:lvl w:ilvl="4" w:tentative="1">
+      <w:start w:val="1"/>
+      <w:numFmt w:val="decimal"/>
+      <w:lvlText w:val="%5."/>
+      <w:lvlJc w:val="left"/>
+      <w:pPr>
+        <w:tabs>
+          <w:tab w:val="num" w:pos="3600"/>
+        </w:tabs>
+        <w:ind w:left="3600" w:hanging="360"/>
+      </w:pPr>
+    </w:lvl>
+    <w:lvl w:ilvl="5" w:tentative="1">
+      <w:start w:val="1"/>
+      <w:numFmt w:val="decimal"/>
+      <w:lvlText w:val="%6."/>
+      <w:lvlJc w:val="left"/>
+      <w:pPr>
+        <w:tabs>
+          <w:tab w:val="num" w:pos="4320"/>
+        </w:tabs>
+        <w:ind w:left="4320" w:hanging="360"/>
+      </w:pPr>
+    </w:lvl>
+    <w:lvl w:ilvl="6" w:tentative="1">
+      <w:start w:val="1"/>
+      <w:numFmt w:val="decimal"/>
+      <w:lvlText w:val="%7."/>
+      <w:lvlJc w:val="left"/>
+      <w:pPr>
+        <w:tabs>
+          <w:tab w:val="num" w:pos="5040"/>
+        </w:tabs>
+        <w:ind w:left="5040" w:hanging="360"/>
+      </w:pPr>
+    </w:lvl>
+    <w:lvl w:ilvl="7" w:tentative="1">
+      <w:start w:val="1"/>
+      <w:numFmt w:val="decimal"/>
+      <w:lvlText w:val="%8."/>
+      <w:lvlJc w:val="left"/>
+      <w:pPr>
+        <w:tabs>
+          <w:tab w:val="num" w:pos="5760"/>
+        </w:tabs>
+        <w:ind w:left="5760" w:hanging="360"/>
+      </w:pPr>
+    </w:lvl>
+    <w:lvl w:ilvl="8" w:tentative="1">
+      <w:start w:val="1"/>
+      <w:numFmt w:val="decimal"/>
+      <w:lvlText w:val="%9."/>
+      <w:lvlJc w:val="left"/>
+      <w:pPr>
+        <w:tabs>
+          <w:tab w:val="num" w:pos="6480"/>
+        </w:tabs>
+        <w:ind w:left="6480" w:hanging="360"/>
+      </w:pPr>
+    </w:lvl>
+  </w:abstractNum>
+  <w:abstractNum w:abstractNumId="9" w15:restartNumberingAfterBreak="0">
     <w:nsid w:val="2272167E"/>
     <w:multiLevelType w:val="multilevel"/>
     <w:tmpl w:val="3ED017CC"/>
@@ -4561,7 +5759,7 @@
       </w:rPr>
     </w:lvl>
   </w:abstractNum>
-  <w:abstractNum w:abstractNumId="7" w15:restartNumberingAfterBreak="0">
+  <w:abstractNum w:abstractNumId="10" w15:restartNumberingAfterBreak="0">
     <w:nsid w:val="250D2103"/>
     <w:multiLevelType w:val="multilevel"/>
     <w:tmpl w:val="5114FDBE"/>
@@ -4710,7 +5908,7 @@
       </w:rPr>
     </w:lvl>
   </w:abstractNum>
-  <w:abstractNum w:abstractNumId="8" w15:restartNumberingAfterBreak="0">
+  <w:abstractNum w:abstractNumId="11" w15:restartNumberingAfterBreak="0">
     <w:nsid w:val="2648452E"/>
     <w:multiLevelType w:val="multilevel"/>
     <w:tmpl w:val="516870FA"/>
@@ -4859,7 +6057,7 @@
       </w:rPr>
     </w:lvl>
   </w:abstractNum>
-  <w:abstractNum w:abstractNumId="9" w15:restartNumberingAfterBreak="0">
+  <w:abstractNum w:abstractNumId="12" w15:restartNumberingAfterBreak="0">
     <w:nsid w:val="2C422CEA"/>
     <w:multiLevelType w:val="multilevel"/>
     <w:tmpl w:val="6EA41ECE"/>
@@ -4972,7 +6170,7 @@
       </w:pPr>
     </w:lvl>
   </w:abstractNum>
-  <w:abstractNum w:abstractNumId="10" w15:restartNumberingAfterBreak="0">
+  <w:abstractNum w:abstractNumId="13" w15:restartNumberingAfterBreak="0">
     <w:nsid w:val="2C864B48"/>
     <w:multiLevelType w:val="multilevel"/>
     <w:tmpl w:val="A6FCB448"/>
@@ -5085,7 +6283,7 @@
       </w:pPr>
     </w:lvl>
   </w:abstractNum>
-  <w:abstractNum w:abstractNumId="11" w15:restartNumberingAfterBreak="0">
+  <w:abstractNum w:abstractNumId="14" w15:restartNumberingAfterBreak="0">
     <w:nsid w:val="2D4032D0"/>
     <w:multiLevelType w:val="multilevel"/>
     <w:tmpl w:val="3B1895EE"/>
@@ -5234,7 +6432,7 @@
       </w:rPr>
     </w:lvl>
   </w:abstractNum>
-  <w:abstractNum w:abstractNumId="12" w15:restartNumberingAfterBreak="0">
+  <w:abstractNum w:abstractNumId="15" w15:restartNumberingAfterBreak="0">
     <w:nsid w:val="312C209B"/>
     <w:multiLevelType w:val="multilevel"/>
     <w:tmpl w:val="1D38539C"/>
@@ -5383,7 +6581,7 @@
       </w:rPr>
     </w:lvl>
   </w:abstractNum>
-  <w:abstractNum w:abstractNumId="13" w15:restartNumberingAfterBreak="0">
+  <w:abstractNum w:abstractNumId="16" w15:restartNumberingAfterBreak="0">
     <w:nsid w:val="362C0042"/>
     <w:multiLevelType w:val="multilevel"/>
     <w:tmpl w:val="FE3A876E"/>
@@ -5532,7 +6730,7 @@
       </w:rPr>
     </w:lvl>
   </w:abstractNum>
-  <w:abstractNum w:abstractNumId="14" w15:restartNumberingAfterBreak="0">
+  <w:abstractNum w:abstractNumId="17" w15:restartNumberingAfterBreak="0">
     <w:nsid w:val="39193AA5"/>
     <w:multiLevelType w:val="multilevel"/>
     <w:tmpl w:val="3A58A34A"/>
@@ -5645,7 +6843,7 @@
       </w:pPr>
     </w:lvl>
   </w:abstractNum>
-  <w:abstractNum w:abstractNumId="15" w15:restartNumberingAfterBreak="0">
+  <w:abstractNum w:abstractNumId="18" w15:restartNumberingAfterBreak="0">
     <w:nsid w:val="397C1635"/>
     <w:multiLevelType w:val="multilevel"/>
     <w:tmpl w:val="6CF80884"/>
@@ -5758,7 +6956,7 @@
       </w:pPr>
     </w:lvl>
   </w:abstractNum>
-  <w:abstractNum w:abstractNumId="16" w15:restartNumberingAfterBreak="0">
+  <w:abstractNum w:abstractNumId="19" w15:restartNumberingAfterBreak="0">
     <w:nsid w:val="399E1168"/>
     <w:multiLevelType w:val="multilevel"/>
     <w:tmpl w:val="F24E1EF6"/>
@@ -5907,7 +7105,7 @@
       </w:rPr>
     </w:lvl>
   </w:abstractNum>
-  <w:abstractNum w:abstractNumId="17" w15:restartNumberingAfterBreak="0">
+  <w:abstractNum w:abstractNumId="20" w15:restartNumberingAfterBreak="0">
     <w:nsid w:val="39CE44AF"/>
     <w:multiLevelType w:val="multilevel"/>
     <w:tmpl w:val="799E18A6"/>
@@ -6056,7 +7254,7 @@
       </w:rPr>
     </w:lvl>
   </w:abstractNum>
-  <w:abstractNum w:abstractNumId="18" w15:restartNumberingAfterBreak="0">
+  <w:abstractNum w:abstractNumId="21" w15:restartNumberingAfterBreak="0">
     <w:nsid w:val="39DE2D77"/>
     <w:multiLevelType w:val="multilevel"/>
     <w:tmpl w:val="D28AB396"/>
@@ -6169,7 +7367,7 @@
       </w:pPr>
     </w:lvl>
   </w:abstractNum>
-  <w:abstractNum w:abstractNumId="19" w15:restartNumberingAfterBreak="0">
+  <w:abstractNum w:abstractNumId="22" w15:restartNumberingAfterBreak="0">
     <w:nsid w:val="3C6B199B"/>
     <w:multiLevelType w:val="multilevel"/>
     <w:tmpl w:val="E9669198"/>
@@ -6282,7 +7480,7 @@
       </w:pPr>
     </w:lvl>
   </w:abstractNum>
-  <w:abstractNum w:abstractNumId="20" w15:restartNumberingAfterBreak="0">
+  <w:abstractNum w:abstractNumId="23" w15:restartNumberingAfterBreak="0">
     <w:nsid w:val="45B45FAF"/>
     <w:multiLevelType w:val="multilevel"/>
     <w:tmpl w:val="F70639B6"/>
@@ -6395,7 +7593,7 @@
       </w:pPr>
     </w:lvl>
   </w:abstractNum>
-  <w:abstractNum w:abstractNumId="21" w15:restartNumberingAfterBreak="0">
+  <w:abstractNum w:abstractNumId="24" w15:restartNumberingAfterBreak="0">
     <w:nsid w:val="49EA667F"/>
     <w:multiLevelType w:val="multilevel"/>
     <w:tmpl w:val="A8868618"/>
@@ -6508,7 +7706,7 @@
       </w:pPr>
     </w:lvl>
   </w:abstractNum>
-  <w:abstractNum w:abstractNumId="22" w15:restartNumberingAfterBreak="0">
+  <w:abstractNum w:abstractNumId="25" w15:restartNumberingAfterBreak="0">
     <w:nsid w:val="4ABC56D4"/>
     <w:multiLevelType w:val="multilevel"/>
     <w:tmpl w:val="8BE4141C"/>
@@ -6657,7 +7855,120 @@
       </w:rPr>
     </w:lvl>
   </w:abstractNum>
-  <w:abstractNum w:abstractNumId="23" w15:restartNumberingAfterBreak="0">
+  <w:abstractNum w:abstractNumId="26" w15:restartNumberingAfterBreak="0">
+    <w:nsid w:val="4AD222F3"/>
+    <w:multiLevelType w:val="multilevel"/>
+    <w:tmpl w:val="F5766536"/>
+    <w:lvl w:ilvl="0">
+      <w:start w:val="1"/>
+      <w:numFmt w:val="decimal"/>
+      <w:lvlText w:val="%1."/>
+      <w:lvlJc w:val="left"/>
+      <w:pPr>
+        <w:tabs>
+          <w:tab w:val="num" w:pos="720"/>
+        </w:tabs>
+        <w:ind w:left="720" w:hanging="360"/>
+      </w:pPr>
+    </w:lvl>
+    <w:lvl w:ilvl="1" w:tentative="1">
+      <w:start w:val="1"/>
+      <w:numFmt w:val="decimal"/>
+      <w:lvlText w:val="%2."/>
+      <w:lvlJc w:val="left"/>
+      <w:pPr>
+        <w:tabs>
+          <w:tab w:val="num" w:pos="1440"/>
+        </w:tabs>
+        <w:ind w:left="1440" w:hanging="360"/>
+      </w:pPr>
+    </w:lvl>
+    <w:lvl w:ilvl="2" w:tentative="1">
+      <w:start w:val="1"/>
+      <w:numFmt w:val="decimal"/>
+      <w:lvlText w:val="%3."/>
+      <w:lvlJc w:val="left"/>
+      <w:pPr>
+        <w:tabs>
+          <w:tab w:val="num" w:pos="2160"/>
+        </w:tabs>
+        <w:ind w:left="2160" w:hanging="360"/>
+      </w:pPr>
+    </w:lvl>
+    <w:lvl w:ilvl="3" w:tentative="1">
+      <w:start w:val="1"/>
+      <w:numFmt w:val="decimal"/>
+      <w:lvlText w:val="%4."/>
+      <w:lvlJc w:val="left"/>
+      <w:pPr>
+        <w:tabs>
+          <w:tab w:val="num" w:pos="2880"/>
+        </w:tabs>
+        <w:ind w:left="2880" w:hanging="360"/>
+      </w:pPr>
+    </w:lvl>
+    <w:lvl w:ilvl="4" w:tentative="1">
+      <w:start w:val="1"/>
+      <w:numFmt w:val="decimal"/>
+      <w:lvlText w:val="%5."/>
+      <w:lvlJc w:val="left"/>
+      <w:pPr>
+        <w:tabs>
+          <w:tab w:val="num" w:pos="3600"/>
+        </w:tabs>
+        <w:ind w:left="3600" w:hanging="360"/>
+      </w:pPr>
+    </w:lvl>
+    <w:lvl w:ilvl="5" w:tentative="1">
+      <w:start w:val="1"/>
+      <w:numFmt w:val="decimal"/>
+      <w:lvlText w:val="%6."/>
+      <w:lvlJc w:val="left"/>
+      <w:pPr>
+        <w:tabs>
+          <w:tab w:val="num" w:pos="4320"/>
+        </w:tabs>
+        <w:ind w:left="4320" w:hanging="360"/>
+      </w:pPr>
+    </w:lvl>
+    <w:lvl w:ilvl="6" w:tentative="1">
+      <w:start w:val="1"/>
+      <w:numFmt w:val="decimal"/>
+      <w:lvlText w:val="%7."/>
+      <w:lvlJc w:val="left"/>
+      <w:pPr>
+        <w:tabs>
+          <w:tab w:val="num" w:pos="5040"/>
+        </w:tabs>
+        <w:ind w:left="5040" w:hanging="360"/>
+      </w:pPr>
+    </w:lvl>
+    <w:lvl w:ilvl="7" w:tentative="1">
+      <w:start w:val="1"/>
+      <w:numFmt w:val="decimal"/>
+      <w:lvlText w:val="%8."/>
+      <w:lvlJc w:val="left"/>
+      <w:pPr>
+        <w:tabs>
+          <w:tab w:val="num" w:pos="5760"/>
+        </w:tabs>
+        <w:ind w:left="5760" w:hanging="360"/>
+      </w:pPr>
+    </w:lvl>
+    <w:lvl w:ilvl="8" w:tentative="1">
+      <w:start w:val="1"/>
+      <w:numFmt w:val="decimal"/>
+      <w:lvlText w:val="%9."/>
+      <w:lvlJc w:val="left"/>
+      <w:pPr>
+        <w:tabs>
+          <w:tab w:val="num" w:pos="6480"/>
+        </w:tabs>
+        <w:ind w:left="6480" w:hanging="360"/>
+      </w:pPr>
+    </w:lvl>
+  </w:abstractNum>
+  <w:abstractNum w:abstractNumId="27" w15:restartNumberingAfterBreak="0">
     <w:nsid w:val="4CDD0DFC"/>
     <w:multiLevelType w:val="multilevel"/>
     <w:tmpl w:val="78BEA320"/>
@@ -6770,7 +8081,7 @@
       </w:pPr>
     </w:lvl>
   </w:abstractNum>
-  <w:abstractNum w:abstractNumId="24" w15:restartNumberingAfterBreak="0">
+  <w:abstractNum w:abstractNumId="28" w15:restartNumberingAfterBreak="0">
     <w:nsid w:val="4F4C5743"/>
     <w:multiLevelType w:val="multilevel"/>
     <w:tmpl w:val="B7446200"/>
@@ -6883,7 +8194,7 @@
       </w:pPr>
     </w:lvl>
   </w:abstractNum>
-  <w:abstractNum w:abstractNumId="25" w15:restartNumberingAfterBreak="0">
+  <w:abstractNum w:abstractNumId="29" w15:restartNumberingAfterBreak="0">
     <w:nsid w:val="579A6C80"/>
     <w:multiLevelType w:val="multilevel"/>
     <w:tmpl w:val="6D189CE4"/>
@@ -6996,7 +8307,7 @@
       </w:pPr>
     </w:lvl>
   </w:abstractNum>
-  <w:abstractNum w:abstractNumId="26" w15:restartNumberingAfterBreak="0">
+  <w:abstractNum w:abstractNumId="30" w15:restartNumberingAfterBreak="0">
     <w:nsid w:val="5FA57BE0"/>
     <w:multiLevelType w:val="multilevel"/>
     <w:tmpl w:val="18C8FD24"/>
@@ -7109,7 +8420,7 @@
       </w:pPr>
     </w:lvl>
   </w:abstractNum>
-  <w:abstractNum w:abstractNumId="27" w15:restartNumberingAfterBreak="0">
+  <w:abstractNum w:abstractNumId="31" w15:restartNumberingAfterBreak="0">
     <w:nsid w:val="60850E81"/>
     <w:multiLevelType w:val="multilevel"/>
     <w:tmpl w:val="46303664"/>
@@ -7258,7 +8569,120 @@
       </w:rPr>
     </w:lvl>
   </w:abstractNum>
-  <w:abstractNum w:abstractNumId="28" w15:restartNumberingAfterBreak="0">
+  <w:abstractNum w:abstractNumId="32" w15:restartNumberingAfterBreak="0">
+    <w:nsid w:val="614971B3"/>
+    <w:multiLevelType w:val="multilevel"/>
+    <w:tmpl w:val="4DB44FE6"/>
+    <w:lvl w:ilvl="0">
+      <w:start w:val="1"/>
+      <w:numFmt w:val="decimal"/>
+      <w:lvlText w:val="%1."/>
+      <w:lvlJc w:val="left"/>
+      <w:pPr>
+        <w:tabs>
+          <w:tab w:val="num" w:pos="720"/>
+        </w:tabs>
+        <w:ind w:left="720" w:hanging="360"/>
+      </w:pPr>
+    </w:lvl>
+    <w:lvl w:ilvl="1" w:tentative="1">
+      <w:start w:val="1"/>
+      <w:numFmt w:val="decimal"/>
+      <w:lvlText w:val="%2."/>
+      <w:lvlJc w:val="left"/>
+      <w:pPr>
+        <w:tabs>
+          <w:tab w:val="num" w:pos="1440"/>
+        </w:tabs>
+        <w:ind w:left="1440" w:hanging="360"/>
+      </w:pPr>
+    </w:lvl>
+    <w:lvl w:ilvl="2" w:tentative="1">
+      <w:start w:val="1"/>
+      <w:numFmt w:val="decimal"/>
+      <w:lvlText w:val="%3."/>
+      <w:lvlJc w:val="left"/>
+      <w:pPr>
+        <w:tabs>
+          <w:tab w:val="num" w:pos="2160"/>
+        </w:tabs>
+        <w:ind w:left="2160" w:hanging="360"/>
+      </w:pPr>
+    </w:lvl>
+    <w:lvl w:ilvl="3" w:tentative="1">
+      <w:start w:val="1"/>
+      <w:numFmt w:val="decimal"/>
+      <w:lvlText w:val="%4."/>
+      <w:lvlJc w:val="left"/>
+      <w:pPr>
+        <w:tabs>
+          <w:tab w:val="num" w:pos="2880"/>
+        </w:tabs>
+        <w:ind w:left="2880" w:hanging="360"/>
+      </w:pPr>
+    </w:lvl>
+    <w:lvl w:ilvl="4" w:tentative="1">
+      <w:start w:val="1"/>
+      <w:numFmt w:val="decimal"/>
+      <w:lvlText w:val="%5."/>
+      <w:lvlJc w:val="left"/>
+      <w:pPr>
+        <w:tabs>
+          <w:tab w:val="num" w:pos="3600"/>
+        </w:tabs>
+        <w:ind w:left="3600" w:hanging="360"/>
+      </w:pPr>
+    </w:lvl>
+    <w:lvl w:ilvl="5" w:tentative="1">
+      <w:start w:val="1"/>
+      <w:numFmt w:val="decimal"/>
+      <w:lvlText w:val="%6."/>
+      <w:lvlJc w:val="left"/>
+      <w:pPr>
+        <w:tabs>
+          <w:tab w:val="num" w:pos="4320"/>
+        </w:tabs>
+        <w:ind w:left="4320" w:hanging="360"/>
+      </w:pPr>
+    </w:lvl>
+    <w:lvl w:ilvl="6" w:tentative="1">
+      <w:start w:val="1"/>
+      <w:numFmt w:val="decimal"/>
+      <w:lvlText w:val="%7."/>
+      <w:lvlJc w:val="left"/>
+      <w:pPr>
+        <w:tabs>
+          <w:tab w:val="num" w:pos="5040"/>
+        </w:tabs>
+        <w:ind w:left="5040" w:hanging="360"/>
+      </w:pPr>
+    </w:lvl>
+    <w:lvl w:ilvl="7" w:tentative="1">
+      <w:start w:val="1"/>
+      <w:numFmt w:val="decimal"/>
+      <w:lvlText w:val="%8."/>
+      <w:lvlJc w:val="left"/>
+      <w:pPr>
+        <w:tabs>
+          <w:tab w:val="num" w:pos="5760"/>
+        </w:tabs>
+        <w:ind w:left="5760" w:hanging="360"/>
+      </w:pPr>
+    </w:lvl>
+    <w:lvl w:ilvl="8" w:tentative="1">
+      <w:start w:val="1"/>
+      <w:numFmt w:val="decimal"/>
+      <w:lvlText w:val="%9."/>
+      <w:lvlJc w:val="left"/>
+      <w:pPr>
+        <w:tabs>
+          <w:tab w:val="num" w:pos="6480"/>
+        </w:tabs>
+        <w:ind w:left="6480" w:hanging="360"/>
+      </w:pPr>
+    </w:lvl>
+  </w:abstractNum>
+  <w:abstractNum w:abstractNumId="33" w15:restartNumberingAfterBreak="0">
     <w:nsid w:val="614E4692"/>
     <w:multiLevelType w:val="multilevel"/>
     <w:tmpl w:val="275AFA5C"/>
@@ -7371,7 +8795,7 @@
       </w:pPr>
     </w:lvl>
   </w:abstractNum>
-  <w:abstractNum w:abstractNumId="29" w15:restartNumberingAfterBreak="0">
+  <w:abstractNum w:abstractNumId="34" w15:restartNumberingAfterBreak="0">
     <w:nsid w:val="64D34919"/>
     <w:multiLevelType w:val="multilevel"/>
     <w:tmpl w:val="09A207A8"/>
@@ -7520,7 +8944,7 @@
       </w:rPr>
     </w:lvl>
   </w:abstractNum>
-  <w:abstractNum w:abstractNumId="30" w15:restartNumberingAfterBreak="0">
+  <w:abstractNum w:abstractNumId="35" w15:restartNumberingAfterBreak="0">
     <w:nsid w:val="66307BB7"/>
     <w:multiLevelType w:val="multilevel"/>
     <w:tmpl w:val="E70A17DA"/>
@@ -7669,7 +9093,7 @@
       </w:rPr>
     </w:lvl>
   </w:abstractNum>
-  <w:abstractNum w:abstractNumId="31" w15:restartNumberingAfterBreak="0">
+  <w:abstractNum w:abstractNumId="36" w15:restartNumberingAfterBreak="0">
     <w:nsid w:val="6918154F"/>
     <w:multiLevelType w:val="multilevel"/>
     <w:tmpl w:val="3D94CDBE"/>
@@ -7818,7 +9242,120 @@
       </w:rPr>
     </w:lvl>
   </w:abstractNum>
-  <w:abstractNum w:abstractNumId="32" w15:restartNumberingAfterBreak="0">
+  <w:abstractNum w:abstractNumId="37" w15:restartNumberingAfterBreak="0">
+    <w:nsid w:val="6D400F3B"/>
+    <w:multiLevelType w:val="multilevel"/>
+    <w:tmpl w:val="0BBEEF22"/>
+    <w:lvl w:ilvl="0">
+      <w:start w:val="1"/>
+      <w:numFmt w:val="decimal"/>
+      <w:lvlText w:val="%1."/>
+      <w:lvlJc w:val="left"/>
+      <w:pPr>
+        <w:tabs>
+          <w:tab w:val="num" w:pos="720"/>
+        </w:tabs>
+        <w:ind w:left="720" w:hanging="360"/>
+      </w:pPr>
+    </w:lvl>
+    <w:lvl w:ilvl="1" w:tentative="1">
+      <w:start w:val="1"/>
+      <w:numFmt w:val="decimal"/>
+      <w:lvlText w:val="%2."/>
+      <w:lvlJc w:val="left"/>
+      <w:pPr>
+        <w:tabs>
+          <w:tab w:val="num" w:pos="1440"/>
+        </w:tabs>
+        <w:ind w:left="1440" w:hanging="360"/>
+      </w:pPr>
+    </w:lvl>
+    <w:lvl w:ilvl="2" w:tentative="1">
+      <w:start w:val="1"/>
+      <w:numFmt w:val="decimal"/>
+      <w:lvlText w:val="%3."/>
+      <w:lvlJc w:val="left"/>
+      <w:pPr>
+        <w:tabs>
+          <w:tab w:val="num" w:pos="2160"/>
+        </w:tabs>
+        <w:ind w:left="2160" w:hanging="360"/>
+      </w:pPr>
+    </w:lvl>
+    <w:lvl w:ilvl="3" w:tentative="1">
+      <w:start w:val="1"/>
+      <w:numFmt w:val="decimal"/>
+      <w:lvlText w:val="%4."/>
+      <w:lvlJc w:val="left"/>
+      <w:pPr>
+        <w:tabs>
+          <w:tab w:val="num" w:pos="2880"/>
+        </w:tabs>
+        <w:ind w:left="2880" w:hanging="360"/>
+      </w:pPr>
+    </w:lvl>
+    <w:lvl w:ilvl="4" w:tentative="1">
+      <w:start w:val="1"/>
+      <w:numFmt w:val="decimal"/>
+      <w:lvlText w:val="%5."/>
+      <w:lvlJc w:val="left"/>
+      <w:pPr>
+        <w:tabs>
+          <w:tab w:val="num" w:pos="3600"/>
+        </w:tabs>
+        <w:ind w:left="3600" w:hanging="360"/>
+      </w:pPr>
+    </w:lvl>
+    <w:lvl w:ilvl="5" w:tentative="1">
+      <w:start w:val="1"/>
+      <w:numFmt w:val="decimal"/>
+      <w:lvlText w:val="%6."/>
+      <w:lvlJc w:val="left"/>
+      <w:pPr>
+        <w:tabs>
+          <w:tab w:val="num" w:pos="4320"/>
+        </w:tabs>
+        <w:ind w:left="4320" w:hanging="360"/>
+      </w:pPr>
+    </w:lvl>
+    <w:lvl w:ilvl="6" w:tentative="1">
+      <w:start w:val="1"/>
+      <w:numFmt w:val="decimal"/>
+      <w:lvlText w:val="%7."/>
+      <w:lvlJc w:val="left"/>
+      <w:pPr>
+        <w:tabs>
+          <w:tab w:val="num" w:pos="5040"/>
+        </w:tabs>
+        <w:ind w:left="5040" w:hanging="360"/>
+      </w:pPr>
+    </w:lvl>
+    <w:lvl w:ilvl="7" w:tentative="1">
+      <w:start w:val="1"/>
+      <w:numFmt w:val="decimal"/>
+      <w:lvlText w:val="%8."/>
+      <w:lvlJc w:val="left"/>
+      <w:pPr>
+        <w:tabs>
+          <w:tab w:val="num" w:pos="5760"/>
+        </w:tabs>
+        <w:ind w:left="5760" w:hanging="360"/>
+      </w:pPr>
+    </w:lvl>
+    <w:lvl w:ilvl="8" w:tentative="1">
+      <w:start w:val="1"/>
+      <w:numFmt w:val="decimal"/>
+      <w:lvlText w:val="%9."/>
+      <w:lvlJc w:val="left"/>
+      <w:pPr>
+        <w:tabs>
+          <w:tab w:val="num" w:pos="6480"/>
+        </w:tabs>
+        <w:ind w:left="6480" w:hanging="360"/>
+      </w:pPr>
+    </w:lvl>
+  </w:abstractNum>
+  <w:abstractNum w:abstractNumId="38" w15:restartNumberingAfterBreak="0">
     <w:nsid w:val="7E3C0B5D"/>
     <w:multiLevelType w:val="multilevel"/>
     <w:tmpl w:val="26B0B030"/>
@@ -7968,103 +9505,121 @@
     </w:lvl>
   </w:abstractNum>
   <w:num w:numId="1" w16cid:durableId="163476366">
-    <w:abstractNumId w:val="27"/>
+    <w:abstractNumId w:val="31"/>
   </w:num>
   <w:num w:numId="2" w16cid:durableId="888031651">
-    <w:abstractNumId w:val="30"/>
+    <w:abstractNumId w:val="35"/>
   </w:num>
   <w:num w:numId="3" w16cid:durableId="2143301179">
-    <w:abstractNumId w:val="18"/>
+    <w:abstractNumId w:val="21"/>
   </w:num>
   <w:num w:numId="4" w16cid:durableId="1768693047">
-    <w:abstractNumId w:val="22"/>
+    <w:abstractNumId w:val="25"/>
   </w:num>
   <w:num w:numId="5" w16cid:durableId="2079402130">
     <w:abstractNumId w:val="0"/>
   </w:num>
   <w:num w:numId="6" w16cid:durableId="2139686027">
-    <w:abstractNumId w:val="13"/>
+    <w:abstractNumId w:val="16"/>
   </w:num>
   <w:num w:numId="7" w16cid:durableId="337856317">
-    <w:abstractNumId w:val="16"/>
+    <w:abstractNumId w:val="19"/>
   </w:num>
   <w:num w:numId="8" w16cid:durableId="2034529628">
-    <w:abstractNumId w:val="19"/>
+    <w:abstractNumId w:val="22"/>
   </w:num>
   <w:num w:numId="9" w16cid:durableId="741368021">
-    <w:abstractNumId w:val="11"/>
+    <w:abstractNumId w:val="14"/>
   </w:num>
   <w:num w:numId="10" w16cid:durableId="152840754">
-    <w:abstractNumId w:val="7"/>
+    <w:abstractNumId w:val="10"/>
   </w:num>
   <w:num w:numId="11" w16cid:durableId="640040349">
     <w:abstractNumId w:val="4"/>
   </w:num>
   <w:num w:numId="12" w16cid:durableId="328290283">
-    <w:abstractNumId w:val="29"/>
+    <w:abstractNumId w:val="34"/>
   </w:num>
   <w:num w:numId="13" w16cid:durableId="365716282">
-    <w:abstractNumId w:val="9"/>
+    <w:abstractNumId w:val="12"/>
   </w:num>
   <w:num w:numId="14" w16cid:durableId="1749301687">
-    <w:abstractNumId w:val="32"/>
+    <w:abstractNumId w:val="38"/>
   </w:num>
   <w:num w:numId="15" w16cid:durableId="92895161">
-    <w:abstractNumId w:val="26"/>
+    <w:abstractNumId w:val="30"/>
   </w:num>
   <w:num w:numId="16" w16cid:durableId="2141683418">
     <w:abstractNumId w:val="3"/>
   </w:num>
   <w:num w:numId="17" w16cid:durableId="293340683">
-    <w:abstractNumId w:val="15"/>
+    <w:abstractNumId w:val="18"/>
   </w:num>
   <w:num w:numId="18" w16cid:durableId="1519152503">
     <w:abstractNumId w:val="2"/>
   </w:num>
   <w:num w:numId="19" w16cid:durableId="2119985953">
-    <w:abstractNumId w:val="12"/>
+    <w:abstractNumId w:val="15"/>
   </w:num>
   <w:num w:numId="20" w16cid:durableId="1886062730">
     <w:abstractNumId w:val="5"/>
   </w:num>
   <w:num w:numId="21" w16cid:durableId="1955594982">
-    <w:abstractNumId w:val="17"/>
+    <w:abstractNumId w:val="20"/>
   </w:num>
   <w:num w:numId="22" w16cid:durableId="249894331">
-    <w:abstractNumId w:val="24"/>
+    <w:abstractNumId w:val="28"/>
   </w:num>
   <w:num w:numId="23" w16cid:durableId="678196419">
-    <w:abstractNumId w:val="25"/>
+    <w:abstractNumId w:val="29"/>
   </w:num>
   <w:num w:numId="24" w16cid:durableId="429787488">
-    <w:abstractNumId w:val="6"/>
+    <w:abstractNumId w:val="9"/>
   </w:num>
   <w:num w:numId="25" w16cid:durableId="1308825487">
-    <w:abstractNumId w:val="31"/>
+    <w:abstractNumId w:val="36"/>
   </w:num>
   <w:num w:numId="26" w16cid:durableId="299728592">
     <w:abstractNumId w:val="1"/>
   </w:num>
   <w:num w:numId="27" w16cid:durableId="1447042674">
-    <w:abstractNumId w:val="21"/>
+    <w:abstractNumId w:val="24"/>
   </w:num>
   <w:num w:numId="28" w16cid:durableId="1326931229">
+    <w:abstractNumId w:val="11"/>
+  </w:num>
+  <w:num w:numId="29" w16cid:durableId="510529186">
+    <w:abstractNumId w:val="33"/>
+  </w:num>
+  <w:num w:numId="30" w16cid:durableId="1924073036">
+    <w:abstractNumId w:val="13"/>
+  </w:num>
+  <w:num w:numId="31" w16cid:durableId="973489751">
+    <w:abstractNumId w:val="27"/>
+  </w:num>
+  <w:num w:numId="32" w16cid:durableId="850223582">
+    <w:abstractNumId w:val="23"/>
+  </w:num>
+  <w:num w:numId="33" w16cid:durableId="1725257606">
+    <w:abstractNumId w:val="17"/>
+  </w:num>
+  <w:num w:numId="34" w16cid:durableId="643050162">
+    <w:abstractNumId w:val="6"/>
+  </w:num>
+  <w:num w:numId="35" w16cid:durableId="1812867411">
+    <w:abstractNumId w:val="7"/>
+  </w:num>
+  <w:num w:numId="36" w16cid:durableId="148326540">
     <w:abstractNumId w:val="8"/>
   </w:num>
-  <w:num w:numId="29" w16cid:durableId="510529186">
-    <w:abstractNumId w:val="28"/>
+  <w:num w:numId="37" w16cid:durableId="1035623289">
+    <w:abstractNumId w:val="37"/>
   </w:num>
-  <w:num w:numId="30" w16cid:durableId="1924073036">
-    <w:abstractNumId w:val="10"/>
+  <w:num w:numId="38" w16cid:durableId="1597903377">
+    <w:abstractNumId w:val="32"/>
   </w:num>
-  <w:num w:numId="31" w16cid:durableId="973489751">
-    <w:abstractNumId w:val="23"/>
-  </w:num>
-  <w:num w:numId="32" w16cid:durableId="850223582">
-    <w:abstractNumId w:val="20"/>
-  </w:num>
-  <w:num w:numId="33" w16cid:durableId="1725257606">
-    <w:abstractNumId w:val="14"/>
+  <w:num w:numId="39" w16cid:durableId="322851734">
+    <w:abstractNumId w:val="26"/>
   </w:num>
 </w:numbering>
 </file>

</xml_diff>

<commit_message>
Adicionando web dat viz
</commit_message>
<xml_diff>
--- a/Diario de prompt/DiarioPrompt.docx
+++ b/Diario de prompt/DiarioPrompt.docx
@@ -4435,7 +4435,612 @@
         </w:rPr>
         <w:t>━━━━━━━━━━━━━━━━━━━━━━━━━━━━</w:t>
       </w:r>
-    </w:p>
+      <w:r>
+        <w:rPr>
+          <w:rFonts w:ascii="MS Gothic" w:eastAsia="MS Gothic" w:hAnsi="MS Gothic" w:cs="MS Gothic"/>
+        </w:rPr>
+        <w:br/>
+      </w:r>
+      <w:r>
+        <w:rPr>
+          <w:rFonts w:ascii="MS Gothic" w:eastAsia="MS Gothic" w:hAnsi="MS Gothic" w:cs="MS Gothic"/>
+        </w:rPr>
+        <w:br/>
+      </w:r>
+      <w:r>
+        <w:rPr>
+          <w:rFonts w:ascii="MS Gothic" w:eastAsia="MS Gothic" w:hAnsi="MS Gothic" w:cs="MS Gothic" w:hint="eastAsia"/>
+        </w:rPr>
+        <w:t>━━━━━━━━━━━━━━━━━━━━━━━━━━━━</w:t>
+      </w:r>
+    </w:p>
+    <w:p>
+      <w:r>
+        <w:rPr>
+          <w:b/>
+          <w:bCs/>
+        </w:rPr>
+        <w:t>27. Conclusão da prototipação visual e início da implementação</w:t>
+      </w:r>
+    </w:p>
+    <w:p>
+      <w:r>
+        <w:rPr>
+          <w:b/>
+          <w:bCs/>
+        </w:rPr>
+        <w:t>Prompt enviado</w:t>
+      </w:r>
+    </w:p>
+    <w:p>
+      <w:r>
+        <w:lastRenderedPageBreak/>
+        <w:t>Informei que concluí a prototipação visual do Alma da Fiel no Figma, incluindo o footer, que era o último elemento pendente para finalizar a estrutura visual planejada para o site.</w:t>
+      </w:r>
+    </w:p>
+    <w:p>
+      <w:r>
+        <w:t>Após concluir as páginas Início, Sobre, História, Ídolos, Gaviões da Fiel, Quiz, Cadastro e Login, além dos componentes compartilhados de navegação, decidi iniciar a etapa de implementação do projeto utilizando HTML, CSS e JavaScript.</w:t>
+      </w:r>
+    </w:p>
+    <w:p>
+      <w:r>
+        <w:t>Solicitei a atualização do Diário de Prompts para registrar essa transição entre o planejamento visual e o desenvolvimento do site funcional, mantendo o histórico das decisões tomadas e das próximas etapas.</w:t>
+      </w:r>
+    </w:p>
+    <w:p>
+      <w:r>
+        <w:rPr>
+          <w:b/>
+          <w:bCs/>
+        </w:rPr>
+        <w:t>Resposta da IA</w:t>
+      </w:r>
+    </w:p>
+    <w:p>
+      <w:r>
+        <w:t>A IA reconheceu a conclusão da prototipação como um marco importante no desenvolvimento do Alma da Fiel e recomendou iniciar a implementação de forma gradual e organizada, utilizando os protótipos do Figma como referência visual.</w:t>
+      </w:r>
+    </w:p>
+    <w:p>
+      <w:r>
+        <w:t>Foi sugerida a seguinte sequência de desenvolvimento:</w:t>
+      </w:r>
+    </w:p>
+    <w:p>
+      <w:pPr>
+        <w:numPr>
+          <w:ilvl w:val="0"/>
+          <w:numId w:val="40"/>
+        </w:numPr>
+      </w:pPr>
+      <w:r>
+        <w:rPr>
+          <w:b/>
+          <w:bCs/>
+        </w:rPr>
+        <w:t>Organização dos arquivos:</w:t>
+      </w:r>
+      <w:r>
+        <w:t xml:space="preserve"> preparar a estrutura de pastas e arquivos do projeto, separando as páginas HTML, os estilos CSS, os scripts JavaScript e os recursos visuais.</w:t>
+      </w:r>
+    </w:p>
+    <w:p>
+      <w:pPr>
+        <w:numPr>
+          <w:ilvl w:val="0"/>
+          <w:numId w:val="40"/>
+        </w:numPr>
+      </w:pPr>
+      <w:r>
+        <w:rPr>
+          <w:b/>
+          <w:bCs/>
+        </w:rPr>
+        <w:t>Estrutura HTML:</w:t>
+      </w:r>
+      <w:r>
+        <w:t xml:space="preserve"> desenvolver as páginas individualmente, utilizando HTML semântico para organizar títulos, textos, imagens, formulários, navegação e demais elementos.</w:t>
+      </w:r>
+    </w:p>
+    <w:p>
+      <w:pPr>
+        <w:numPr>
+          <w:ilvl w:val="0"/>
+          <w:numId w:val="40"/>
+        </w:numPr>
+      </w:pPr>
+      <w:r>
+        <w:rPr>
+          <w:b/>
+          <w:bCs/>
+        </w:rPr>
+        <w:t>Estilização com CSS:</w:t>
+      </w:r>
+      <w:r>
+        <w:t xml:space="preserve"> reproduzir a identidade visual definida no Figma, mantendo a predominância de preto, branco e cinza, com detalhes em vermelho.</w:t>
+      </w:r>
+    </w:p>
+    <w:p>
+      <w:pPr>
+        <w:numPr>
+          <w:ilvl w:val="0"/>
+          <w:numId w:val="40"/>
+        </w:numPr>
+      </w:pPr>
+      <w:r>
+        <w:rPr>
+          <w:b/>
+          <w:bCs/>
+        </w:rPr>
+        <w:t>Componentes compartilhados:</w:t>
+      </w:r>
+      <w:r>
+        <w:t xml:space="preserve"> implementar o cabeçalho e o footer de maneira consistente entre as páginas, evitando diferenças visuais desnecessárias.</w:t>
+      </w:r>
+    </w:p>
+    <w:p>
+      <w:pPr>
+        <w:numPr>
+          <w:ilvl w:val="0"/>
+          <w:numId w:val="40"/>
+        </w:numPr>
+      </w:pPr>
+      <w:r>
+        <w:rPr>
+          <w:b/>
+          <w:bCs/>
+        </w:rPr>
+        <w:t>Implementação do quiz:</w:t>
+      </w:r>
+      <w:r>
+        <w:t xml:space="preserve"> utilizar JavaScript para controlar a exibição das perguntas, a seleção das alternativas, o avanço entre as questões, a contagem de acertos e a apresentação do resultado final.</w:t>
+      </w:r>
+    </w:p>
+    <w:p>
+      <w:pPr>
+        <w:numPr>
+          <w:ilvl w:val="0"/>
+          <w:numId w:val="40"/>
+        </w:numPr>
+      </w:pPr>
+      <w:r>
+        <w:rPr>
+          <w:b/>
+          <w:bCs/>
+        </w:rPr>
+        <w:t>Formulários de Cadastro e Login:</w:t>
+      </w:r>
+      <w:r>
+        <w:t xml:space="preserve"> desenvolver as interfaces e suas validações, avaliando os recursos necessários para implementar a autenticação.</w:t>
+      </w:r>
+    </w:p>
+    <w:p>
+      <w:pPr>
+        <w:numPr>
+          <w:ilvl w:val="0"/>
+          <w:numId w:val="40"/>
+        </w:numPr>
+      </w:pPr>
+      <w:r>
+        <w:rPr>
+          <w:b/>
+          <w:bCs/>
+        </w:rPr>
+        <w:t>Integração com a API WebDataVis:</w:t>
+      </w:r>
+      <w:r>
+        <w:t xml:space="preserve"> consultar a documentação e verificar quais recursos podem ser utilizados para cadastro, login e armazenamento de resultados.</w:t>
+      </w:r>
+    </w:p>
+    <w:p>
+      <w:pPr>
+        <w:numPr>
+          <w:ilvl w:val="0"/>
+          <w:numId w:val="40"/>
+        </w:numPr>
+      </w:pPr>
+      <w:r>
+        <w:rPr>
+          <w:b/>
+          <w:bCs/>
+        </w:rPr>
+        <w:lastRenderedPageBreak/>
+        <w:t>Testes e ajustes:</w:t>
+      </w:r>
+      <w:r>
+        <w:t xml:space="preserve"> verificar a navegação, a apresentação dos conteúdos, o funcionamento das interações e a correspondência entre o site implementado e os protótipos.</w:t>
+      </w:r>
+    </w:p>
+    <w:p>
+      <w:r>
+        <w:t>A IA também recomendou que o desenvolvimento fosse realizado por etapas, priorizando a compreensão do código e evitando implementar muitas funcionalidades simultaneamente.</w:t>
+      </w:r>
+    </w:p>
+    <w:p>
+      <w:r>
+        <w:t>Foi ressaltada a importância de utilizar a inteligência artificial como ferramenta de apoio para esclarecer dúvidas, compreender a lógica da programação e identificar possíveis erros, mantendo a autonomia durante o desenvolvimento.</w:t>
+      </w:r>
+    </w:p>
+    <w:p>
+      <w:r>
+        <w:rPr>
+          <w:b/>
+          <w:bCs/>
+        </w:rPr>
+        <w:t>Decisão tomada</w:t>
+      </w:r>
+    </w:p>
+    <w:p>
+      <w:r>
+        <w:t>Decidi concluir a prototipação visual do Alma da Fiel no Figma e iniciar a implementação do site utilizando HTML, CSS e JavaScript.</w:t>
+      </w:r>
+    </w:p>
+    <w:p>
+      <w:r>
+        <w:t>A partir desta etapa, os protótipos desenvolvidos passarão a servir como referência para a construção das páginas funcionais. O desenvolvimento será realizado gradualmente, começando pela organização dos arquivos e pela estrutura HTML, avançando para a estilização com CSS e, posteriormente, para a implementação das interações com JavaScript.</w:t>
+      </w:r>
+    </w:p>
+    <w:p>
+      <w:r>
+        <w:t>A arquitetura planejada continuará utilizando arquivos HTML separados para cada página, com compartilhamento de estilos e scripts quando apropriado.</w:t>
+      </w:r>
+    </w:p>
+    <w:p>
+      <w:r>
+        <w:t>Também decidi manter o cabeçalho, o footer e os demais elementos visuais consistentes entre as páginas, preservando a identidade cinematográfica estabelecida durante a prototipação.</w:t>
+      </w:r>
+    </w:p>
+    <w:p>
+      <w:r>
+        <w:t>A implementação do quiz, das validações dos formulários e dos recursos relacionados aos usuários será realizada progressivamente. A integração com a API WebDataVis dependerá da análise de sua documentação e da confirmação dos recursos disponíveis.</w:t>
+      </w:r>
+    </w:p>
+    <w:p>
+      <w:r>
+        <w:t>A inteligência artificial continuará sendo utilizada como apoio ao aprendizado, à resolução de dúvidas e à compreensão das tecnologias utilizadas. O objetivo é desenvolver um site funcional e, ao mesmo tempo, compreender as decisões e os códigos implementados durante o processo.</w:t>
+      </w:r>
+    </w:p>
+    <w:p>
+      <w:r>
+        <w:rPr>
+          <w:rFonts w:ascii="MS Gothic" w:eastAsia="MS Gothic" w:hAnsi="MS Gothic" w:cs="MS Gothic" w:hint="eastAsia"/>
+        </w:rPr>
+        <w:t>━━━━━━━━━━━━━━━━━━━━━━━━━━━━</w:t>
+      </w:r>
+    </w:p>
+    <w:p>
+      <w:r>
+        <w:rPr>
+          <w:b/>
+          <w:bCs/>
+        </w:rPr>
+        <w:t>SITUAÇÃO ATUAL DO PROJETO — ATUALIZAÇÃO</w:t>
+      </w:r>
+    </w:p>
+    <w:p>
+      <w:r>
+        <w:t>Até o momento, o Alma da Fiel possui:</w:t>
+      </w:r>
+    </w:p>
+    <w:p>
+      <w:r>
+        <w:t>• Nome e slogan definidos: Alma da Fiel — “Uma história que vive em cada torcedor”.</w:t>
+      </w:r>
+    </w:p>
+    <w:p>
+      <w:r>
+        <w:lastRenderedPageBreak/>
+        <w:t>• Tema, proposta geral e identidade visual estabelecidos, com predominância de preto, branco e cinza, além de detalhes em vermelho.</w:t>
+      </w:r>
+    </w:p>
+    <w:p>
+      <w:r>
+        <w:t>• Seleção inicial de dez acontecimentos históricos do Corinthians, ainda sujeita à validação em fontes confiáveis.</w:t>
+      </w:r>
+    </w:p>
+    <w:p>
+      <w:r>
+        <w:t>• Estrutura das páginas e funcionalidades planejada conforme o escopo do projeto.</w:t>
+      </w:r>
+    </w:p>
+    <w:p>
+      <w:r>
+        <w:t>• Tecnologias previstas: HTML, CSS, JavaScript e API WebDataVis.</w:t>
+      </w:r>
+    </w:p>
+    <w:p>
+      <w:r>
+        <w:t>• README e descrição do repositório planejados.</w:t>
+      </w:r>
+    </w:p>
+    <w:p>
+      <w:r>
+        <w:t>• Primeiras versões do Contexto, Objetivo e Justificativa elaboradas.</w:t>
+      </w:r>
+    </w:p>
+    <w:p>
+      <w:r>
+        <w:t>• Escopo, Premissas e Restrições organizados.</w:t>
+      </w:r>
+    </w:p>
+    <w:p>
+      <w:r>
+        <w:t>• Metodologia de desenvolvimento definida, começando pela prototipação visual no Figma.</w:t>
+      </w:r>
+    </w:p>
+    <w:p>
+      <w:r>
+        <w:t>• Home Page concluída no Figma.</w:t>
+      </w:r>
+    </w:p>
+    <w:p>
+      <w:r>
+        <w:t>• Página História concluída no Figma, com uma proposta visual voltada à trajetória do Corinthians.</w:t>
+      </w:r>
+    </w:p>
+    <w:p>
+      <w:r>
+        <w:t>• Página Ídolos concluída no Figma, com destaque para Sócrates e Cássio.</w:t>
+      </w:r>
+    </w:p>
+    <w:p>
+      <w:r>
+        <w:t>• Página Gaviões da Fiel concluída no Figma, com foco na história, na identidade e na importância cultural da torcida organizada.</w:t>
+      </w:r>
+    </w:p>
+    <w:p>
+      <w:r>
+        <w:t>• Página Quiz concluída no Figma, contemplando a apresentação das perguntas, o progresso e o resultado final.</w:t>
+      </w:r>
+    </w:p>
+    <w:p>
+      <w:r>
+        <w:t>• Telas de Cadastro e Login concluídas no Figma.</w:t>
+      </w:r>
+    </w:p>
+    <w:p>
+      <w:r>
+        <w:t>• Página Sobre prototipada no Figma.</w:t>
+      </w:r>
+    </w:p>
+    <w:p>
+      <w:r>
+        <w:t>• Cabeçalho e footer planejados visualmente para manter a consistência entre as páginas.</w:t>
+      </w:r>
+    </w:p>
+    <w:p>
+      <w:r>
+        <w:t>• Prototipação visual do site concluída no Figma.</w:t>
+      </w:r>
+    </w:p>
+    <w:p>
+      <w:r>
+        <w:t>• Arquitetura de implementação definida preliminarmente como um site multipágina, utilizando arquivos HTML separados e recursos compartilhados quando apropriado.</w:t>
+      </w:r>
+    </w:p>
+    <w:p>
+      <w:r>
+        <w:t>O projeto encontra-se na transição entre a prototipação visual e a implementação. Os protótipos estão concluídos, mas as páginas e funcionalidades ainda precisarão ser desenvolvidas, testadas e integradas.</w:t>
+      </w:r>
+    </w:p>
+    <w:p>
+      <w:r>
+        <w:rPr>
+          <w:rFonts w:ascii="MS Gothic" w:eastAsia="MS Gothic" w:hAnsi="MS Gothic" w:cs="MS Gothic" w:hint="eastAsia"/>
+        </w:rPr>
+        <w:t>━━━━━━━━━━━━━━━━━━━━━━━━━━━━</w:t>
+      </w:r>
+    </w:p>
+    <w:p>
+      <w:r>
+        <w:rPr>
+          <w:b/>
+          <w:bCs/>
+        </w:rPr>
+        <w:lastRenderedPageBreak/>
+        <w:t>PRÓXIMAS ETAPAS — ATUALIZAÇÃO</w:t>
+      </w:r>
+    </w:p>
+    <w:p>
+      <w:pPr>
+        <w:numPr>
+          <w:ilvl w:val="0"/>
+          <w:numId w:val="41"/>
+        </w:numPr>
+      </w:pPr>
+      <w:r>
+        <w:t>Organizar a estrutura de pastas e arquivos do projeto, separando HTML, CSS, JavaScript e recursos visuais.</w:t>
+      </w:r>
+    </w:p>
+    <w:p>
+      <w:pPr>
+        <w:numPr>
+          <w:ilvl w:val="0"/>
+          <w:numId w:val="41"/>
+        </w:numPr>
+      </w:pPr>
+      <w:r>
+        <w:t>Iniciar a implementação das páginas em HTML, utilizando os protótipos do Figma como referência.</w:t>
+      </w:r>
+    </w:p>
+    <w:p>
+      <w:pPr>
+        <w:numPr>
+          <w:ilvl w:val="0"/>
+          <w:numId w:val="41"/>
+        </w:numPr>
+      </w:pPr>
+      <w:r>
+        <w:t>Desenvolver os estilos CSS, reproduzindo a identidade visual do Alma da Fiel e mantendo a consistência entre as páginas.</w:t>
+      </w:r>
+    </w:p>
+    <w:p>
+      <w:pPr>
+        <w:numPr>
+          <w:ilvl w:val="0"/>
+          <w:numId w:val="41"/>
+        </w:numPr>
+      </w:pPr>
+      <w:r>
+        <w:t>Implementar o cabeçalho e o footer de forma consistente nas diferentes páginas do site.</w:t>
+      </w:r>
+    </w:p>
+    <w:p>
+      <w:pPr>
+        <w:numPr>
+          <w:ilvl w:val="0"/>
+          <w:numId w:val="41"/>
+        </w:numPr>
+      </w:pPr>
+      <w:r>
+        <w:t>Desenvolver gradualmente as páginas Início, Sobre, História, Ídolos e Gaviões da Fiel.</w:t>
+      </w:r>
+    </w:p>
+    <w:p>
+      <w:pPr>
+        <w:numPr>
+          <w:ilvl w:val="0"/>
+          <w:numId w:val="41"/>
+        </w:numPr>
+      </w:pPr>
+      <w:r>
+        <w:t>Implementar a lógica do quiz com JavaScript, incluindo perguntas, alternativas, navegação entre questões, contagem de acertos e resultado final.</w:t>
+      </w:r>
+    </w:p>
+    <w:p>
+      <w:pPr>
+        <w:numPr>
+          <w:ilvl w:val="0"/>
+          <w:numId w:val="41"/>
+        </w:numPr>
+      </w:pPr>
+      <w:r>
+        <w:t>Desenvolver as validações dos formulários de Cadastro e Login e verificar os requisitos necessários para a autenticação.</w:t>
+      </w:r>
+    </w:p>
+    <w:p>
+      <w:pPr>
+        <w:numPr>
+          <w:ilvl w:val="0"/>
+          <w:numId w:val="41"/>
+        </w:numPr>
+      </w:pPr>
+      <w:r>
+        <w:t>Consultar a documentação da API WebDataVis para avaliar a viabilidade do cadastro de usuários, do login e do armazenamento dos resultados.</w:t>
+      </w:r>
+    </w:p>
+    <w:p>
+      <w:pPr>
+        <w:numPr>
+          <w:ilvl w:val="0"/>
+          <w:numId w:val="41"/>
+        </w:numPr>
+      </w:pPr>
+      <w:r>
+        <w:t>Implementar os recursos adicionais previstos no escopo conforme sua viabilidade técnica.</w:t>
+      </w:r>
+    </w:p>
+    <w:p>
+      <w:pPr>
+        <w:numPr>
+          <w:ilvl w:val="0"/>
+          <w:numId w:val="41"/>
+        </w:numPr>
+      </w:pPr>
+      <w:r>
+        <w:t>Realizar testes para verificar a navegação, o funcionamento das interações, a apresentação dos conteúdos e a correspondência com os protótipos.</w:t>
+      </w:r>
+    </w:p>
+    <w:p>
+      <w:pPr>
+        <w:numPr>
+          <w:ilvl w:val="0"/>
+          <w:numId w:val="41"/>
+        </w:numPr>
+      </w:pPr>
+      <w:r>
+        <w:t>Revisar as informações históricas e utilizar fontes confiáveis para validar o conteúdo publicado.</w:t>
+      </w:r>
+    </w:p>
+    <w:p>
+      <w:pPr>
+        <w:numPr>
+          <w:ilvl w:val="0"/>
+          <w:numId w:val="41"/>
+        </w:numPr>
+      </w:pPr>
+      <w:r>
+        <w:t>Manter o GitHub atualizado, acompanhar o cronograma semanal até o prazo de 30/11/2026 e considerar as orientações dos professores.</w:t>
+      </w:r>
+    </w:p>
+    <w:p>
+      <w:r>
+        <w:rPr>
+          <w:rFonts w:ascii="MS Gothic" w:eastAsia="MS Gothic" w:hAnsi="MS Gothic" w:cs="MS Gothic" w:hint="eastAsia"/>
+        </w:rPr>
+        <w:t>━━━━━━━━━━━━━━━━━━━━━━━━━━━━</w:t>
+      </w:r>
+    </w:p>
+    <w:p>
+      <w:r>
+        <w:rPr>
+          <w:b/>
+          <w:bCs/>
+        </w:rPr>
+        <w:t>CONSIDERAÇÕES FINAIS — ATUALIZAÇÃO</w:t>
+      </w:r>
+    </w:p>
+    <w:p>
+      <w:r>
+        <w:t>O desenvolvimento do Alma da Fiel concluiu a etapa de prototipação visual no Figma e avançou para o início da implementação.</w:t>
+      </w:r>
+    </w:p>
+    <w:p>
+      <w:r>
+        <w:t>A finalização do footer representa o encerramento do planejamento visual previsto para o site, permitindo que as páginas sejam utilizadas como referência durante a programação.</w:t>
+      </w:r>
+    </w:p>
+    <w:p>
+      <w:r>
+        <w:lastRenderedPageBreak/>
+        <w:t>A partir deste momento, o foco do projeto passa a ser a transformação dos protótipos em páginas funcionais, utilizando HTML para estruturar o conteúdo, CSS para desenvolver a identidade visual e JavaScript para implementar as interações.</w:t>
+      </w:r>
+    </w:p>
+    <w:p>
+      <w:r>
+        <w:t>A arquitetura multipágina permitirá organizar o projeto de maneira modular, separando as responsabilidades de cada página e compartilhando recursos quando apropriado. O cabeçalho, o footer e os estilos deverão manter uma identidade visual consistente em toda a plataforma.</w:t>
+      </w:r>
+    </w:p>
+    <w:p>
+      <w:r>
+        <w:t>O quiz será uma das principais funcionalidades interativas do Alma da Fiel, permitindo que os visitantes respondam às perguntas, acompanhem o progresso e visualizem o resultado final. Já os recursos de Cadastro, Login e armazenamento de resultados dependerão da implementação e da avaliação dos recursos disponíveis na API WebDataVis.</w:t>
+      </w:r>
+    </w:p>
+    <w:p>
+      <w:r>
+        <w:t>A implementação será realizada gradualmente, priorizando a compreensão dos conceitos, a organização do código e a realização de testes. A utilização da inteligência artificial continuará voltada ao apoio no aprendizado, na resolução de dúvidas e na compreensão das soluções desenvolvidas.</w:t>
+      </w:r>
+    </w:p>
+    <w:p>
+      <w:r>
+        <w:t>Com a conclusão da prototipação, o Alma da Fiel inicia uma nova etapa: transformar a proposta visual construída no Figma em um site funcional que valorize a história, os ídolos e a identidade do Sport Club Corinthians Paulista.</w:t>
+      </w:r>
+    </w:p>
+    <w:p>
+      <w:r>
+        <w:t>O objetivo é desenvolver o projeto com autonomia, consolidar os conhecimentos adquiridos no curso de Análise e Desenvolvimento de Sistemas e concluir os entregáveis acadêmicos dentro do prazo estabelecido.</w:t>
+      </w:r>
+    </w:p>
+    <w:p>
+      <w:r>
+        <w:rPr>
+          <w:rFonts w:ascii="MS Gothic" w:eastAsia="MS Gothic" w:hAnsi="MS Gothic" w:cs="MS Gothic" w:hint="eastAsia"/>
+        </w:rPr>
+        <w:t>━━━━━━━━━━━━━━━━━━━━━━━━━━━━</w:t>
+      </w:r>
+    </w:p>
+    <w:p/>
     <w:p/>
     <w:sectPr>
       <w:pgSz w:w="11906" w:h="16838"/>
@@ -5272,6 +5877,119 @@
     </w:lvl>
   </w:abstractNum>
   <w:abstractNum w:abstractNumId="6" w15:restartNumberingAfterBreak="0">
+    <w:nsid w:val="1E142A0B"/>
+    <w:multiLevelType w:val="multilevel"/>
+    <w:tmpl w:val="56A8EB6E"/>
+    <w:lvl w:ilvl="0">
+      <w:start w:val="1"/>
+      <w:numFmt w:val="decimal"/>
+      <w:lvlText w:val="%1."/>
+      <w:lvlJc w:val="left"/>
+      <w:pPr>
+        <w:tabs>
+          <w:tab w:val="num" w:pos="720"/>
+        </w:tabs>
+        <w:ind w:left="720" w:hanging="360"/>
+      </w:pPr>
+    </w:lvl>
+    <w:lvl w:ilvl="1" w:tentative="1">
+      <w:start w:val="1"/>
+      <w:numFmt w:val="decimal"/>
+      <w:lvlText w:val="%2."/>
+      <w:lvlJc w:val="left"/>
+      <w:pPr>
+        <w:tabs>
+          <w:tab w:val="num" w:pos="1440"/>
+        </w:tabs>
+        <w:ind w:left="1440" w:hanging="360"/>
+      </w:pPr>
+    </w:lvl>
+    <w:lvl w:ilvl="2" w:tentative="1">
+      <w:start w:val="1"/>
+      <w:numFmt w:val="decimal"/>
+      <w:lvlText w:val="%3."/>
+      <w:lvlJc w:val="left"/>
+      <w:pPr>
+        <w:tabs>
+          <w:tab w:val="num" w:pos="2160"/>
+        </w:tabs>
+        <w:ind w:left="2160" w:hanging="360"/>
+      </w:pPr>
+    </w:lvl>
+    <w:lvl w:ilvl="3" w:tentative="1">
+      <w:start w:val="1"/>
+      <w:numFmt w:val="decimal"/>
+      <w:lvlText w:val="%4."/>
+      <w:lvlJc w:val="left"/>
+      <w:pPr>
+        <w:tabs>
+          <w:tab w:val="num" w:pos="2880"/>
+        </w:tabs>
+        <w:ind w:left="2880" w:hanging="360"/>
+      </w:pPr>
+    </w:lvl>
+    <w:lvl w:ilvl="4" w:tentative="1">
+      <w:start w:val="1"/>
+      <w:numFmt w:val="decimal"/>
+      <w:lvlText w:val="%5."/>
+      <w:lvlJc w:val="left"/>
+      <w:pPr>
+        <w:tabs>
+          <w:tab w:val="num" w:pos="3600"/>
+        </w:tabs>
+        <w:ind w:left="3600" w:hanging="360"/>
+      </w:pPr>
+    </w:lvl>
+    <w:lvl w:ilvl="5" w:tentative="1">
+      <w:start w:val="1"/>
+      <w:numFmt w:val="decimal"/>
+      <w:lvlText w:val="%6."/>
+      <w:lvlJc w:val="left"/>
+      <w:pPr>
+        <w:tabs>
+          <w:tab w:val="num" w:pos="4320"/>
+        </w:tabs>
+        <w:ind w:left="4320" w:hanging="360"/>
+      </w:pPr>
+    </w:lvl>
+    <w:lvl w:ilvl="6" w:tentative="1">
+      <w:start w:val="1"/>
+      <w:numFmt w:val="decimal"/>
+      <w:lvlText w:val="%7."/>
+      <w:lvlJc w:val="left"/>
+      <w:pPr>
+        <w:tabs>
+          <w:tab w:val="num" w:pos="5040"/>
+        </w:tabs>
+        <w:ind w:left="5040" w:hanging="360"/>
+      </w:pPr>
+    </w:lvl>
+    <w:lvl w:ilvl="7" w:tentative="1">
+      <w:start w:val="1"/>
+      <w:numFmt w:val="decimal"/>
+      <w:lvlText w:val="%8."/>
+      <w:lvlJc w:val="left"/>
+      <w:pPr>
+        <w:tabs>
+          <w:tab w:val="num" w:pos="5760"/>
+        </w:tabs>
+        <w:ind w:left="5760" w:hanging="360"/>
+      </w:pPr>
+    </w:lvl>
+    <w:lvl w:ilvl="8" w:tentative="1">
+      <w:start w:val="1"/>
+      <w:numFmt w:val="decimal"/>
+      <w:lvlText w:val="%9."/>
+      <w:lvlJc w:val="left"/>
+      <w:pPr>
+        <w:tabs>
+          <w:tab w:val="num" w:pos="6480"/>
+        </w:tabs>
+        <w:ind w:left="6480" w:hanging="360"/>
+      </w:pPr>
+    </w:lvl>
+  </w:abstractNum>
+  <w:abstractNum w:abstractNumId="7" w15:restartNumberingAfterBreak="0">
     <w:nsid w:val="1EF42D30"/>
     <w:multiLevelType w:val="multilevel"/>
     <w:tmpl w:val="7010A206"/>
@@ -5384,7 +6102,7 @@
       </w:pPr>
     </w:lvl>
   </w:abstractNum>
-  <w:abstractNum w:abstractNumId="7" w15:restartNumberingAfterBreak="0">
+  <w:abstractNum w:abstractNumId="8" w15:restartNumberingAfterBreak="0">
     <w:nsid w:val="1F820149"/>
     <w:multiLevelType w:val="multilevel"/>
     <w:tmpl w:val="0986BBEC"/>
@@ -5497,7 +6215,7 @@
       </w:pPr>
     </w:lvl>
   </w:abstractNum>
-  <w:abstractNum w:abstractNumId="8" w15:restartNumberingAfterBreak="0">
+  <w:abstractNum w:abstractNumId="9" w15:restartNumberingAfterBreak="0">
     <w:nsid w:val="21D8248F"/>
     <w:multiLevelType w:val="multilevel"/>
     <w:tmpl w:val="5B4CE4C6"/>
@@ -5610,7 +6328,7 @@
       </w:pPr>
     </w:lvl>
   </w:abstractNum>
-  <w:abstractNum w:abstractNumId="9" w15:restartNumberingAfterBreak="0">
+  <w:abstractNum w:abstractNumId="10" w15:restartNumberingAfterBreak="0">
     <w:nsid w:val="2272167E"/>
     <w:multiLevelType w:val="multilevel"/>
     <w:tmpl w:val="3ED017CC"/>
@@ -5759,7 +6477,7 @@
       </w:rPr>
     </w:lvl>
   </w:abstractNum>
-  <w:abstractNum w:abstractNumId="10" w15:restartNumberingAfterBreak="0">
+  <w:abstractNum w:abstractNumId="11" w15:restartNumberingAfterBreak="0">
     <w:nsid w:val="250D2103"/>
     <w:multiLevelType w:val="multilevel"/>
     <w:tmpl w:val="5114FDBE"/>
@@ -5908,7 +6626,7 @@
       </w:rPr>
     </w:lvl>
   </w:abstractNum>
-  <w:abstractNum w:abstractNumId="11" w15:restartNumberingAfterBreak="0">
+  <w:abstractNum w:abstractNumId="12" w15:restartNumberingAfterBreak="0">
     <w:nsid w:val="2648452E"/>
     <w:multiLevelType w:val="multilevel"/>
     <w:tmpl w:val="516870FA"/>
@@ -6057,7 +6775,7 @@
       </w:rPr>
     </w:lvl>
   </w:abstractNum>
-  <w:abstractNum w:abstractNumId="12" w15:restartNumberingAfterBreak="0">
+  <w:abstractNum w:abstractNumId="13" w15:restartNumberingAfterBreak="0">
     <w:nsid w:val="2C422CEA"/>
     <w:multiLevelType w:val="multilevel"/>
     <w:tmpl w:val="6EA41ECE"/>
@@ -6170,7 +6888,7 @@
       </w:pPr>
     </w:lvl>
   </w:abstractNum>
-  <w:abstractNum w:abstractNumId="13" w15:restartNumberingAfterBreak="0">
+  <w:abstractNum w:abstractNumId="14" w15:restartNumberingAfterBreak="0">
     <w:nsid w:val="2C864B48"/>
     <w:multiLevelType w:val="multilevel"/>
     <w:tmpl w:val="A6FCB448"/>
@@ -6283,7 +7001,7 @@
       </w:pPr>
     </w:lvl>
   </w:abstractNum>
-  <w:abstractNum w:abstractNumId="14" w15:restartNumberingAfterBreak="0">
+  <w:abstractNum w:abstractNumId="15" w15:restartNumberingAfterBreak="0">
     <w:nsid w:val="2D4032D0"/>
     <w:multiLevelType w:val="multilevel"/>
     <w:tmpl w:val="3B1895EE"/>
@@ -6432,7 +7150,7 @@
       </w:rPr>
     </w:lvl>
   </w:abstractNum>
-  <w:abstractNum w:abstractNumId="15" w15:restartNumberingAfterBreak="0">
+  <w:abstractNum w:abstractNumId="16" w15:restartNumberingAfterBreak="0">
     <w:nsid w:val="312C209B"/>
     <w:multiLevelType w:val="multilevel"/>
     <w:tmpl w:val="1D38539C"/>
@@ -6581,7 +7299,7 @@
       </w:rPr>
     </w:lvl>
   </w:abstractNum>
-  <w:abstractNum w:abstractNumId="16" w15:restartNumberingAfterBreak="0">
+  <w:abstractNum w:abstractNumId="17" w15:restartNumberingAfterBreak="0">
     <w:nsid w:val="362C0042"/>
     <w:multiLevelType w:val="multilevel"/>
     <w:tmpl w:val="FE3A876E"/>
@@ -6730,7 +7448,7 @@
       </w:rPr>
     </w:lvl>
   </w:abstractNum>
-  <w:abstractNum w:abstractNumId="17" w15:restartNumberingAfterBreak="0">
+  <w:abstractNum w:abstractNumId="18" w15:restartNumberingAfterBreak="0">
     <w:nsid w:val="39193AA5"/>
     <w:multiLevelType w:val="multilevel"/>
     <w:tmpl w:val="3A58A34A"/>
@@ -6843,7 +7561,7 @@
       </w:pPr>
     </w:lvl>
   </w:abstractNum>
-  <w:abstractNum w:abstractNumId="18" w15:restartNumberingAfterBreak="0">
+  <w:abstractNum w:abstractNumId="19" w15:restartNumberingAfterBreak="0">
     <w:nsid w:val="397C1635"/>
     <w:multiLevelType w:val="multilevel"/>
     <w:tmpl w:val="6CF80884"/>
@@ -6956,7 +7674,7 @@
       </w:pPr>
     </w:lvl>
   </w:abstractNum>
-  <w:abstractNum w:abstractNumId="19" w15:restartNumberingAfterBreak="0">
+  <w:abstractNum w:abstractNumId="20" w15:restartNumberingAfterBreak="0">
     <w:nsid w:val="399E1168"/>
     <w:multiLevelType w:val="multilevel"/>
     <w:tmpl w:val="F24E1EF6"/>
@@ -7105,7 +7823,7 @@
       </w:rPr>
     </w:lvl>
   </w:abstractNum>
-  <w:abstractNum w:abstractNumId="20" w15:restartNumberingAfterBreak="0">
+  <w:abstractNum w:abstractNumId="21" w15:restartNumberingAfterBreak="0">
     <w:nsid w:val="39CE44AF"/>
     <w:multiLevelType w:val="multilevel"/>
     <w:tmpl w:val="799E18A6"/>
@@ -7254,7 +7972,7 @@
       </w:rPr>
     </w:lvl>
   </w:abstractNum>
-  <w:abstractNum w:abstractNumId="21" w15:restartNumberingAfterBreak="0">
+  <w:abstractNum w:abstractNumId="22" w15:restartNumberingAfterBreak="0">
     <w:nsid w:val="39DE2D77"/>
     <w:multiLevelType w:val="multilevel"/>
     <w:tmpl w:val="D28AB396"/>
@@ -7367,7 +8085,7 @@
       </w:pPr>
     </w:lvl>
   </w:abstractNum>
-  <w:abstractNum w:abstractNumId="22" w15:restartNumberingAfterBreak="0">
+  <w:abstractNum w:abstractNumId="23" w15:restartNumberingAfterBreak="0">
     <w:nsid w:val="3C6B199B"/>
     <w:multiLevelType w:val="multilevel"/>
     <w:tmpl w:val="E9669198"/>
@@ -7480,7 +8198,120 @@
       </w:pPr>
     </w:lvl>
   </w:abstractNum>
-  <w:abstractNum w:abstractNumId="23" w15:restartNumberingAfterBreak="0">
+  <w:abstractNum w:abstractNumId="24" w15:restartNumberingAfterBreak="0">
+    <w:nsid w:val="3C88769C"/>
+    <w:multiLevelType w:val="multilevel"/>
+    <w:tmpl w:val="1C0AEB56"/>
+    <w:lvl w:ilvl="0">
+      <w:start w:val="1"/>
+      <w:numFmt w:val="decimal"/>
+      <w:lvlText w:val="%1."/>
+      <w:lvlJc w:val="left"/>
+      <w:pPr>
+        <w:tabs>
+          <w:tab w:val="num" w:pos="720"/>
+        </w:tabs>
+        <w:ind w:left="720" w:hanging="360"/>
+      </w:pPr>
+    </w:lvl>
+    <w:lvl w:ilvl="1" w:tentative="1">
+      <w:start w:val="1"/>
+      <w:numFmt w:val="decimal"/>
+      <w:lvlText w:val="%2."/>
+      <w:lvlJc w:val="left"/>
+      <w:pPr>
+        <w:tabs>
+          <w:tab w:val="num" w:pos="1440"/>
+        </w:tabs>
+        <w:ind w:left="1440" w:hanging="360"/>
+      </w:pPr>
+    </w:lvl>
+    <w:lvl w:ilvl="2" w:tentative="1">
+      <w:start w:val="1"/>
+      <w:numFmt w:val="decimal"/>
+      <w:lvlText w:val="%3."/>
+      <w:lvlJc w:val="left"/>
+      <w:pPr>
+        <w:tabs>
+          <w:tab w:val="num" w:pos="2160"/>
+        </w:tabs>
+        <w:ind w:left="2160" w:hanging="360"/>
+      </w:pPr>
+    </w:lvl>
+    <w:lvl w:ilvl="3" w:tentative="1">
+      <w:start w:val="1"/>
+      <w:numFmt w:val="decimal"/>
+      <w:lvlText w:val="%4."/>
+      <w:lvlJc w:val="left"/>
+      <w:pPr>
+        <w:tabs>
+          <w:tab w:val="num" w:pos="2880"/>
+        </w:tabs>
+        <w:ind w:left="2880" w:hanging="360"/>
+      </w:pPr>
+    </w:lvl>
+    <w:lvl w:ilvl="4" w:tentative="1">
+      <w:start w:val="1"/>
+      <w:numFmt w:val="decimal"/>
+      <w:lvlText w:val="%5."/>
+      <w:lvlJc w:val="left"/>
+      <w:pPr>
+        <w:tabs>
+          <w:tab w:val="num" w:pos="3600"/>
+        </w:tabs>
+        <w:ind w:left="3600" w:hanging="360"/>
+      </w:pPr>
+    </w:lvl>
+    <w:lvl w:ilvl="5" w:tentative="1">
+      <w:start w:val="1"/>
+      <w:numFmt w:val="decimal"/>
+      <w:lvlText w:val="%6."/>
+      <w:lvlJc w:val="left"/>
+      <w:pPr>
+        <w:tabs>
+          <w:tab w:val="num" w:pos="4320"/>
+        </w:tabs>
+        <w:ind w:left="4320" w:hanging="360"/>
+      </w:pPr>
+    </w:lvl>
+    <w:lvl w:ilvl="6" w:tentative="1">
+      <w:start w:val="1"/>
+      <w:numFmt w:val="decimal"/>
+      <w:lvlText w:val="%7."/>
+      <w:lvlJc w:val="left"/>
+      <w:pPr>
+        <w:tabs>
+          <w:tab w:val="num" w:pos="5040"/>
+        </w:tabs>
+        <w:ind w:left="5040" w:hanging="360"/>
+      </w:pPr>
+    </w:lvl>
+    <w:lvl w:ilvl="7" w:tentative="1">
+      <w:start w:val="1"/>
+      <w:numFmt w:val="decimal"/>
+      <w:lvlText w:val="%8."/>
+      <w:lvlJc w:val="left"/>
+      <w:pPr>
+        <w:tabs>
+          <w:tab w:val="num" w:pos="5760"/>
+        </w:tabs>
+        <w:ind w:left="5760" w:hanging="360"/>
+      </w:pPr>
+    </w:lvl>
+    <w:lvl w:ilvl="8" w:tentative="1">
+      <w:start w:val="1"/>
+      <w:numFmt w:val="decimal"/>
+      <w:lvlText w:val="%9."/>
+      <w:lvlJc w:val="left"/>
+      <w:pPr>
+        <w:tabs>
+          <w:tab w:val="num" w:pos="6480"/>
+        </w:tabs>
+        <w:ind w:left="6480" w:hanging="360"/>
+      </w:pPr>
+    </w:lvl>
+  </w:abstractNum>
+  <w:abstractNum w:abstractNumId="25" w15:restartNumberingAfterBreak="0">
     <w:nsid w:val="45B45FAF"/>
     <w:multiLevelType w:val="multilevel"/>
     <w:tmpl w:val="F70639B6"/>
@@ -7593,7 +8424,7 @@
       </w:pPr>
     </w:lvl>
   </w:abstractNum>
-  <w:abstractNum w:abstractNumId="24" w15:restartNumberingAfterBreak="0">
+  <w:abstractNum w:abstractNumId="26" w15:restartNumberingAfterBreak="0">
     <w:nsid w:val="49EA667F"/>
     <w:multiLevelType w:val="multilevel"/>
     <w:tmpl w:val="A8868618"/>
@@ -7706,7 +8537,7 @@
       </w:pPr>
     </w:lvl>
   </w:abstractNum>
-  <w:abstractNum w:abstractNumId="25" w15:restartNumberingAfterBreak="0">
+  <w:abstractNum w:abstractNumId="27" w15:restartNumberingAfterBreak="0">
     <w:nsid w:val="4ABC56D4"/>
     <w:multiLevelType w:val="multilevel"/>
     <w:tmpl w:val="8BE4141C"/>
@@ -7855,7 +8686,7 @@
       </w:rPr>
     </w:lvl>
   </w:abstractNum>
-  <w:abstractNum w:abstractNumId="26" w15:restartNumberingAfterBreak="0">
+  <w:abstractNum w:abstractNumId="28" w15:restartNumberingAfterBreak="0">
     <w:nsid w:val="4AD222F3"/>
     <w:multiLevelType w:val="multilevel"/>
     <w:tmpl w:val="F5766536"/>
@@ -7968,7 +8799,7 @@
       </w:pPr>
     </w:lvl>
   </w:abstractNum>
-  <w:abstractNum w:abstractNumId="27" w15:restartNumberingAfterBreak="0">
+  <w:abstractNum w:abstractNumId="29" w15:restartNumberingAfterBreak="0">
     <w:nsid w:val="4CDD0DFC"/>
     <w:multiLevelType w:val="multilevel"/>
     <w:tmpl w:val="78BEA320"/>
@@ -8081,7 +8912,7 @@
       </w:pPr>
     </w:lvl>
   </w:abstractNum>
-  <w:abstractNum w:abstractNumId="28" w15:restartNumberingAfterBreak="0">
+  <w:abstractNum w:abstractNumId="30" w15:restartNumberingAfterBreak="0">
     <w:nsid w:val="4F4C5743"/>
     <w:multiLevelType w:val="multilevel"/>
     <w:tmpl w:val="B7446200"/>
@@ -8194,7 +9025,7 @@
       </w:pPr>
     </w:lvl>
   </w:abstractNum>
-  <w:abstractNum w:abstractNumId="29" w15:restartNumberingAfterBreak="0">
+  <w:abstractNum w:abstractNumId="31" w15:restartNumberingAfterBreak="0">
     <w:nsid w:val="579A6C80"/>
     <w:multiLevelType w:val="multilevel"/>
     <w:tmpl w:val="6D189CE4"/>
@@ -8307,7 +9138,7 @@
       </w:pPr>
     </w:lvl>
   </w:abstractNum>
-  <w:abstractNum w:abstractNumId="30" w15:restartNumberingAfterBreak="0">
+  <w:abstractNum w:abstractNumId="32" w15:restartNumberingAfterBreak="0">
     <w:nsid w:val="5FA57BE0"/>
     <w:multiLevelType w:val="multilevel"/>
     <w:tmpl w:val="18C8FD24"/>
@@ -8420,7 +9251,7 @@
       </w:pPr>
     </w:lvl>
   </w:abstractNum>
-  <w:abstractNum w:abstractNumId="31" w15:restartNumberingAfterBreak="0">
+  <w:abstractNum w:abstractNumId="33" w15:restartNumberingAfterBreak="0">
     <w:nsid w:val="60850E81"/>
     <w:multiLevelType w:val="multilevel"/>
     <w:tmpl w:val="46303664"/>
@@ -8569,7 +9400,7 @@
       </w:rPr>
     </w:lvl>
   </w:abstractNum>
-  <w:abstractNum w:abstractNumId="32" w15:restartNumberingAfterBreak="0">
+  <w:abstractNum w:abstractNumId="34" w15:restartNumberingAfterBreak="0">
     <w:nsid w:val="614971B3"/>
     <w:multiLevelType w:val="multilevel"/>
     <w:tmpl w:val="4DB44FE6"/>
@@ -8682,7 +9513,7 @@
       </w:pPr>
     </w:lvl>
   </w:abstractNum>
-  <w:abstractNum w:abstractNumId="33" w15:restartNumberingAfterBreak="0">
+  <w:abstractNum w:abstractNumId="35" w15:restartNumberingAfterBreak="0">
     <w:nsid w:val="614E4692"/>
     <w:multiLevelType w:val="multilevel"/>
     <w:tmpl w:val="275AFA5C"/>
@@ -8795,7 +9626,7 @@
       </w:pPr>
     </w:lvl>
   </w:abstractNum>
-  <w:abstractNum w:abstractNumId="34" w15:restartNumberingAfterBreak="0">
+  <w:abstractNum w:abstractNumId="36" w15:restartNumberingAfterBreak="0">
     <w:nsid w:val="64D34919"/>
     <w:multiLevelType w:val="multilevel"/>
     <w:tmpl w:val="09A207A8"/>
@@ -8944,7 +9775,7 @@
       </w:rPr>
     </w:lvl>
   </w:abstractNum>
-  <w:abstractNum w:abstractNumId="35" w15:restartNumberingAfterBreak="0">
+  <w:abstractNum w:abstractNumId="37" w15:restartNumberingAfterBreak="0">
     <w:nsid w:val="66307BB7"/>
     <w:multiLevelType w:val="multilevel"/>
     <w:tmpl w:val="E70A17DA"/>
@@ -9093,7 +9924,7 @@
       </w:rPr>
     </w:lvl>
   </w:abstractNum>
-  <w:abstractNum w:abstractNumId="36" w15:restartNumberingAfterBreak="0">
+  <w:abstractNum w:abstractNumId="38" w15:restartNumberingAfterBreak="0">
     <w:nsid w:val="6918154F"/>
     <w:multiLevelType w:val="multilevel"/>
     <w:tmpl w:val="3D94CDBE"/>
@@ -9242,7 +10073,7 @@
       </w:rPr>
     </w:lvl>
   </w:abstractNum>
-  <w:abstractNum w:abstractNumId="37" w15:restartNumberingAfterBreak="0">
+  <w:abstractNum w:abstractNumId="39" w15:restartNumberingAfterBreak="0">
     <w:nsid w:val="6D400F3B"/>
     <w:multiLevelType w:val="multilevel"/>
     <w:tmpl w:val="0BBEEF22"/>
@@ -9355,7 +10186,7 @@
       </w:pPr>
     </w:lvl>
   </w:abstractNum>
-  <w:abstractNum w:abstractNumId="38" w15:restartNumberingAfterBreak="0">
+  <w:abstractNum w:abstractNumId="40" w15:restartNumberingAfterBreak="0">
     <w:nsid w:val="7E3C0B5D"/>
     <w:multiLevelType w:val="multilevel"/>
     <w:tmpl w:val="26B0B030"/>
@@ -9505,121 +10336,127 @@
     </w:lvl>
   </w:abstractNum>
   <w:num w:numId="1" w16cid:durableId="163476366">
-    <w:abstractNumId w:val="31"/>
+    <w:abstractNumId w:val="33"/>
   </w:num>
   <w:num w:numId="2" w16cid:durableId="888031651">
-    <w:abstractNumId w:val="35"/>
+    <w:abstractNumId w:val="37"/>
   </w:num>
   <w:num w:numId="3" w16cid:durableId="2143301179">
-    <w:abstractNumId w:val="21"/>
+    <w:abstractNumId w:val="22"/>
   </w:num>
   <w:num w:numId="4" w16cid:durableId="1768693047">
-    <w:abstractNumId w:val="25"/>
+    <w:abstractNumId w:val="27"/>
   </w:num>
   <w:num w:numId="5" w16cid:durableId="2079402130">
     <w:abstractNumId w:val="0"/>
   </w:num>
   <w:num w:numId="6" w16cid:durableId="2139686027">
-    <w:abstractNumId w:val="16"/>
+    <w:abstractNumId w:val="17"/>
   </w:num>
   <w:num w:numId="7" w16cid:durableId="337856317">
-    <w:abstractNumId w:val="19"/>
+    <w:abstractNumId w:val="20"/>
   </w:num>
   <w:num w:numId="8" w16cid:durableId="2034529628">
-    <w:abstractNumId w:val="22"/>
+    <w:abstractNumId w:val="23"/>
   </w:num>
   <w:num w:numId="9" w16cid:durableId="741368021">
-    <w:abstractNumId w:val="14"/>
+    <w:abstractNumId w:val="15"/>
   </w:num>
   <w:num w:numId="10" w16cid:durableId="152840754">
-    <w:abstractNumId w:val="10"/>
+    <w:abstractNumId w:val="11"/>
   </w:num>
   <w:num w:numId="11" w16cid:durableId="640040349">
     <w:abstractNumId w:val="4"/>
   </w:num>
   <w:num w:numId="12" w16cid:durableId="328290283">
-    <w:abstractNumId w:val="34"/>
+    <w:abstractNumId w:val="36"/>
   </w:num>
   <w:num w:numId="13" w16cid:durableId="365716282">
-    <w:abstractNumId w:val="12"/>
+    <w:abstractNumId w:val="13"/>
   </w:num>
   <w:num w:numId="14" w16cid:durableId="1749301687">
-    <w:abstractNumId w:val="38"/>
+    <w:abstractNumId w:val="40"/>
   </w:num>
   <w:num w:numId="15" w16cid:durableId="92895161">
-    <w:abstractNumId w:val="30"/>
+    <w:abstractNumId w:val="32"/>
   </w:num>
   <w:num w:numId="16" w16cid:durableId="2141683418">
     <w:abstractNumId w:val="3"/>
   </w:num>
   <w:num w:numId="17" w16cid:durableId="293340683">
-    <w:abstractNumId w:val="18"/>
+    <w:abstractNumId w:val="19"/>
   </w:num>
   <w:num w:numId="18" w16cid:durableId="1519152503">
     <w:abstractNumId w:val="2"/>
   </w:num>
   <w:num w:numId="19" w16cid:durableId="2119985953">
-    <w:abstractNumId w:val="15"/>
+    <w:abstractNumId w:val="16"/>
   </w:num>
   <w:num w:numId="20" w16cid:durableId="1886062730">
     <w:abstractNumId w:val="5"/>
   </w:num>
   <w:num w:numId="21" w16cid:durableId="1955594982">
-    <w:abstractNumId w:val="20"/>
+    <w:abstractNumId w:val="21"/>
   </w:num>
   <w:num w:numId="22" w16cid:durableId="249894331">
-    <w:abstractNumId w:val="28"/>
+    <w:abstractNumId w:val="30"/>
   </w:num>
   <w:num w:numId="23" w16cid:durableId="678196419">
-    <w:abstractNumId w:val="29"/>
+    <w:abstractNumId w:val="31"/>
   </w:num>
   <w:num w:numId="24" w16cid:durableId="429787488">
-    <w:abstractNumId w:val="9"/>
+    <w:abstractNumId w:val="10"/>
   </w:num>
   <w:num w:numId="25" w16cid:durableId="1308825487">
-    <w:abstractNumId w:val="36"/>
+    <w:abstractNumId w:val="38"/>
   </w:num>
   <w:num w:numId="26" w16cid:durableId="299728592">
     <w:abstractNumId w:val="1"/>
   </w:num>
   <w:num w:numId="27" w16cid:durableId="1447042674">
+    <w:abstractNumId w:val="26"/>
+  </w:num>
+  <w:num w:numId="28" w16cid:durableId="1326931229">
+    <w:abstractNumId w:val="12"/>
+  </w:num>
+  <w:num w:numId="29" w16cid:durableId="510529186">
+    <w:abstractNumId w:val="35"/>
+  </w:num>
+  <w:num w:numId="30" w16cid:durableId="1924073036">
+    <w:abstractNumId w:val="14"/>
+  </w:num>
+  <w:num w:numId="31" w16cid:durableId="973489751">
+    <w:abstractNumId w:val="29"/>
+  </w:num>
+  <w:num w:numId="32" w16cid:durableId="850223582">
+    <w:abstractNumId w:val="25"/>
+  </w:num>
+  <w:num w:numId="33" w16cid:durableId="1725257606">
+    <w:abstractNumId w:val="18"/>
+  </w:num>
+  <w:num w:numId="34" w16cid:durableId="643050162">
+    <w:abstractNumId w:val="7"/>
+  </w:num>
+  <w:num w:numId="35" w16cid:durableId="1812867411">
+    <w:abstractNumId w:val="8"/>
+  </w:num>
+  <w:num w:numId="36" w16cid:durableId="148326540">
+    <w:abstractNumId w:val="9"/>
+  </w:num>
+  <w:num w:numId="37" w16cid:durableId="1035623289">
+    <w:abstractNumId w:val="39"/>
+  </w:num>
+  <w:num w:numId="38" w16cid:durableId="1597903377">
+    <w:abstractNumId w:val="34"/>
+  </w:num>
+  <w:num w:numId="39" w16cid:durableId="322851734">
+    <w:abstractNumId w:val="28"/>
+  </w:num>
+  <w:num w:numId="40" w16cid:durableId="82915348">
     <w:abstractNumId w:val="24"/>
   </w:num>
-  <w:num w:numId="28" w16cid:durableId="1326931229">
-    <w:abstractNumId w:val="11"/>
-  </w:num>
-  <w:num w:numId="29" w16cid:durableId="510529186">
-    <w:abstractNumId w:val="33"/>
-  </w:num>
-  <w:num w:numId="30" w16cid:durableId="1924073036">
-    <w:abstractNumId w:val="13"/>
-  </w:num>
-  <w:num w:numId="31" w16cid:durableId="973489751">
-    <w:abstractNumId w:val="27"/>
-  </w:num>
-  <w:num w:numId="32" w16cid:durableId="850223582">
-    <w:abstractNumId w:val="23"/>
-  </w:num>
-  <w:num w:numId="33" w16cid:durableId="1725257606">
-    <w:abstractNumId w:val="17"/>
-  </w:num>
-  <w:num w:numId="34" w16cid:durableId="643050162">
+  <w:num w:numId="41" w16cid:durableId="1013651633">
     <w:abstractNumId w:val="6"/>
-  </w:num>
-  <w:num w:numId="35" w16cid:durableId="1812867411">
-    <w:abstractNumId w:val="7"/>
-  </w:num>
-  <w:num w:numId="36" w16cid:durableId="148326540">
-    <w:abstractNumId w:val="8"/>
-  </w:num>
-  <w:num w:numId="37" w16cid:durableId="1035623289">
-    <w:abstractNumId w:val="37"/>
-  </w:num>
-  <w:num w:numId="38" w16cid:durableId="1597903377">
-    <w:abstractNumId w:val="32"/>
-  </w:num>
-  <w:num w:numId="39" w16cid:durableId="322851734">
-    <w:abstractNumId w:val="26"/>
   </w:num>
 </w:numbering>
 </file>

</xml_diff>